<commit_message>
PRD v3.0: section 9 reduced to a brief note on the wearable data table
Co-Authored-By: Claude Opus 5.5 <noreply@anthropic.com>
Claude-Session: https://claude.ai/code/session_01AzN61zWTi2yq5SJaQMPbTS
</commit_message>
<xml_diff>
--- a/docs/BEST_PRD_v3.0.docx
+++ b/docs/BEST_PRD_v3.0.docx
@@ -5671,887 +5671,7 @@
         <w:rPr>
           <w:rFonts w:ascii="Calibri" w:cs="Calibri" w:eastAsia="Calibri" w:hAnsi="Calibri"/>
         </w:rPr>
-        <w:t xml:space="preserve">Each vendor’s data is converted by an adapter into one common format before the platform stores or interprets it. Data arrives in sync batches; each batch carries the readings for one device and one session window.</w:t>
-      </w:r>
-    </w:p>
-    <w:p>
-      <w:pPr>
-        <w:pStyle w:val="Heading2"/>
-        <w:spacing w:after="80" w:before="240"/>
-      </w:pPr>
-      <w:r>
-        <w:rPr>
-          <w:rFonts w:ascii="Calibri" w:cs="Calibri" w:eastAsia="Calibri" w:hAnsi="Calibri"/>
-        </w:rPr>
-        <w:t xml:space="preserve">9.1 Sync Batch</w:t>
-      </w:r>
-    </w:p>
-    <w:p>
-      <w:pPr>
-        <w:spacing w:after="120"/>
-      </w:pPr>
-      <w:r>
-        <w:rPr>
-          <w:rFonts w:ascii="Calibri" w:cs="Calibri" w:eastAsia="Calibri" w:hAnsi="Calibri"/>
-        </w:rPr>
-        <w:t xml:space="preserve">Each sync batch carries the following fields. All are required.</w:t>
-      </w:r>
-    </w:p>
-    <w:p>
-      <w:pPr>
-        <w:pStyle w:val="ListParagraph"/>
-        <w:numPr>
-          <w:ilvl w:val="0"/>
-          <w:numId w:val="2"/>
-        </w:numPr>
-        <w:spacing w:after="60"/>
-      </w:pPr>
-      <w:r>
-        <w:rPr>
-          <w:rFonts w:ascii="Calibri" w:cs="Calibri" w:eastAsia="Calibri" w:hAnsi="Calibri"/>
-          <w:b/>
-          <w:bCs/>
-        </w:rPr>
-        <w:t xml:space="preserve">batch_id</w:t>
-      </w:r>
-      <w:r>
-        <w:rPr>
-          <w:rFonts w:ascii="Calibri" w:cs="Calibri" w:eastAsia="Calibri" w:hAnsi="Calibri"/>
-        </w:rPr>
-        <w:t xml:space="preserve"> (UUID) – unique ID for the sync batch</w:t>
-      </w:r>
-    </w:p>
-    <w:p>
-      <w:pPr>
-        <w:pStyle w:val="ListParagraph"/>
-        <w:numPr>
-          <w:ilvl w:val="0"/>
-          <w:numId w:val="2"/>
-        </w:numPr>
-        <w:spacing w:after="60"/>
-      </w:pPr>
-      <w:r>
-        <w:rPr>
-          <w:rFonts w:ascii="Calibri" w:cs="Calibri" w:eastAsia="Calibri" w:hAnsi="Calibri"/>
-          <w:b/>
-          <w:bCs/>
-        </w:rPr>
-        <w:t xml:space="preserve">organization_id</w:t>
-      </w:r>
-      <w:r>
-        <w:rPr>
-          <w:rFonts w:ascii="Calibri" w:cs="Calibri" w:eastAsia="Calibri" w:hAnsi="Calibri"/>
-        </w:rPr>
-        <w:t xml:space="preserve"> (UUID) – tenant the session belongs to</w:t>
-      </w:r>
-    </w:p>
-    <w:p>
-      <w:pPr>
-        <w:pStyle w:val="ListParagraph"/>
-        <w:numPr>
-          <w:ilvl w:val="0"/>
-          <w:numId w:val="2"/>
-        </w:numPr>
-        <w:spacing w:after="60"/>
-      </w:pPr>
-      <w:r>
-        <w:rPr>
-          <w:rFonts w:ascii="Calibri" w:cs="Calibri" w:eastAsia="Calibri" w:hAnsi="Calibri"/>
-          <w:b/>
-          <w:bCs/>
-        </w:rPr>
-        <w:t xml:space="preserve">session_id</w:t>
-      </w:r>
-      <w:r>
-        <w:rPr>
-          <w:rFonts w:ascii="Calibri" w:cs="Calibri" w:eastAsia="Calibri" w:hAnsi="Calibri"/>
-        </w:rPr>
-        <w:t xml:space="preserve"> (UUID) – session the readings belong to</w:t>
-      </w:r>
-    </w:p>
-    <w:p>
-      <w:pPr>
-        <w:pStyle w:val="ListParagraph"/>
-        <w:numPr>
-          <w:ilvl w:val="0"/>
-          <w:numId w:val="2"/>
-        </w:numPr>
-        <w:spacing w:after="60"/>
-      </w:pPr>
-      <w:r>
-        <w:rPr>
-          <w:rFonts w:ascii="Calibri" w:cs="Calibri" w:eastAsia="Calibri" w:hAnsi="Calibri"/>
-          <w:b/>
-          <w:bCs/>
-        </w:rPr>
-        <w:t xml:space="preserve">client_ref</w:t>
-      </w:r>
-      <w:r>
-        <w:rPr>
-          <w:rFonts w:ascii="Calibri" w:cs="Calibri" w:eastAsia="Calibri" w:hAnsi="Calibri"/>
-        </w:rPr>
-        <w:t xml:space="preserve"> (UUID) – surrogate client ID; never a name or direct identifier</w:t>
-      </w:r>
-    </w:p>
-    <w:p>
-      <w:pPr>
-        <w:pStyle w:val="ListParagraph"/>
-        <w:numPr>
-          <w:ilvl w:val="0"/>
-          <w:numId w:val="2"/>
-        </w:numPr>
-        <w:spacing w:after="60"/>
-      </w:pPr>
-      <w:r>
-        <w:rPr>
-          <w:rFonts w:ascii="Calibri" w:cs="Calibri" w:eastAsia="Calibri" w:hAnsi="Calibri"/>
-          <w:b/>
-          <w:bCs/>
-        </w:rPr>
-        <w:t xml:space="preserve">device_id</w:t>
-      </w:r>
-      <w:r>
-        <w:rPr>
-          <w:rFonts w:ascii="Calibri" w:cs="Calibri" w:eastAsia="Calibri" w:hAnsi="Calibri"/>
-        </w:rPr>
-        <w:t xml:space="preserve"> (string) – vendor’s device identifier</w:t>
-      </w:r>
-    </w:p>
-    <w:p>
-      <w:pPr>
-        <w:pStyle w:val="ListParagraph"/>
-        <w:numPr>
-          <w:ilvl w:val="0"/>
-          <w:numId w:val="2"/>
-        </w:numPr>
-        <w:spacing w:after="60"/>
-      </w:pPr>
-      <w:r>
-        <w:rPr>
-          <w:rFonts w:ascii="Calibri" w:cs="Calibri" w:eastAsia="Calibri" w:hAnsi="Calibri"/>
-          <w:b/>
-          <w:bCs/>
-        </w:rPr>
-        <w:t xml:space="preserve">vendor</w:t>
-      </w:r>
-      <w:r>
-        <w:rPr>
-          <w:rFonts w:ascii="Calibri" w:cs="Calibri" w:eastAsia="Calibri" w:hAnsi="Calibri"/>
-        </w:rPr>
-        <w:t xml:space="preserve"> (string) – vendor name</w:t>
-      </w:r>
-    </w:p>
-    <w:p>
-      <w:pPr>
-        <w:pStyle w:val="ListParagraph"/>
-        <w:numPr>
-          <w:ilvl w:val="0"/>
-          <w:numId w:val="2"/>
-        </w:numPr>
-        <w:spacing w:after="60"/>
-      </w:pPr>
-      <w:r>
-        <w:rPr>
-          <w:rFonts w:ascii="Calibri" w:cs="Calibri" w:eastAsia="Calibri" w:hAnsi="Calibri"/>
-          <w:b/>
-          <w:bCs/>
-        </w:rPr>
-        <w:t xml:space="preserve">window_start</w:t>
-      </w:r>
-      <w:r>
-        <w:rPr>
-          <w:rFonts w:ascii="Calibri" w:cs="Calibri" w:eastAsia="Calibri" w:hAnsi="Calibri"/>
-        </w:rPr>
-        <w:t xml:space="preserve"> (timestamp) – start of the period covered (ISO 8601, UTC)</w:t>
-      </w:r>
-    </w:p>
-    <w:p>
-      <w:pPr>
-        <w:pStyle w:val="ListParagraph"/>
-        <w:numPr>
-          <w:ilvl w:val="0"/>
-          <w:numId w:val="2"/>
-        </w:numPr>
-        <w:spacing w:after="60"/>
-      </w:pPr>
-      <w:r>
-        <w:rPr>
-          <w:rFonts w:ascii="Calibri" w:cs="Calibri" w:eastAsia="Calibri" w:hAnsi="Calibri"/>
-          <w:b/>
-          <w:bCs/>
-        </w:rPr>
-        <w:t xml:space="preserve">window_end</w:t>
-      </w:r>
-      <w:r>
-        <w:rPr>
-          <w:rFonts w:ascii="Calibri" w:cs="Calibri" w:eastAsia="Calibri" w:hAnsi="Calibri"/>
-        </w:rPr>
-        <w:t xml:space="preserve"> (timestamp) – end of the period covered (ISO 8601, UTC)</w:t>
-      </w:r>
-    </w:p>
-    <w:p>
-      <w:pPr>
-        <w:pStyle w:val="ListParagraph"/>
-        <w:numPr>
-          <w:ilvl w:val="0"/>
-          <w:numId w:val="2"/>
-        </w:numPr>
-        <w:spacing w:after="60"/>
-      </w:pPr>
-      <w:r>
-        <w:rPr>
-          <w:rFonts w:ascii="Calibri" w:cs="Calibri" w:eastAsia="Calibri" w:hAnsi="Calibri"/>
-          <w:b/>
-          <w:bCs/>
-        </w:rPr>
-        <w:t xml:space="preserve">received_at</w:t>
-      </w:r>
-      <w:r>
-        <w:rPr>
-          <w:rFonts w:ascii="Calibri" w:cs="Calibri" w:eastAsia="Calibri" w:hAnsi="Calibri"/>
-        </w:rPr>
-        <w:t xml:space="preserve"> (timestamp) – when the platform received the batch (ISO 8601, UTC)</w:t>
-      </w:r>
-    </w:p>
-    <w:p>
-      <w:pPr>
-        <w:pStyle w:val="ListParagraph"/>
-        <w:numPr>
-          <w:ilvl w:val="0"/>
-          <w:numId w:val="2"/>
-        </w:numPr>
-        <w:spacing w:after="60"/>
-      </w:pPr>
-      <w:r>
-        <w:rPr>
-          <w:rFonts w:ascii="Calibri" w:cs="Calibri" w:eastAsia="Calibri" w:hAnsi="Calibri"/>
-          <w:b/>
-          <w:bCs/>
-        </w:rPr>
-        <w:t xml:space="preserve">readings</w:t>
-      </w:r>
-      <w:r>
-        <w:rPr>
-          <w:rFonts w:ascii="Calibri" w:cs="Calibri" w:eastAsia="Calibri" w:hAnsi="Calibri"/>
-        </w:rPr>
-        <w:t xml:space="preserve"> (array) – list of readings (Section 9.2)</w:t>
-      </w:r>
-    </w:p>
-    <w:p>
-      <w:pPr>
-        <w:pStyle w:val="ListParagraph"/>
-        <w:numPr>
-          <w:ilvl w:val="0"/>
-          <w:numId w:val="2"/>
-        </w:numPr>
-        <w:spacing w:after="60"/>
-      </w:pPr>
-      <w:r>
-        <w:rPr>
-          <w:rFonts w:ascii="Calibri" w:cs="Calibri" w:eastAsia="Calibri" w:hAnsi="Calibri"/>
-          <w:b/>
-          <w:bCs/>
-        </w:rPr>
-        <w:t xml:space="preserve">raw_payload_ref</w:t>
-      </w:r>
-      <w:r>
-        <w:rPr>
-          <w:rFonts w:ascii="Calibri" w:cs="Calibri" w:eastAsia="Calibri" w:hAnsi="Calibri"/>
-        </w:rPr>
-        <w:t xml:space="preserve"> (string) – pointer to the vendor’s original payload, stored separately</w:t>
-      </w:r>
-    </w:p>
-    <w:p>
-      <w:pPr>
-        <w:pStyle w:val="Heading2"/>
-        <w:spacing w:after="80" w:before="240"/>
-      </w:pPr>
-      <w:r>
-        <w:rPr>
-          <w:rFonts w:ascii="Calibri" w:cs="Calibri" w:eastAsia="Calibri" w:hAnsi="Calibri"/>
-        </w:rPr>
-        <w:t xml:space="preserve">9.2 Reading</w:t>
-      </w:r>
-    </w:p>
-    <w:p>
-      <w:pPr>
-        <w:spacing w:after="120"/>
-      </w:pPr>
-      <w:r>
-        <w:rPr>
-          <w:rFonts w:ascii="Calibri" w:cs="Calibri" w:eastAsia="Calibri" w:hAnsi="Calibri"/>
-        </w:rPr>
-        <w:t xml:space="preserve">Each reading in a batch carries the following fields. All are required.</w:t>
-      </w:r>
-    </w:p>
-    <w:p>
-      <w:pPr>
-        <w:pStyle w:val="ListParagraph"/>
-        <w:numPr>
-          <w:ilvl w:val="0"/>
-          <w:numId w:val="2"/>
-        </w:numPr>
-        <w:spacing w:after="60"/>
-      </w:pPr>
-      <w:r>
-        <w:rPr>
-          <w:rFonts w:ascii="Calibri" w:cs="Calibri" w:eastAsia="Calibri" w:hAnsi="Calibri"/>
-          <w:b/>
-          <w:bCs/>
-        </w:rPr>
-        <w:t xml:space="preserve">metric</w:t>
-      </w:r>
-      <w:r>
-        <w:rPr>
-          <w:rFonts w:ascii="Calibri" w:cs="Calibri" w:eastAsia="Calibri" w:hAnsi="Calibri"/>
-        </w:rPr>
-        <w:t xml:space="preserve"> (enum) – heart_rate, activity, or ambient_noise</w:t>
-      </w:r>
-    </w:p>
-    <w:p>
-      <w:pPr>
-        <w:pStyle w:val="ListParagraph"/>
-        <w:numPr>
-          <w:ilvl w:val="0"/>
-          <w:numId w:val="2"/>
-        </w:numPr>
-        <w:spacing w:after="60"/>
-      </w:pPr>
-      <w:r>
-        <w:rPr>
-          <w:rFonts w:ascii="Calibri" w:cs="Calibri" w:eastAsia="Calibri" w:hAnsi="Calibri"/>
-          <w:b/>
-          <w:bCs/>
-        </w:rPr>
-        <w:t xml:space="preserve">value</w:t>
-      </w:r>
-      <w:r>
-        <w:rPr>
-          <w:rFonts w:ascii="Calibri" w:cs="Calibri" w:eastAsia="Calibri" w:hAnsi="Calibri"/>
-        </w:rPr>
-        <w:t xml:space="preserve"> (decimal) – measured value in the metric’s standard unit</w:t>
-      </w:r>
-    </w:p>
-    <w:p>
-      <w:pPr>
-        <w:pStyle w:val="ListParagraph"/>
-        <w:numPr>
-          <w:ilvl w:val="0"/>
-          <w:numId w:val="2"/>
-        </w:numPr>
-        <w:spacing w:after="60"/>
-      </w:pPr>
-      <w:r>
-        <w:rPr>
-          <w:rFonts w:ascii="Calibri" w:cs="Calibri" w:eastAsia="Calibri" w:hAnsi="Calibri"/>
-          <w:b/>
-          <w:bCs/>
-        </w:rPr>
-        <w:t xml:space="preserve">unit</w:t>
-      </w:r>
-      <w:r>
-        <w:rPr>
-          <w:rFonts w:ascii="Calibri" w:cs="Calibri" w:eastAsia="Calibri" w:hAnsi="Calibri"/>
-        </w:rPr>
-        <w:t xml:space="preserve"> (enum) – bpm for heart_rate, steps_per_min for activity, dBA for ambient_noise</w:t>
-      </w:r>
-    </w:p>
-    <w:p>
-      <w:pPr>
-        <w:pStyle w:val="ListParagraph"/>
-        <w:numPr>
-          <w:ilvl w:val="0"/>
-          <w:numId w:val="2"/>
-        </w:numPr>
-        <w:spacing w:after="60"/>
-      </w:pPr>
-      <w:r>
-        <w:rPr>
-          <w:rFonts w:ascii="Calibri" w:cs="Calibri" w:eastAsia="Calibri" w:hAnsi="Calibri"/>
-          <w:b/>
-          <w:bCs/>
-        </w:rPr>
-        <w:t xml:space="preserve">measured_at</w:t>
-      </w:r>
-      <w:r>
-        <w:rPr>
-          <w:rFonts w:ascii="Calibri" w:cs="Calibri" w:eastAsia="Calibri" w:hAnsi="Calibri"/>
-        </w:rPr>
-        <w:t xml:space="preserve"> (timestamp) – when the reading was taken (ISO 8601, UTC)</w:t>
-      </w:r>
-    </w:p>
-    <w:p>
-      <w:pPr>
-        <w:pStyle w:val="ListParagraph"/>
-        <w:numPr>
-          <w:ilvl w:val="0"/>
-          <w:numId w:val="2"/>
-        </w:numPr>
-        <w:spacing w:after="60"/>
-      </w:pPr>
-      <w:r>
-        <w:rPr>
-          <w:rFonts w:ascii="Calibri" w:cs="Calibri" w:eastAsia="Calibri" w:hAnsi="Calibri"/>
-          <w:b/>
-          <w:bCs/>
-        </w:rPr>
-        <w:t xml:space="preserve">sample_interval_s</w:t>
-      </w:r>
-      <w:r>
-        <w:rPr>
-          <w:rFonts w:ascii="Calibri" w:cs="Calibri" w:eastAsia="Calibri" w:hAnsi="Calibri"/>
-        </w:rPr>
-        <w:t xml:space="preserve"> (integer) – seconds covered by the reading</w:t>
-      </w:r>
-    </w:p>
-    <w:p>
-      <w:pPr>
-        <w:pStyle w:val="ListParagraph"/>
-        <w:numPr>
-          <w:ilvl w:val="0"/>
-          <w:numId w:val="2"/>
-        </w:numPr>
-        <w:spacing w:after="60"/>
-      </w:pPr>
-      <w:r>
-        <w:rPr>
-          <w:rFonts w:ascii="Calibri" w:cs="Calibri" w:eastAsia="Calibri" w:hAnsi="Calibri"/>
-          <w:b/>
-          <w:bCs/>
-        </w:rPr>
-        <w:t xml:space="preserve">quality</w:t>
-      </w:r>
-      <w:r>
-        <w:rPr>
-          <w:rFonts w:ascii="Calibri" w:cs="Calibri" w:eastAsia="Calibri" w:hAnsi="Calibri"/>
-        </w:rPr>
-        <w:t xml:space="preserve"> (enum) – good, low, or missing</w:t>
-      </w:r>
-    </w:p>
-    <w:p>
-      <w:pPr>
-        <w:pStyle w:val="Heading2"/>
-        <w:spacing w:after="80" w:before="240"/>
-      </w:pPr>
-      <w:r>
-        <w:rPr>
-          <w:rFonts w:ascii="Calibri" w:cs="Calibri" w:eastAsia="Calibri" w:hAnsi="Calibri"/>
-        </w:rPr>
-        <w:t xml:space="preserve">9.3 Example</w:t>
-      </w:r>
-    </w:p>
-    <w:p>
-      <w:pPr>
-        <w:shd w:fill="F2F2F2" w:color="auto" w:val="clear"/>
-        <w:spacing w:after="0" w:line="240" w:lineRule="auto"/>
-        <w:ind w:left="200" w:right="200"/>
-      </w:pPr>
-      <w:r>
-        <w:rPr>
-          <w:rFonts w:ascii="Consolas" w:cs="Consolas" w:eastAsia="Consolas" w:hAnsi="Consolas"/>
-          <w:sz w:val="18"/>
-          <w:szCs w:val="18"/>
-        </w:rPr>
-        <w:t xml:space="preserve">{</w:t>
-      </w:r>
-    </w:p>
-    <w:p>
-      <w:pPr>
-        <w:shd w:fill="F2F2F2" w:color="auto" w:val="clear"/>
-        <w:spacing w:after="0" w:line="240" w:lineRule="auto"/>
-        <w:ind w:left="200" w:right="200"/>
-      </w:pPr>
-      <w:r>
-        <w:rPr>
-          <w:rFonts w:ascii="Consolas" w:cs="Consolas" w:eastAsia="Consolas" w:hAnsi="Consolas"/>
-          <w:sz w:val="18"/>
-          <w:szCs w:val="18"/>
-        </w:rPr>
-        <w:t xml:space="preserve">  "batch_id": "6f1c2a9e-5b3d-4c7a-9e21-0d4b7a8c1f32",</w:t>
-      </w:r>
-    </w:p>
-    <w:p>
-      <w:pPr>
-        <w:shd w:fill="F2F2F2" w:color="auto" w:val="clear"/>
-        <w:spacing w:after="0" w:line="240" w:lineRule="auto"/>
-        <w:ind w:left="200" w:right="200"/>
-      </w:pPr>
-      <w:r>
-        <w:rPr>
-          <w:rFonts w:ascii="Consolas" w:cs="Consolas" w:eastAsia="Consolas" w:hAnsi="Consolas"/>
-          <w:sz w:val="18"/>
-          <w:szCs w:val="18"/>
-        </w:rPr>
-        <w:t xml:space="preserve">  "organization_id": "a2e4f1b7-3c9d-4e10-8b2a-5f6c7d8e9a01",</w:t>
-      </w:r>
-    </w:p>
-    <w:p>
-      <w:pPr>
-        <w:shd w:fill="F2F2F2" w:color="auto" w:val="clear"/>
-        <w:spacing w:after="0" w:line="240" w:lineRule="auto"/>
-        <w:ind w:left="200" w:right="200"/>
-      </w:pPr>
-      <w:r>
-        <w:rPr>
-          <w:rFonts w:ascii="Consolas" w:cs="Consolas" w:eastAsia="Consolas" w:hAnsi="Consolas"/>
-          <w:sz w:val="18"/>
-          <w:szCs w:val="18"/>
-        </w:rPr>
-        <w:t xml:space="preserve">  "session_id": "c91b0d2e-7a4f-4b3c-9d1e-2f3a4b5c6d7e",</w:t>
-      </w:r>
-    </w:p>
-    <w:p>
-      <w:pPr>
-        <w:shd w:fill="F2F2F2" w:color="auto" w:val="clear"/>
-        <w:spacing w:after="0" w:line="240" w:lineRule="auto"/>
-        <w:ind w:left="200" w:right="200"/>
-      </w:pPr>
-      <w:r>
-        <w:rPr>
-          <w:rFonts w:ascii="Consolas" w:cs="Consolas" w:eastAsia="Consolas" w:hAnsi="Consolas"/>
-          <w:sz w:val="18"/>
-          <w:szCs w:val="18"/>
-        </w:rPr>
-        <w:t xml:space="preserve">  "client_ref": "7d0f9e8d-1c2b-4a3f-8e7d-6c5b4a392817",</w:t>
-      </w:r>
-    </w:p>
-    <w:p>
-      <w:pPr>
-        <w:shd w:fill="F2F2F2" w:color="auto" w:val="clear"/>
-        <w:spacing w:after="0" w:line="240" w:lineRule="auto"/>
-        <w:ind w:left="200" w:right="200"/>
-      </w:pPr>
-      <w:r>
-        <w:rPr>
-          <w:rFonts w:ascii="Consolas" w:cs="Consolas" w:eastAsia="Consolas" w:hAnsi="Consolas"/>
-          <w:sz w:val="18"/>
-          <w:szCs w:val="18"/>
-        </w:rPr>
-        <w:t xml:space="preserve">  "device_id": "WX-20391", "vendor": "ExampleVendor",</w:t>
-      </w:r>
-    </w:p>
-    <w:p>
-      <w:pPr>
-        <w:shd w:fill="F2F2F2" w:color="auto" w:val="clear"/>
-        <w:spacing w:after="0" w:line="240" w:lineRule="auto"/>
-        <w:ind w:left="200" w:right="200"/>
-      </w:pPr>
-      <w:r>
-        <w:rPr>
-          <w:rFonts w:ascii="Consolas" w:cs="Consolas" w:eastAsia="Consolas" w:hAnsi="Consolas"/>
-          <w:sz w:val="18"/>
-          <w:szCs w:val="18"/>
-        </w:rPr>
-        <w:t xml:space="preserve">  "window_start": "2026-11-02T15:00:00Z",</w:t>
-      </w:r>
-    </w:p>
-    <w:p>
-      <w:pPr>
-        <w:shd w:fill="F2F2F2" w:color="auto" w:val="clear"/>
-        <w:spacing w:after="0" w:line="240" w:lineRule="auto"/>
-        <w:ind w:left="200" w:right="200"/>
-      </w:pPr>
-      <w:r>
-        <w:rPr>
-          <w:rFonts w:ascii="Consolas" w:cs="Consolas" w:eastAsia="Consolas" w:hAnsi="Consolas"/>
-          <w:sz w:val="18"/>
-          <w:szCs w:val="18"/>
-        </w:rPr>
-        <w:t xml:space="preserve">  "window_end": "2026-11-02T15:02:00Z",</w:t>
-      </w:r>
-    </w:p>
-    <w:p>
-      <w:pPr>
-        <w:shd w:fill="F2F2F2" w:color="auto" w:val="clear"/>
-        <w:spacing w:after="0" w:line="240" w:lineRule="auto"/>
-        <w:ind w:left="200" w:right="200"/>
-      </w:pPr>
-      <w:r>
-        <w:rPr>
-          <w:rFonts w:ascii="Consolas" w:cs="Consolas" w:eastAsia="Consolas" w:hAnsi="Consolas"/>
-          <w:sz w:val="18"/>
-          <w:szCs w:val="18"/>
-        </w:rPr>
-        <w:t xml:space="preserve">  "received_at": "2026-11-02T15:02:07Z",</w:t>
-      </w:r>
-    </w:p>
-    <w:p>
-      <w:pPr>
-        <w:shd w:fill="F2F2F2" w:color="auto" w:val="clear"/>
-        <w:spacing w:after="0" w:line="240" w:lineRule="auto"/>
-        <w:ind w:left="200" w:right="200"/>
-      </w:pPr>
-      <w:r>
-        <w:rPr>
-          <w:rFonts w:ascii="Consolas" w:cs="Consolas" w:eastAsia="Consolas" w:hAnsi="Consolas"/>
-          <w:sz w:val="18"/>
-          <w:szCs w:val="18"/>
-        </w:rPr>
-        <w:t xml:space="preserve">  "readings": [</w:t>
-      </w:r>
-    </w:p>
-    <w:p>
-      <w:pPr>
-        <w:shd w:fill="F2F2F2" w:color="auto" w:val="clear"/>
-        <w:spacing w:after="0" w:line="240" w:lineRule="auto"/>
-        <w:ind w:left="200" w:right="200"/>
-      </w:pPr>
-      <w:r>
-        <w:rPr>
-          <w:rFonts w:ascii="Consolas" w:cs="Consolas" w:eastAsia="Consolas" w:hAnsi="Consolas"/>
-          <w:sz w:val="18"/>
-          <w:szCs w:val="18"/>
-        </w:rPr>
-        <w:t xml:space="preserve">    { "metric": "heart_rate", "value": 112, "unit": "bpm",</w:t>
-      </w:r>
-    </w:p>
-    <w:p>
-      <w:pPr>
-        <w:shd w:fill="F2F2F2" w:color="auto" w:val="clear"/>
-        <w:spacing w:after="0" w:line="240" w:lineRule="auto"/>
-        <w:ind w:left="200" w:right="200"/>
-      </w:pPr>
-      <w:r>
-        <w:rPr>
-          <w:rFonts w:ascii="Consolas" w:cs="Consolas" w:eastAsia="Consolas" w:hAnsi="Consolas"/>
-          <w:sz w:val="18"/>
-          <w:szCs w:val="18"/>
-        </w:rPr>
-        <w:t xml:space="preserve">      "measured_at": "2026-11-02T15:00:30Z",</w:t>
-      </w:r>
-    </w:p>
-    <w:p>
-      <w:pPr>
-        <w:shd w:fill="F2F2F2" w:color="auto" w:val="clear"/>
-        <w:spacing w:after="0" w:line="240" w:lineRule="auto"/>
-        <w:ind w:left="200" w:right="200"/>
-      </w:pPr>
-      <w:r>
-        <w:rPr>
-          <w:rFonts w:ascii="Consolas" w:cs="Consolas" w:eastAsia="Consolas" w:hAnsi="Consolas"/>
-          <w:sz w:val="18"/>
-          <w:szCs w:val="18"/>
-        </w:rPr>
-        <w:t xml:space="preserve">      "sample_interval_s": 30, "quality": "good" },</w:t>
-      </w:r>
-    </w:p>
-    <w:p>
-      <w:pPr>
-        <w:shd w:fill="F2F2F2" w:color="auto" w:val="clear"/>
-        <w:spacing w:after="0" w:line="240" w:lineRule="auto"/>
-        <w:ind w:left="200" w:right="200"/>
-      </w:pPr>
-      <w:r>
-        <w:rPr>
-          <w:rFonts w:ascii="Consolas" w:cs="Consolas" w:eastAsia="Consolas" w:hAnsi="Consolas"/>
-          <w:sz w:val="18"/>
-          <w:szCs w:val="18"/>
-        </w:rPr>
-        <w:t xml:space="preserve">    { "metric": "ambient_noise", "value": 64.5, "unit": "dBA",</w:t>
-      </w:r>
-    </w:p>
-    <w:p>
-      <w:pPr>
-        <w:shd w:fill="F2F2F2" w:color="auto" w:val="clear"/>
-        <w:spacing w:after="0" w:line="240" w:lineRule="auto"/>
-        <w:ind w:left="200" w:right="200"/>
-      </w:pPr>
-      <w:r>
-        <w:rPr>
-          <w:rFonts w:ascii="Consolas" w:cs="Consolas" w:eastAsia="Consolas" w:hAnsi="Consolas"/>
-          <w:sz w:val="18"/>
-          <w:szCs w:val="18"/>
-        </w:rPr>
-        <w:t xml:space="preserve">      "measured_at": "2026-11-02T15:00:30Z",</w:t>
-      </w:r>
-    </w:p>
-    <w:p>
-      <w:pPr>
-        <w:shd w:fill="F2F2F2" w:color="auto" w:val="clear"/>
-        <w:spacing w:after="0" w:line="240" w:lineRule="auto"/>
-        <w:ind w:left="200" w:right="200"/>
-      </w:pPr>
-      <w:r>
-        <w:rPr>
-          <w:rFonts w:ascii="Consolas" w:cs="Consolas" w:eastAsia="Consolas" w:hAnsi="Consolas"/>
-          <w:sz w:val="18"/>
-          <w:szCs w:val="18"/>
-        </w:rPr>
-        <w:t xml:space="preserve">      "sample_interval_s": 30, "quality": "good" }</w:t>
-      </w:r>
-    </w:p>
-    <w:p>
-      <w:pPr>
-        <w:shd w:fill="F2F2F2" w:color="auto" w:val="clear"/>
-        <w:spacing w:after="0" w:line="240" w:lineRule="auto"/>
-        <w:ind w:left="200" w:right="200"/>
-      </w:pPr>
-      <w:r>
-        <w:rPr>
-          <w:rFonts w:ascii="Consolas" w:cs="Consolas" w:eastAsia="Consolas" w:hAnsi="Consolas"/>
-          <w:sz w:val="18"/>
-          <w:szCs w:val="18"/>
-        </w:rPr>
-        <w:t xml:space="preserve">  ],</w:t>
-      </w:r>
-    </w:p>
-    <w:p>
-      <w:pPr>
-        <w:shd w:fill="F2F2F2" w:color="auto" w:val="clear"/>
-        <w:spacing w:after="0" w:line="240" w:lineRule="auto"/>
-        <w:ind w:left="200" w:right="200"/>
-      </w:pPr>
-      <w:r>
-        <w:rPr>
-          <w:rFonts w:ascii="Consolas" w:cs="Consolas" w:eastAsia="Consolas" w:hAnsi="Consolas"/>
-          <w:sz w:val="18"/>
-          <w:szCs w:val="18"/>
-        </w:rPr>
-        <w:t xml:space="preserve">  "raw_payload_ref": "raw/2026/11/02/6f1c2a9e.json"</w:t>
-      </w:r>
-    </w:p>
-    <w:p>
-      <w:pPr>
-        <w:shd w:fill="F2F2F2" w:color="auto" w:val="clear"/>
-        <w:spacing w:after="0" w:line="240" w:lineRule="auto"/>
-        <w:ind w:left="200" w:right="200"/>
-      </w:pPr>
-      <w:r>
-        <w:rPr>
-          <w:rFonts w:ascii="Consolas" w:cs="Consolas" w:eastAsia="Consolas" w:hAnsi="Consolas"/>
-          <w:sz w:val="18"/>
-          <w:szCs w:val="18"/>
-        </w:rPr>
-        <w:t xml:space="preserve">}</w:t>
-      </w:r>
-    </w:p>
-    <w:p>
-      <w:pPr>
-        <w:spacing w:after="120"/>
-      </w:pPr>
-    </w:p>
-    <w:p>
-      <w:pPr>
-        <w:pStyle w:val="Heading2"/>
-        <w:spacing w:after="80" w:before="240"/>
-      </w:pPr>
-      <w:r>
-        <w:rPr>
-          <w:rFonts w:ascii="Calibri" w:cs="Calibri" w:eastAsia="Calibri" w:hAnsi="Calibri"/>
-        </w:rPr>
-        <w:t xml:space="preserve">9.4 Rules</w:t>
-      </w:r>
-    </w:p>
-    <w:p>
-      <w:pPr>
-        <w:pStyle w:val="ListParagraph"/>
-        <w:numPr>
-          <w:ilvl w:val="0"/>
-          <w:numId w:val="2"/>
-        </w:numPr>
-        <w:spacing w:after="60"/>
-      </w:pPr>
-      <w:r>
-        <w:rPr>
-          <w:rFonts w:ascii="Calibri" w:cs="Calibri" w:eastAsia="Calibri" w:hAnsi="Calibri"/>
-        </w:rPr>
-        <w:t xml:space="preserve">All timestamps are ISO 8601 in UTC; the UI converts to the organization’s time zone</w:t>
-      </w:r>
-    </w:p>
-    <w:p>
-      <w:pPr>
-        <w:pStyle w:val="ListParagraph"/>
-        <w:numPr>
-          <w:ilvl w:val="0"/>
-          <w:numId w:val="2"/>
-        </w:numPr>
-        <w:spacing w:after="60"/>
-      </w:pPr>
-      <w:r>
-        <w:rPr>
-          <w:rFonts w:ascii="Calibri" w:cs="Calibri" w:eastAsia="Calibri" w:hAnsi="Calibri"/>
-        </w:rPr>
-        <w:t xml:space="preserve">Each metric uses one fixed unit; vendor units are converted by the adapter</w:t>
-      </w:r>
-    </w:p>
-    <w:p>
-      <w:pPr>
-        <w:pStyle w:val="ListParagraph"/>
-        <w:numPr>
-          <w:ilvl w:val="0"/>
-          <w:numId w:val="2"/>
-        </w:numPr>
-        <w:spacing w:after="60"/>
-      </w:pPr>
-      <w:r>
-        <w:rPr>
-          <w:rFonts w:ascii="Calibri" w:cs="Calibri" w:eastAsia="Calibri" w:hAnsi="Calibri"/>
-        </w:rPr>
-        <w:t xml:space="preserve">Readings outside the session window are discarded</w:t>
-      </w:r>
-    </w:p>
-    <w:p>
-      <w:pPr>
-        <w:pStyle w:val="ListParagraph"/>
-        <w:numPr>
-          <w:ilvl w:val="0"/>
-          <w:numId w:val="2"/>
-        </w:numPr>
-        <w:spacing w:after="60"/>
-      </w:pPr>
-      <w:r>
-        <w:rPr>
-          <w:rFonts w:ascii="Calibri" w:cs="Calibri" w:eastAsia="Calibri" w:hAnsi="Calibri"/>
-        </w:rPr>
-        <w:t xml:space="preserve">Duplicate readings (same device, metric, and measured_at) are ignored</w:t>
-      </w:r>
-    </w:p>
-    <w:p>
-      <w:pPr>
-        <w:pStyle w:val="ListParagraph"/>
-        <w:numPr>
-          <w:ilvl w:val="0"/>
-          <w:numId w:val="2"/>
-        </w:numPr>
-        <w:spacing w:after="60"/>
-      </w:pPr>
-      <w:r>
-        <w:rPr>
-          <w:rFonts w:ascii="Calibri" w:cs="Calibri" w:eastAsia="Calibri" w:hAnsi="Calibri"/>
-        </w:rPr>
-        <w:t xml:space="preserve">Missing or low-quality readings are flagged, never interpolated</w:t>
-      </w:r>
-    </w:p>
-    <w:p>
-      <w:pPr>
-        <w:pStyle w:val="ListParagraph"/>
-        <w:numPr>
-          <w:ilvl w:val="0"/>
-          <w:numId w:val="2"/>
-        </w:numPr>
-        <w:spacing w:after="60"/>
-      </w:pPr>
-      <w:r>
-        <w:rPr>
-          <w:rFonts w:ascii="Calibri" w:cs="Calibri" w:eastAsia="Calibri" w:hAnsi="Calibri"/>
-        </w:rPr>
-        <w:t xml:space="preserve">The vendor’s original payload is stored unchanged and separately from normalized data (Section 12.3)</w:t>
-      </w:r>
-    </w:p>
-    <w:p>
-      <w:pPr>
-        <w:pStyle w:val="ListParagraph"/>
-        <w:numPr>
-          <w:ilvl w:val="0"/>
-          <w:numId w:val="2"/>
-        </w:numPr>
-        <w:spacing w:after="60"/>
-      </w:pPr>
-      <w:r>
-        <w:rPr>
-          <w:rFonts w:ascii="Calibri" w:cs="Calibri" w:eastAsia="Calibri" w:hAnsi="Calibri"/>
-        </w:rPr>
-        <w:t xml:space="preserve">Batches with an unknown session, organization, or device are rejected and logged</w:t>
+        <w:t xml:space="preserve">Data received from each wearable vendor is converted into one common format and stored in a dedicated wearable data table, linked to its organization, session, and client. The vendor’s original data is kept separately (Section 12.3). The table’s structure will be defined during design.</w:t>
       </w:r>
     </w:p>
     <w:p>

</xml_diff>

<commit_message>
session 2026-10-12: user flows agreed for all roles; PRD v3.0 section 7 updated
Co-Authored-By: Claude Opus 5.5 <noreply@anthropic.com>
Claude-Session: https://claude.ai/code/session_01AzN61zWTi2yq5SJaQMPbTS
</commit_message>
<xml_diff>
--- a/docs/BEST_PRD_v3.0.docx
+++ b/docs/BEST_PRD_v3.0.docx
@@ -1609,6 +1609,17 @@
     </w:p>
     <w:p>
       <w:pPr>
+        <w:spacing w:after="120"/>
+      </w:pPr>
+      <w:r>
+        <w:rPr>
+          <w:rFonts w:ascii="Calibri" w:cs="Calibri" w:eastAsia="Calibri" w:hAnsi="Calibri"/>
+        </w:rPr>
+        <w:t xml:space="preserve">This section shows how each user moves through the platform. Decision points are shown in amber; system-driven steps in green.</w:t>
+      </w:r>
+    </w:p>
+    <w:p>
+      <w:pPr>
         <w:pStyle w:val="Heading2"/>
         <w:spacing w:after="80" w:before="240"/>
       </w:pPr>
@@ -1616,507 +1627,31 @@
         <w:rPr>
           <w:rFonts w:ascii="Calibri" w:cs="Calibri" w:eastAsia="Calibri" w:hAnsi="Calibri"/>
         </w:rPr>
-        <w:t xml:space="preserve">Therapist Flow</w:t>
-      </w:r>
-    </w:p>
-    <w:p>
-      <w:pPr>
-        <w:pStyle w:val="ListParagraph"/>
-        <w:numPr>
-          <w:ilvl w:val="0"/>
-          <w:numId w:val="3"/>
-        </w:numPr>
-        <w:spacing w:after="60"/>
-      </w:pPr>
-      <w:r>
-        <w:rPr>
-          <w:rFonts w:ascii="Calibri" w:cs="Calibri" w:eastAsia="Calibri" w:hAnsi="Calibri"/>
-        </w:rPr>
-        <w:t xml:space="preserve">Login</w:t>
-      </w:r>
-    </w:p>
-    <w:p>
-      <w:pPr>
-        <w:pStyle w:val="ListParagraph"/>
-        <w:numPr>
-          <w:ilvl w:val="0"/>
-          <w:numId w:val="3"/>
-        </w:numPr>
-        <w:spacing w:after="60"/>
-      </w:pPr>
-      <w:r>
-        <w:rPr>
-          <w:rFonts w:ascii="Calibri" w:cs="Calibri" w:eastAsia="Calibri" w:hAnsi="Calibri"/>
-        </w:rPr>
-        <w:t xml:space="preserve">View assigned clients</w:t>
-      </w:r>
-    </w:p>
-    <w:p>
-      <w:pPr>
-        <w:pStyle w:val="ListParagraph"/>
-        <w:numPr>
-          <w:ilvl w:val="0"/>
-          <w:numId w:val="3"/>
-        </w:numPr>
-        <w:spacing w:after="60"/>
-      </w:pPr>
-      <w:r>
-        <w:rPr>
-          <w:rFonts w:ascii="Calibri" w:cs="Calibri" w:eastAsia="Calibri" w:hAnsi="Calibri"/>
-        </w:rPr>
-        <w:t xml:space="preserve">Start scheduled session (in person or telehealth)</w:t>
-      </w:r>
-    </w:p>
-    <w:p>
-      <w:pPr>
-        <w:pStyle w:val="ListParagraph"/>
-        <w:numPr>
-          <w:ilvl w:val="0"/>
-          <w:numId w:val="3"/>
-        </w:numPr>
-        <w:spacing w:after="60"/>
-      </w:pPr>
-      <w:r>
-        <w:rPr>
-          <w:rFonts w:ascii="Calibri" w:cs="Calibri" w:eastAsia="Calibri" w:hAnsi="Calibri"/>
-        </w:rPr>
-        <w:t xml:space="preserve">Monitor live indicators</w:t>
-      </w:r>
-    </w:p>
-    <w:p>
-      <w:pPr>
-        <w:pStyle w:val="ListParagraph"/>
-        <w:numPr>
-          <w:ilvl w:val="0"/>
-          <w:numId w:val="3"/>
-        </w:numPr>
-        <w:spacing w:after="60"/>
-      </w:pPr>
-      <w:r>
-        <w:rPr>
-          <w:rFonts w:ascii="Calibri" w:cs="Calibri" w:eastAsia="Calibri" w:hAnsi="Calibri"/>
-        </w:rPr>
-        <w:t xml:space="preserve">Receive soft alerts</w:t>
-      </w:r>
-    </w:p>
-    <w:p>
-      <w:pPr>
-        <w:pStyle w:val="ListParagraph"/>
-        <w:numPr>
-          <w:ilvl w:val="0"/>
-          <w:numId w:val="3"/>
-        </w:numPr>
-        <w:spacing w:after="60"/>
-      </w:pPr>
-      <w:r>
-        <w:rPr>
-          <w:rFonts w:ascii="Calibri" w:cs="Calibri" w:eastAsia="Calibri" w:hAnsi="Calibri"/>
-        </w:rPr>
-        <w:t xml:space="preserve">Add notes and markers</w:t>
-      </w:r>
-    </w:p>
-    <w:p>
-      <w:pPr>
-        <w:pStyle w:val="ListParagraph"/>
-        <w:numPr>
-          <w:ilvl w:val="0"/>
-          <w:numId w:val="3"/>
-        </w:numPr>
-        <w:spacing w:after="60"/>
-      </w:pPr>
-      <w:r>
-        <w:rPr>
-          <w:rFonts w:ascii="Calibri" w:cs="Calibri" w:eastAsia="Calibri" w:hAnsi="Calibri"/>
-        </w:rPr>
-        <w:t xml:space="preserve">End session</w:t>
-      </w:r>
-    </w:p>
-    <w:p>
-      <w:pPr>
-        <w:pStyle w:val="ListParagraph"/>
-        <w:numPr>
-          <w:ilvl w:val="0"/>
-          <w:numId w:val="3"/>
-        </w:numPr>
-        <w:spacing w:after="60"/>
-      </w:pPr>
-      <w:r>
-        <w:rPr>
-          <w:rFonts w:ascii="Calibri" w:cs="Calibri" w:eastAsia="Calibri" w:hAnsi="Calibri"/>
-        </w:rPr>
-        <w:t xml:space="preserve">Review, edit, and confirm the AI-generated session summary</w:t>
-      </w:r>
-    </w:p>
-    <w:p>
-      <w:pPr>
-        <w:pStyle w:val="Heading2"/>
-        <w:spacing w:after="80" w:before="240"/>
-      </w:pPr>
-      <w:r>
-        <w:rPr>
-          <w:rFonts w:ascii="Calibri" w:cs="Calibri" w:eastAsia="Calibri" w:hAnsi="Calibri"/>
-        </w:rPr>
-        <w:t xml:space="preserve">Supervisor Flow</w:t>
-      </w:r>
-    </w:p>
-    <w:p>
-      <w:pPr>
-        <w:pStyle w:val="ListParagraph"/>
-        <w:numPr>
-          <w:ilvl w:val="0"/>
-          <w:numId w:val="4"/>
-        </w:numPr>
-        <w:spacing w:after="60"/>
-      </w:pPr>
-      <w:r>
-        <w:rPr>
-          <w:rFonts w:ascii="Calibri" w:cs="Calibri" w:eastAsia="Calibri" w:hAnsi="Calibri"/>
-        </w:rPr>
-        <w:t xml:space="preserve">Login</w:t>
-      </w:r>
-    </w:p>
-    <w:p>
-      <w:pPr>
-        <w:pStyle w:val="ListParagraph"/>
-        <w:numPr>
-          <w:ilvl w:val="0"/>
-          <w:numId w:val="4"/>
-        </w:numPr>
-        <w:spacing w:after="60"/>
-      </w:pPr>
-      <w:r>
-        <w:rPr>
-          <w:rFonts w:ascii="Calibri" w:cs="Calibri" w:eastAsia="Calibri" w:hAnsi="Calibri"/>
-        </w:rPr>
-        <w:t xml:space="preserve">View caseload dashboard</w:t>
-      </w:r>
-    </w:p>
-    <w:p>
-      <w:pPr>
-        <w:pStyle w:val="ListParagraph"/>
-        <w:numPr>
-          <w:ilvl w:val="0"/>
-          <w:numId w:val="4"/>
-        </w:numPr>
-        <w:spacing w:after="60"/>
-      </w:pPr>
-      <w:r>
-        <w:rPr>
-          <w:rFonts w:ascii="Calibri" w:cs="Calibri" w:eastAsia="Calibri" w:hAnsi="Calibri"/>
-        </w:rPr>
-        <w:t xml:space="preserve">Monitor flagged or high-alert sessions</w:t>
-      </w:r>
-    </w:p>
-    <w:p>
-      <w:pPr>
-        <w:pStyle w:val="ListParagraph"/>
-        <w:numPr>
-          <w:ilvl w:val="0"/>
-          <w:numId w:val="4"/>
-        </w:numPr>
-        <w:spacing w:after="60"/>
-      </w:pPr>
-      <w:r>
-        <w:rPr>
-          <w:rFonts w:ascii="Calibri" w:cs="Calibri" w:eastAsia="Calibri" w:hAnsi="Calibri"/>
-        </w:rPr>
-        <w:t xml:space="preserve">Review summaries and trends</w:t>
-      </w:r>
-    </w:p>
-    <w:p>
-      <w:pPr>
-        <w:pStyle w:val="ListParagraph"/>
-        <w:numPr>
-          <w:ilvl w:val="0"/>
-          <w:numId w:val="4"/>
-        </w:numPr>
-        <w:spacing w:after="60"/>
-      </w:pPr>
-      <w:r>
-        <w:rPr>
-          <w:rFonts w:ascii="Calibri" w:cs="Calibri" w:eastAsia="Calibri" w:hAnsi="Calibri"/>
-        </w:rPr>
-        <w:t xml:space="preserve">Support therapists as needed</w:t>
-      </w:r>
-    </w:p>
-    <w:p>
-      <w:pPr>
-        <w:pStyle w:val="Heading2"/>
-        <w:spacing w:after="80" w:before="240"/>
-      </w:pPr>
-      <w:r>
-        <w:rPr>
-          <w:rFonts w:ascii="Calibri" w:cs="Calibri" w:eastAsia="Calibri" w:hAnsi="Calibri"/>
-        </w:rPr>
-        <w:t xml:space="preserve">Organization Admin / Clinic Manager Flow</w:t>
-      </w:r>
-    </w:p>
-    <w:p>
-      <w:pPr>
-        <w:pStyle w:val="ListParagraph"/>
-        <w:numPr>
-          <w:ilvl w:val="0"/>
-          <w:numId w:val="2"/>
-        </w:numPr>
-        <w:spacing w:after="60"/>
-      </w:pPr>
-      <w:r>
-        <w:rPr>
-          <w:rFonts w:ascii="Calibri" w:cs="Calibri" w:eastAsia="Calibri" w:hAnsi="Calibri"/>
-        </w:rPr>
-        <w:t xml:space="preserve">Log in using privileged authentication (MFA)</w:t>
-      </w:r>
-    </w:p>
-    <w:p>
-      <w:pPr>
-        <w:pStyle w:val="ListParagraph"/>
-        <w:numPr>
-          <w:ilvl w:val="0"/>
-          <w:numId w:val="2"/>
-        </w:numPr>
-        <w:spacing w:after="60"/>
-      </w:pPr>
-      <w:r>
-        <w:rPr>
-          <w:rFonts w:ascii="Calibri" w:cs="Calibri" w:eastAsia="Calibri" w:hAnsi="Calibri"/>
-        </w:rPr>
-        <w:t xml:space="preserve">Review organization dashboard, license usage, and outstanding actions</w:t>
-      </w:r>
-    </w:p>
-    <w:p>
-      <w:pPr>
-        <w:pStyle w:val="ListParagraph"/>
-        <w:numPr>
-          <w:ilvl w:val="0"/>
-          <w:numId w:val="2"/>
-        </w:numPr>
-        <w:spacing w:after="60"/>
-      </w:pPr>
-      <w:r>
-        <w:rPr>
-          <w:rFonts w:ascii="Calibri" w:cs="Calibri" w:eastAsia="Calibri" w:hAnsi="Calibri"/>
-        </w:rPr>
-        <w:t xml:space="preserve">Invite, deactivate, and assign roles to organization users</w:t>
-      </w:r>
-    </w:p>
-    <w:p>
-      <w:pPr>
-        <w:pStyle w:val="ListParagraph"/>
-        <w:numPr>
-          <w:ilvl w:val="0"/>
-          <w:numId w:val="2"/>
-        </w:numPr>
-        <w:spacing w:after="60"/>
-      </w:pPr>
-      <w:r>
-        <w:rPr>
-          <w:rFonts w:ascii="Calibri" w:cs="Calibri" w:eastAsia="Calibri" w:hAnsi="Calibri"/>
-        </w:rPr>
-        <w:t xml:space="preserve">Add, edit, archive, or restore client profiles</w:t>
-      </w:r>
-    </w:p>
-    <w:p>
-      <w:pPr>
-        <w:pStyle w:val="ListParagraph"/>
-        <w:numPr>
-          <w:ilvl w:val="0"/>
-          <w:numId w:val="2"/>
-        </w:numPr>
-        <w:spacing w:after="60"/>
-      </w:pPr>
-      <w:r>
-        <w:rPr>
-          <w:rFonts w:ascii="Calibri" w:cs="Calibri" w:eastAsia="Calibri" w:hAnsi="Calibri"/>
-        </w:rPr>
-        <w:t xml:space="preserve">Record each client’s signed consent</w:t>
-      </w:r>
-    </w:p>
-    <w:p>
-      <w:pPr>
-        <w:pStyle w:val="ListParagraph"/>
-        <w:numPr>
-          <w:ilvl w:val="0"/>
-          <w:numId w:val="2"/>
-        </w:numPr>
-        <w:spacing w:after="60"/>
-      </w:pPr>
-      <w:r>
-        <w:rPr>
-          <w:rFonts w:ascii="Calibri" w:cs="Calibri" w:eastAsia="Calibri" w:hAnsi="Calibri"/>
-        </w:rPr>
-        <w:t xml:space="preserve">Assign or reassign clients to therapists and supervisors</w:t>
-      </w:r>
-    </w:p>
-    <w:p>
-      <w:pPr>
-        <w:pStyle w:val="ListParagraph"/>
-        <w:numPr>
-          <w:ilvl w:val="0"/>
-          <w:numId w:val="2"/>
-        </w:numPr>
-        <w:spacing w:after="60"/>
-      </w:pPr>
-      <w:r>
-        <w:rPr>
-          <w:rFonts w:ascii="Calibri" w:cs="Calibri" w:eastAsia="Calibri" w:hAnsi="Calibri"/>
-        </w:rPr>
-        <w:t xml:space="preserve">Manage organization settings and view license allocation</w:t>
-      </w:r>
-    </w:p>
-    <w:p>
-      <w:pPr>
-        <w:pStyle w:val="ListParagraph"/>
-        <w:numPr>
-          <w:ilvl w:val="0"/>
-          <w:numId w:val="2"/>
-        </w:numPr>
-        <w:spacing w:after="60"/>
-      </w:pPr>
-      <w:r>
-        <w:rPr>
-          <w:rFonts w:ascii="Calibri" w:cs="Calibri" w:eastAsia="Calibri" w:hAnsi="Calibri"/>
-        </w:rPr>
-        <w:t xml:space="preserve">Review audit history for administrative changes</w:t>
-      </w:r>
-    </w:p>
-    <w:p>
-      <w:pPr>
-        <w:pStyle w:val="Heading2"/>
-        <w:spacing w:after="80" w:before="240"/>
-      </w:pPr>
-      <w:r>
-        <w:rPr>
-          <w:rFonts w:ascii="Calibri" w:cs="Calibri" w:eastAsia="Calibri" w:hAnsi="Calibri"/>
-        </w:rPr>
-        <w:t xml:space="preserve">BEST Back-Office Flow</w:t>
-      </w:r>
-    </w:p>
-    <w:p>
-      <w:pPr>
-        <w:pStyle w:val="ListParagraph"/>
-        <w:numPr>
-          <w:ilvl w:val="0"/>
-          <w:numId w:val="2"/>
-        </w:numPr>
-        <w:spacing w:after="60"/>
-      </w:pPr>
-      <w:r>
-        <w:rPr>
-          <w:rFonts w:ascii="Calibri" w:cs="Calibri" w:eastAsia="Calibri" w:hAnsi="Calibri"/>
-        </w:rPr>
-        <w:t xml:space="preserve">Log in with MFA and a function-specific back-office role</w:t>
-      </w:r>
-    </w:p>
-    <w:p>
-      <w:pPr>
-        <w:pStyle w:val="ListParagraph"/>
-        <w:numPr>
-          <w:ilvl w:val="0"/>
-          <w:numId w:val="2"/>
-        </w:numPr>
-        <w:spacing w:after="60"/>
-      </w:pPr>
-      <w:r>
-        <w:rPr>
-          <w:rFonts w:ascii="Calibri" w:cs="Calibri" w:eastAsia="Calibri" w:hAnsi="Calibri"/>
-        </w:rPr>
-        <w:t xml:space="preserve">Review customer organizations and their licenses</w:t>
-      </w:r>
-    </w:p>
-    <w:p>
-      <w:pPr>
-        <w:pStyle w:val="ListParagraph"/>
-        <w:numPr>
-          <w:ilvl w:val="0"/>
-          <w:numId w:val="2"/>
-        </w:numPr>
-        <w:spacing w:after="60"/>
-      </w:pPr>
-      <w:r>
-        <w:rPr>
-          <w:rFonts w:ascii="Calibri" w:cs="Calibri" w:eastAsia="Calibri" w:hAnsi="Calibri"/>
-        </w:rPr>
-        <w:t xml:space="preserve">Maintain the licensing table</w:t>
-      </w:r>
-    </w:p>
-    <w:p>
-      <w:pPr>
-        <w:pStyle w:val="ListParagraph"/>
-        <w:numPr>
-          <w:ilvl w:val="0"/>
-          <w:numId w:val="2"/>
-        </w:numPr>
-        <w:spacing w:after="60"/>
-      </w:pPr>
-      <w:r>
-        <w:rPr>
-          <w:rFonts w:ascii="Calibri" w:cs="Calibri" w:eastAsia="Calibri" w:hAnsi="Calibri"/>
-        </w:rPr>
-        <w:t xml:space="preserve">Monitor system load, availability, background jobs, integrations, logs, and errors</w:t>
-      </w:r>
-    </w:p>
-    <w:p>
-      <w:pPr>
-        <w:pStyle w:val="ListParagraph"/>
-        <w:numPr>
-          <w:ilvl w:val="0"/>
-          <w:numId w:val="2"/>
-        </w:numPr>
-        <w:spacing w:after="60"/>
-      </w:pPr>
-      <w:r>
-        <w:rPr>
-          <w:rFonts w:ascii="Calibri" w:cs="Calibri" w:eastAsia="Calibri" w:hAnsi="Calibri"/>
-        </w:rPr>
-        <w:t xml:space="preserve">Investigate incidents using masked operational data and correlation identifiers</w:t>
-      </w:r>
-    </w:p>
-    <w:p>
-      <w:pPr>
-        <w:pStyle w:val="ListParagraph"/>
-        <w:numPr>
-          <w:ilvl w:val="0"/>
-          <w:numId w:val="2"/>
-        </w:numPr>
-        <w:spacing w:after="60"/>
-      </w:pPr>
-      <w:r>
-        <w:rPr>
-          <w:rFonts w:ascii="Calibri" w:cs="Calibri" w:eastAsia="Calibri" w:hAnsi="Calibri"/>
-        </w:rPr>
-        <w:t xml:space="preserve">Use approved, time-bound support access only when necessary (Section 8.10)</w:t>
-      </w:r>
-    </w:p>
-    <w:p>
-      <w:pPr>
-        <w:pStyle w:val="ListParagraph"/>
-        <w:numPr>
-          <w:ilvl w:val="0"/>
-          <w:numId w:val="2"/>
-        </w:numPr>
-        <w:spacing w:after="60"/>
-      </w:pPr>
-      <w:r>
-        <w:rPr>
-          <w:rFonts w:ascii="Calibri" w:cs="Calibri" w:eastAsia="Calibri" w:hAnsi="Calibri"/>
-        </w:rPr>
-        <w:t xml:space="preserve">Apply authorized entitlement, configuration, or account-status changes</w:t>
-      </w:r>
-    </w:p>
-    <w:p>
-      <w:r>
-        <w:br w:type="page"/>
-      </w:r>
-    </w:p>
-    <w:p>
-      <w:pPr>
-        <w:spacing w:after="120" w:before="200" w:line="240" w:lineRule="auto"/>
+        <w:t xml:space="preserve">7.1 Therapist</w:t>
+      </w:r>
+    </w:p>
+    <w:p>
+      <w:pPr>
+        <w:pStyle w:val="Heading3"/>
+        <w:spacing w:after="60" w:before="160"/>
+      </w:pPr>
+      <w:r>
+        <w:rPr>
+          <w:rFonts w:ascii="Calibri" w:cs="Calibri" w:eastAsia="Calibri" w:hAnsi="Calibri"/>
+        </w:rPr>
+        <w:t xml:space="preserve">Running a session</w:t>
+      </w:r>
+    </w:p>
+    <w:p>
+      <w:pPr>
+        <w:keepNext/>
+        <w:spacing w:after="80" w:before="160" w:line="240" w:lineRule="auto"/>
         <w:jc w:val="center"/>
       </w:pPr>
       <w:r>
         <w:drawing>
           <wp:inline distT="0" distB="0" distL="0" distR="0">
-            <wp:extent cx="2667000" cy="5781675"/>
+            <wp:extent cx="4762500" cy="4276725"/>
             <wp:effectExtent t="0" r="0" b="0" l="0"/>
             <wp:docPr id="1" name="" descr="" title=""/>
             <wp:cNvGraphicFramePr>
@@ -2141,7 +1676,7 @@
                   <pic:spPr bwMode="auto">
                     <a:xfrm>
                       <a:off x="0" y="0"/>
-                      <a:ext cx="2667000" cy="5781675"/>
+                      <a:ext cx="4762500" cy="4276725"/>
                     </a:xfrm>
                     <a:prstGeom prst="rect">
                       <a:avLst/>
@@ -2156,6 +1691,7 @@
     </w:p>
     <w:p>
       <w:pPr>
+        <w:spacing w:after="200"/>
         <w:jc w:val="center"/>
       </w:pPr>
       <w:r>
@@ -2167,7 +1703,1122 @@
           <w:sz w:val="18"/>
           <w:szCs w:val="18"/>
         </w:rPr>
-        <w:t xml:space="preserve">Figure 1. Users &amp; Workflows</w:t>
+        <w:t xml:space="preserve">Figure 1. Therapist: running a session</w:t>
+      </w:r>
+    </w:p>
+    <w:p>
+      <w:pPr>
+        <w:pStyle w:val="ListParagraph"/>
+        <w:numPr>
+          <w:ilvl w:val="0"/>
+          <w:numId w:val="3"/>
+        </w:numPr>
+        <w:spacing w:after="60"/>
+      </w:pPr>
+      <w:r>
+        <w:rPr>
+          <w:rFonts w:ascii="Calibri" w:cs="Calibri" w:eastAsia="Calibri" w:hAnsi="Calibri"/>
+        </w:rPr>
+        <w:t xml:space="preserve">Select a scheduled session from the dashboard</w:t>
+      </w:r>
+    </w:p>
+    <w:p>
+      <w:pPr>
+        <w:pStyle w:val="ListParagraph"/>
+        <w:numPr>
+          <w:ilvl w:val="0"/>
+          <w:numId w:val="3"/>
+        </w:numPr>
+        <w:spacing w:after="60"/>
+      </w:pPr>
+      <w:r>
+        <w:rPr>
+          <w:rFonts w:ascii="Calibri" w:cs="Calibri" w:eastAsia="Calibri" w:hAnsi="Calibri"/>
+        </w:rPr>
+        <w:t xml:space="preserve">The platform checks consent automatically. Without wearable consent, an in-person session runs with manual notes only and no device data; a telehealth session cannot start without telehealth consent</w:t>
+      </w:r>
+    </w:p>
+    <w:p>
+      <w:pPr>
+        <w:pStyle w:val="ListParagraph"/>
+        <w:numPr>
+          <w:ilvl w:val="0"/>
+          <w:numId w:val="3"/>
+        </w:numPr>
+        <w:spacing w:after="60"/>
+      </w:pPr>
+      <w:r>
+        <w:rPr>
+          <w:rFonts w:ascii="Calibri" w:cs="Calibri" w:eastAsia="Calibri" w:hAnsi="Calibri"/>
+        </w:rPr>
+        <w:t xml:space="preserve">In person: the wearable is synced to the session. Telehealth: the video session starts; live soft alerts are not used in telehealth</w:t>
+      </w:r>
+    </w:p>
+    <w:p>
+      <w:pPr>
+        <w:pStyle w:val="ListParagraph"/>
+        <w:numPr>
+          <w:ilvl w:val="0"/>
+          <w:numId w:val="3"/>
+        </w:numPr>
+        <w:spacing w:after="60"/>
+      </w:pPr>
+      <w:r>
+        <w:rPr>
+          <w:rFonts w:ascii="Calibri" w:cs="Calibri" w:eastAsia="Calibri" w:hAnsi="Calibri"/>
+        </w:rPr>
+        <w:t xml:space="preserve">During the live session, indicators show trends and the age of their data</w:t>
+      </w:r>
+    </w:p>
+    <w:p>
+      <w:pPr>
+        <w:pStyle w:val="ListParagraph"/>
+        <w:numPr>
+          <w:ilvl w:val="0"/>
+          <w:numId w:val="3"/>
+        </w:numPr>
+        <w:spacing w:after="60"/>
+      </w:pPr>
+      <w:r>
+        <w:rPr>
+          <w:rFonts w:ascii="Calibri" w:cs="Calibri" w:eastAsia="Calibri" w:hAnsi="Calibri"/>
+        </w:rPr>
+        <w:t xml:space="preserve">Soft alerts (in person only) appear from the notification queue; the therapist acknowledges them</w:t>
+      </w:r>
+    </w:p>
+    <w:p>
+      <w:pPr>
+        <w:pStyle w:val="ListParagraph"/>
+        <w:numPr>
+          <w:ilvl w:val="0"/>
+          <w:numId w:val="3"/>
+        </w:numPr>
+        <w:spacing w:after="60"/>
+      </w:pPr>
+      <w:r>
+        <w:rPr>
+          <w:rFonts w:ascii="Calibri" w:cs="Calibri" w:eastAsia="Calibri" w:hAnsi="Calibri"/>
+        </w:rPr>
+        <w:t xml:space="preserve">Notes and markers can be added at any time</w:t>
+      </w:r>
+    </w:p>
+    <w:p>
+      <w:pPr>
+        <w:pStyle w:val="ListParagraph"/>
+        <w:numPr>
+          <w:ilvl w:val="0"/>
+          <w:numId w:val="3"/>
+        </w:numPr>
+        <w:spacing w:after="60"/>
+      </w:pPr>
+      <w:r>
+        <w:rPr>
+          <w:rFonts w:ascii="Calibri" w:cs="Calibri" w:eastAsia="Calibri" w:hAnsi="Calibri"/>
+        </w:rPr>
+        <w:t xml:space="preserve">The therapist ends the session, or it ends automatically when the scheduled window closes; unacknowledged alerts expire</w:t>
+      </w:r>
+    </w:p>
+    <w:p>
+      <w:pPr>
+        <w:pStyle w:val="Heading3"/>
+        <w:spacing w:after="60" w:before="160"/>
+      </w:pPr>
+      <w:r>
+        <w:rPr>
+          <w:rFonts w:ascii="Calibri" w:cs="Calibri" w:eastAsia="Calibri" w:hAnsi="Calibri"/>
+        </w:rPr>
+        <w:t xml:space="preserve">Completing the session summary</w:t>
+      </w:r>
+    </w:p>
+    <w:p>
+      <w:pPr>
+        <w:keepNext/>
+        <w:spacing w:after="80" w:before="160" w:line="240" w:lineRule="auto"/>
+        <w:jc w:val="center"/>
+      </w:pPr>
+      <w:r>
+        <w:drawing>
+          <wp:inline distT="0" distB="0" distL="0" distR="0">
+            <wp:extent cx="4762500" cy="3924300"/>
+            <wp:effectExtent t="0" r="0" b="0" l="0"/>
+            <wp:docPr id="1" name="" descr="" title=""/>
+            <wp:cNvGraphicFramePr>
+              <a:graphicFrameLocks xmlns:a="http://schemas.openxmlformats.org/drawingml/2006/main" noChangeAspect="1"/>
+            </wp:cNvGraphicFramePr>
+            <a:graphic xmlns:a="http://schemas.openxmlformats.org/drawingml/2006/main">
+              <a:graphicData uri="http://schemas.openxmlformats.org/drawingml/2006/picture">
+                <pic:pic xmlns:pic="http://schemas.openxmlformats.org/drawingml/2006/picture">
+                  <pic:nvPicPr>
+                    <pic:cNvPr id="0" name="" descr=""/>
+                    <pic:cNvPicPr>
+                      <a:picLocks noChangeAspect="1" noChangeArrowheads="1"/>
+                    </pic:cNvPicPr>
+                  </pic:nvPicPr>
+                  <pic:blipFill>
+                    <a:blip r:embed="rId9" cstate="none"/>
+                    <a:srcRect/>
+                    <a:stretch>
+                      <a:fillRect/>
+                    </a:stretch>
+                  </pic:blipFill>
+                  <pic:spPr bwMode="auto">
+                    <a:xfrm>
+                      <a:off x="0" y="0"/>
+                      <a:ext cx="4762500" cy="3924300"/>
+                    </a:xfrm>
+                    <a:prstGeom prst="rect">
+                      <a:avLst/>
+                    </a:prstGeom>
+                  </pic:spPr>
+                </pic:pic>
+              </a:graphicData>
+            </a:graphic>
+          </wp:inline>
+        </w:drawing>
+      </w:r>
+    </w:p>
+    <w:p>
+      <w:pPr>
+        <w:spacing w:after="200"/>
+        <w:jc w:val="center"/>
+      </w:pPr>
+      <w:r>
+        <w:rPr>
+          <w:rFonts w:ascii="Calibri" w:cs="Calibri" w:eastAsia="Calibri" w:hAnsi="Calibri"/>
+          <w:i/>
+          <w:iCs/>
+          <w:color w:val="595959"/>
+          <w:sz w:val="18"/>
+          <w:szCs w:val="18"/>
+        </w:rPr>
+        <w:t xml:space="preserve">Figure 2. Therapist: completing the session summary</w:t>
+      </w:r>
+    </w:p>
+    <w:p>
+      <w:pPr>
+        <w:pStyle w:val="ListParagraph"/>
+        <w:numPr>
+          <w:ilvl w:val="0"/>
+          <w:numId w:val="4"/>
+        </w:numPr>
+        <w:spacing w:after="60"/>
+      </w:pPr>
+      <w:r>
+        <w:rPr>
+          <w:rFonts w:ascii="Calibri" w:cs="Calibri" w:eastAsia="Calibri" w:hAnsi="Calibri"/>
+        </w:rPr>
+        <w:t xml:space="preserve">When the session ends, session data is sent to the external AI summary service and the screen shows that the summary is being generated</w:t>
+      </w:r>
+    </w:p>
+    <w:p>
+      <w:pPr>
+        <w:pStyle w:val="ListParagraph"/>
+        <w:numPr>
+          <w:ilvl w:val="0"/>
+          <w:numId w:val="4"/>
+        </w:numPr>
+        <w:spacing w:after="60"/>
+      </w:pPr>
+      <w:r>
+        <w:rPr>
+          <w:rFonts w:ascii="Calibri" w:cs="Calibri" w:eastAsia="Calibri" w:hAnsi="Calibri"/>
+        </w:rPr>
+        <w:t xml:space="preserve">If a draft is returned, it is shown labeled as AI-generated for the therapist to review</w:t>
+      </w:r>
+    </w:p>
+    <w:p>
+      <w:pPr>
+        <w:pStyle w:val="ListParagraph"/>
+        <w:numPr>
+          <w:ilvl w:val="0"/>
+          <w:numId w:val="4"/>
+        </w:numPr>
+        <w:spacing w:after="60"/>
+      </w:pPr>
+      <w:r>
+        <w:rPr>
+          <w:rFonts w:ascii="Calibri" w:cs="Calibri" w:eastAsia="Calibri" w:hAnsi="Calibri"/>
+        </w:rPr>
+        <w:t xml:space="preserve">If generation fails or times out, the therapist can retry (no limit) or write the summary manually</w:t>
+      </w:r>
+    </w:p>
+    <w:p>
+      <w:pPr>
+        <w:pStyle w:val="ListParagraph"/>
+        <w:numPr>
+          <w:ilvl w:val="0"/>
+          <w:numId w:val="4"/>
+        </w:numPr>
+        <w:spacing w:after="60"/>
+      </w:pPr>
+      <w:r>
+        <w:rPr>
+          <w:rFonts w:ascii="Calibri" w:cs="Calibri" w:eastAsia="Calibri" w:hAnsi="Calibri"/>
+        </w:rPr>
+        <w:t xml:space="preserve">The therapist edits and confirms the summary</w:t>
+      </w:r>
+    </w:p>
+    <w:p>
+      <w:pPr>
+        <w:pStyle w:val="ListParagraph"/>
+        <w:numPr>
+          <w:ilvl w:val="0"/>
+          <w:numId w:val="4"/>
+        </w:numPr>
+        <w:spacing w:after="60"/>
+      </w:pPr>
+      <w:r>
+        <w:rPr>
+          <w:rFonts w:ascii="Calibri" w:cs="Calibri" w:eastAsia="Calibri" w:hAnsi="Calibri"/>
+        </w:rPr>
+        <w:t xml:space="preserve">The confirmed summary is saved to the session record and becomes visible to the supervisor; unconfirmed drafts are never shown to supervisors</w:t>
+      </w:r>
+    </w:p>
+    <w:p>
+      <w:pPr>
+        <w:pStyle w:val="Heading2"/>
+        <w:spacing w:after="80" w:before="240"/>
+      </w:pPr>
+      <w:r>
+        <w:rPr>
+          <w:rFonts w:ascii="Calibri" w:cs="Calibri" w:eastAsia="Calibri" w:hAnsi="Calibri"/>
+        </w:rPr>
+        <w:t xml:space="preserve">7.2 Supervisor</w:t>
+      </w:r>
+    </w:p>
+    <w:p>
+      <w:pPr>
+        <w:keepNext/>
+        <w:spacing w:after="80" w:before="160" w:line="240" w:lineRule="auto"/>
+        <w:jc w:val="center"/>
+      </w:pPr>
+      <w:r>
+        <w:drawing>
+          <wp:inline distT="0" distB="0" distL="0" distR="0">
+            <wp:extent cx="4762500" cy="4057650"/>
+            <wp:effectExtent t="0" r="0" b="0" l="0"/>
+            <wp:docPr id="1" name="" descr="" title=""/>
+            <wp:cNvGraphicFramePr>
+              <a:graphicFrameLocks xmlns:a="http://schemas.openxmlformats.org/drawingml/2006/main" noChangeAspect="1"/>
+            </wp:cNvGraphicFramePr>
+            <a:graphic xmlns:a="http://schemas.openxmlformats.org/drawingml/2006/main">
+              <a:graphicData uri="http://schemas.openxmlformats.org/drawingml/2006/picture">
+                <pic:pic xmlns:pic="http://schemas.openxmlformats.org/drawingml/2006/picture">
+                  <pic:nvPicPr>
+                    <pic:cNvPr id="0" name="" descr=""/>
+                    <pic:cNvPicPr>
+                      <a:picLocks noChangeAspect="1" noChangeArrowheads="1"/>
+                    </pic:cNvPicPr>
+                  </pic:nvPicPr>
+                  <pic:blipFill>
+                    <a:blip r:embed="rId10" cstate="none"/>
+                    <a:srcRect/>
+                    <a:stretch>
+                      <a:fillRect/>
+                    </a:stretch>
+                  </pic:blipFill>
+                  <pic:spPr bwMode="auto">
+                    <a:xfrm>
+                      <a:off x="0" y="0"/>
+                      <a:ext cx="4762500" cy="4057650"/>
+                    </a:xfrm>
+                    <a:prstGeom prst="rect">
+                      <a:avLst/>
+                    </a:prstGeom>
+                  </pic:spPr>
+                </pic:pic>
+              </a:graphicData>
+            </a:graphic>
+          </wp:inline>
+        </w:drawing>
+      </w:r>
+    </w:p>
+    <w:p>
+      <w:pPr>
+        <w:spacing w:after="200"/>
+        <w:jc w:val="center"/>
+      </w:pPr>
+      <w:r>
+        <w:rPr>
+          <w:rFonts w:ascii="Calibri" w:cs="Calibri" w:eastAsia="Calibri" w:hAnsi="Calibri"/>
+          <w:i/>
+          <w:iCs/>
+          <w:color w:val="595959"/>
+          <w:sz w:val="18"/>
+          <w:szCs w:val="18"/>
+        </w:rPr>
+        <w:t xml:space="preserve">Figure 3. Supervisor: reviewing sessions</w:t>
+      </w:r>
+    </w:p>
+    <w:p>
+      <w:pPr>
+        <w:pStyle w:val="ListParagraph"/>
+        <w:numPr>
+          <w:ilvl w:val="0"/>
+          <w:numId w:val="5"/>
+        </w:numPr>
+        <w:spacing w:after="60"/>
+      </w:pPr>
+      <w:r>
+        <w:rPr>
+          <w:rFonts w:ascii="Calibri" w:cs="Calibri" w:eastAsia="Calibri" w:hAnsi="Calibri"/>
+        </w:rPr>
+        <w:t xml:space="preserve">Open the caseload dashboard showing assigned therapists and clients</w:t>
+      </w:r>
+    </w:p>
+    <w:p>
+      <w:pPr>
+        <w:pStyle w:val="ListParagraph"/>
+        <w:numPr>
+          <w:ilvl w:val="0"/>
+          <w:numId w:val="5"/>
+        </w:numPr>
+        <w:spacing w:after="60"/>
+      </w:pPr>
+      <w:r>
+        <w:rPr>
+          <w:rFonts w:ascii="Calibri" w:cs="Calibri" w:eastAsia="Calibri" w:hAnsi="Calibri"/>
+        </w:rPr>
+        <w:t xml:space="preserve">Work through flagged sessions: sessions with alerts, most alerts first</w:t>
+      </w:r>
+    </w:p>
+    <w:p>
+      <w:pPr>
+        <w:pStyle w:val="ListParagraph"/>
+        <w:numPr>
+          <w:ilvl w:val="0"/>
+          <w:numId w:val="5"/>
+        </w:numPr>
+        <w:spacing w:after="60"/>
+      </w:pPr>
+      <w:r>
+        <w:rPr>
+          <w:rFonts w:ascii="Calibri" w:cs="Calibri" w:eastAsia="Calibri" w:hAnsi="Calibri"/>
+        </w:rPr>
+        <w:t xml:space="preserve">Open a session to see its summary, timeline, and trends</w:t>
+      </w:r>
+    </w:p>
+    <w:p>
+      <w:pPr>
+        <w:pStyle w:val="ListParagraph"/>
+        <w:numPr>
+          <w:ilvl w:val="0"/>
+          <w:numId w:val="5"/>
+        </w:numPr>
+        <w:spacing w:after="60"/>
+      </w:pPr>
+      <w:r>
+        <w:rPr>
+          <w:rFonts w:ascii="Calibri" w:cs="Calibri" w:eastAsia="Calibri" w:hAnsi="Calibri"/>
+        </w:rPr>
+        <w:t xml:space="preserve">If the summary is not yet confirmed, the session shows as summary pending and the supervisor can send the therapist a reminder</w:t>
+      </w:r>
+    </w:p>
+    <w:p>
+      <w:pPr>
+        <w:pStyle w:val="ListParagraph"/>
+        <w:numPr>
+          <w:ilvl w:val="0"/>
+          <w:numId w:val="5"/>
+        </w:numPr>
+        <w:spacing w:after="60"/>
+      </w:pPr>
+      <w:r>
+        <w:rPr>
+          <w:rFonts w:ascii="Calibri" w:cs="Calibri" w:eastAsia="Calibri" w:hAnsi="Calibri"/>
+        </w:rPr>
+        <w:t xml:space="preserve">If the summary is confirmed, the supervisor can, in any order: compare sessions side by side; approve documentation where permitted; add a review note or follow-up task, which appears in the therapist’s pending tasks</w:t>
+      </w:r>
+    </w:p>
+    <w:p>
+      <w:pPr>
+        <w:pStyle w:val="ListParagraph"/>
+        <w:numPr>
+          <w:ilvl w:val="0"/>
+          <w:numId w:val="5"/>
+        </w:numPr>
+        <w:spacing w:after="60"/>
+      </w:pPr>
+      <w:r>
+        <w:rPr>
+          <w:rFonts w:ascii="Calibri" w:cs="Calibri" w:eastAsia="Calibri" w:hAnsi="Calibri"/>
+        </w:rPr>
+        <w:t xml:space="preserve">Mark the session as reviewed; this is logged for audit</w:t>
+      </w:r>
+    </w:p>
+    <w:p>
+      <w:pPr>
+        <w:pStyle w:val="Heading2"/>
+        <w:spacing w:after="80" w:before="240"/>
+      </w:pPr>
+      <w:r>
+        <w:rPr>
+          <w:rFonts w:ascii="Calibri" w:cs="Calibri" w:eastAsia="Calibri" w:hAnsi="Calibri"/>
+        </w:rPr>
+        <w:t xml:space="preserve">7.3 Organization Admin / Clinic Manager</w:t>
+      </w:r>
+    </w:p>
+    <w:p>
+      <w:pPr>
+        <w:pStyle w:val="Heading3"/>
+        <w:spacing w:after="60" w:before="160"/>
+      </w:pPr>
+      <w:r>
+        <w:rPr>
+          <w:rFonts w:ascii="Calibri" w:cs="Calibri" w:eastAsia="Calibri" w:hAnsi="Calibri"/>
+        </w:rPr>
+        <w:t xml:space="preserve">Adding a user</w:t>
+      </w:r>
+    </w:p>
+    <w:p>
+      <w:pPr>
+        <w:keepNext/>
+        <w:spacing w:after="80" w:before="160" w:line="240" w:lineRule="auto"/>
+        <w:jc w:val="center"/>
+      </w:pPr>
+      <w:r>
+        <w:drawing>
+          <wp:inline distT="0" distB="0" distL="0" distR="0">
+            <wp:extent cx="4762500" cy="2657475"/>
+            <wp:effectExtent t="0" r="0" b="0" l="0"/>
+            <wp:docPr id="1" name="" descr="" title=""/>
+            <wp:cNvGraphicFramePr>
+              <a:graphicFrameLocks xmlns:a="http://schemas.openxmlformats.org/drawingml/2006/main" noChangeAspect="1"/>
+            </wp:cNvGraphicFramePr>
+            <a:graphic xmlns:a="http://schemas.openxmlformats.org/drawingml/2006/main">
+              <a:graphicData uri="http://schemas.openxmlformats.org/drawingml/2006/picture">
+                <pic:pic xmlns:pic="http://schemas.openxmlformats.org/drawingml/2006/picture">
+                  <pic:nvPicPr>
+                    <pic:cNvPr id="0" name="" descr=""/>
+                    <pic:cNvPicPr>
+                      <a:picLocks noChangeAspect="1" noChangeArrowheads="1"/>
+                    </pic:cNvPicPr>
+                  </pic:nvPicPr>
+                  <pic:blipFill>
+                    <a:blip r:embed="rId11" cstate="none"/>
+                    <a:srcRect/>
+                    <a:stretch>
+                      <a:fillRect/>
+                    </a:stretch>
+                  </pic:blipFill>
+                  <pic:spPr bwMode="auto">
+                    <a:xfrm>
+                      <a:off x="0" y="0"/>
+                      <a:ext cx="4762500" cy="2657475"/>
+                    </a:xfrm>
+                    <a:prstGeom prst="rect">
+                      <a:avLst/>
+                    </a:prstGeom>
+                  </pic:spPr>
+                </pic:pic>
+              </a:graphicData>
+            </a:graphic>
+          </wp:inline>
+        </w:drawing>
+      </w:r>
+    </w:p>
+    <w:p>
+      <w:pPr>
+        <w:spacing w:after="200"/>
+        <w:jc w:val="center"/>
+      </w:pPr>
+      <w:r>
+        <w:rPr>
+          <w:rFonts w:ascii="Calibri" w:cs="Calibri" w:eastAsia="Calibri" w:hAnsi="Calibri"/>
+          <w:i/>
+          <w:iCs/>
+          <w:color w:val="595959"/>
+          <w:sz w:val="18"/>
+          <w:szCs w:val="18"/>
+        </w:rPr>
+        <w:t xml:space="preserve">Figure 4. Organization Admin: adding a user</w:t>
+      </w:r>
+    </w:p>
+    <w:p>
+      <w:pPr>
+        <w:pStyle w:val="ListParagraph"/>
+        <w:numPr>
+          <w:ilvl w:val="0"/>
+          <w:numId w:val="6"/>
+        </w:numPr>
+        <w:spacing w:after="60"/>
+      </w:pPr>
+      <w:r>
+        <w:rPr>
+          <w:rFonts w:ascii="Calibri" w:cs="Calibri" w:eastAsia="Calibri" w:hAnsi="Calibri"/>
+        </w:rPr>
+        <w:t xml:space="preserve">Invite the user with their email and role</w:t>
+      </w:r>
+    </w:p>
+    <w:p>
+      <w:pPr>
+        <w:pStyle w:val="ListParagraph"/>
+        <w:numPr>
+          <w:ilvl w:val="0"/>
+          <w:numId w:val="6"/>
+        </w:numPr>
+        <w:spacing w:after="60"/>
+      </w:pPr>
+      <w:r>
+        <w:rPr>
+          <w:rFonts w:ascii="Calibri" w:cs="Calibri" w:eastAsia="Calibri" w:hAnsi="Calibri"/>
+        </w:rPr>
+        <w:t xml:space="preserve">The platform checks for a free seat on the organization’s license. If none is free, the admin asks BEST to add seats</w:t>
+      </w:r>
+    </w:p>
+    <w:p>
+      <w:pPr>
+        <w:pStyle w:val="ListParagraph"/>
+        <w:numPr>
+          <w:ilvl w:val="0"/>
+          <w:numId w:val="6"/>
+        </w:numPr>
+        <w:spacing w:after="60"/>
+      </w:pPr>
+      <w:r>
+        <w:rPr>
+          <w:rFonts w:ascii="Calibri" w:cs="Calibri" w:eastAsia="Calibri" w:hAnsi="Calibri"/>
+        </w:rPr>
+        <w:t xml:space="preserve">The user accepts the invite and sets a password (MFA is mandatory for Organization Admin and BEST roles)</w:t>
+      </w:r>
+    </w:p>
+    <w:p>
+      <w:pPr>
+        <w:pStyle w:val="ListParagraph"/>
+        <w:numPr>
+          <w:ilvl w:val="0"/>
+          <w:numId w:val="6"/>
+        </w:numPr>
+        <w:spacing w:after="60"/>
+      </w:pPr>
+      <w:r>
+        <w:rPr>
+          <w:rFonts w:ascii="Calibri" w:cs="Calibri" w:eastAsia="Calibri" w:hAnsi="Calibri"/>
+        </w:rPr>
+        <w:t xml:space="preserve">The account becomes active and the seat is used; a pending invite does not use a seat</w:t>
+      </w:r>
+    </w:p>
+    <w:p>
+      <w:pPr>
+        <w:pStyle w:val="Heading3"/>
+        <w:spacing w:after="60" w:before="160"/>
+      </w:pPr>
+      <w:r>
+        <w:rPr>
+          <w:rFonts w:ascii="Calibri" w:cs="Calibri" w:eastAsia="Calibri" w:hAnsi="Calibri"/>
+        </w:rPr>
+        <w:t xml:space="preserve">Adding a client</w:t>
+      </w:r>
+    </w:p>
+    <w:p>
+      <w:pPr>
+        <w:keepNext/>
+        <w:spacing w:after="80" w:before="160" w:line="240" w:lineRule="auto"/>
+        <w:jc w:val="center"/>
+      </w:pPr>
+      <w:r>
+        <w:drawing>
+          <wp:inline distT="0" distB="0" distL="0" distR="0">
+            <wp:extent cx="4762500" cy="3295650"/>
+            <wp:effectExtent t="0" r="0" b="0" l="0"/>
+            <wp:docPr id="1" name="" descr="" title=""/>
+            <wp:cNvGraphicFramePr>
+              <a:graphicFrameLocks xmlns:a="http://schemas.openxmlformats.org/drawingml/2006/main" noChangeAspect="1"/>
+            </wp:cNvGraphicFramePr>
+            <a:graphic xmlns:a="http://schemas.openxmlformats.org/drawingml/2006/main">
+              <a:graphicData uri="http://schemas.openxmlformats.org/drawingml/2006/picture">
+                <pic:pic xmlns:pic="http://schemas.openxmlformats.org/drawingml/2006/picture">
+                  <pic:nvPicPr>
+                    <pic:cNvPr id="0" name="" descr=""/>
+                    <pic:cNvPicPr>
+                      <a:picLocks noChangeAspect="1" noChangeArrowheads="1"/>
+                    </pic:cNvPicPr>
+                  </pic:nvPicPr>
+                  <pic:blipFill>
+                    <a:blip r:embed="rId12" cstate="none"/>
+                    <a:srcRect/>
+                    <a:stretch>
+                      <a:fillRect/>
+                    </a:stretch>
+                  </pic:blipFill>
+                  <pic:spPr bwMode="auto">
+                    <a:xfrm>
+                      <a:off x="0" y="0"/>
+                      <a:ext cx="4762500" cy="3295650"/>
+                    </a:xfrm>
+                    <a:prstGeom prst="rect">
+                      <a:avLst/>
+                    </a:prstGeom>
+                  </pic:spPr>
+                </pic:pic>
+              </a:graphicData>
+            </a:graphic>
+          </wp:inline>
+        </w:drawing>
+      </w:r>
+    </w:p>
+    <w:p>
+      <w:pPr>
+        <w:spacing w:after="200"/>
+        <w:jc w:val="center"/>
+      </w:pPr>
+      <w:r>
+        <w:rPr>
+          <w:rFonts w:ascii="Calibri" w:cs="Calibri" w:eastAsia="Calibri" w:hAnsi="Calibri"/>
+          <w:i/>
+          <w:iCs/>
+          <w:color w:val="595959"/>
+          <w:sz w:val="18"/>
+          <w:szCs w:val="18"/>
+        </w:rPr>
+        <w:t xml:space="preserve">Figure 5. Organization Admin: adding a client</w:t>
+      </w:r>
+    </w:p>
+    <w:p>
+      <w:pPr>
+        <w:pStyle w:val="ListParagraph"/>
+        <w:numPr>
+          <w:ilvl w:val="0"/>
+          <w:numId w:val="7"/>
+        </w:numPr>
+        <w:spacing w:after="60"/>
+      </w:pPr>
+      <w:r>
+        <w:rPr>
+          <w:rFonts w:ascii="Calibri" w:cs="Calibri" w:eastAsia="Calibri" w:hAnsi="Calibri"/>
+        </w:rPr>
+        <w:t xml:space="preserve">Add the client profile and location</w:t>
+      </w:r>
+    </w:p>
+    <w:p>
+      <w:pPr>
+        <w:pStyle w:val="ListParagraph"/>
+        <w:numPr>
+          <w:ilvl w:val="0"/>
+          <w:numId w:val="7"/>
+        </w:numPr>
+        <w:spacing w:after="60"/>
+      </w:pPr>
+      <w:r>
+        <w:rPr>
+          <w:rFonts w:ascii="Calibri" w:cs="Calibri" w:eastAsia="Calibri" w:hAnsi="Calibri"/>
+        </w:rPr>
+        <w:t xml:space="preserve">Record the consent signed with clinic staff</w:t>
+      </w:r>
+    </w:p>
+    <w:p>
+      <w:pPr>
+        <w:pStyle w:val="ListParagraph"/>
+        <w:numPr>
+          <w:ilvl w:val="0"/>
+          <w:numId w:val="7"/>
+        </w:numPr>
+        <w:spacing w:after="60"/>
+      </w:pPr>
+      <w:r>
+        <w:rPr>
+          <w:rFonts w:ascii="Calibri" w:cs="Calibri" w:eastAsia="Calibri" w:hAnsi="Calibri"/>
+        </w:rPr>
+        <w:t xml:space="preserve">The platform checks the recorded consent. Without wearable consent, sessions are manual only; without telehealth consent, telehealth sessions cannot start</w:t>
+      </w:r>
+    </w:p>
+    <w:p>
+      <w:pPr>
+        <w:pStyle w:val="ListParagraph"/>
+        <w:numPr>
+          <w:ilvl w:val="0"/>
+          <w:numId w:val="7"/>
+        </w:numPr>
+        <w:spacing w:after="60"/>
+      </w:pPr>
+      <w:r>
+        <w:rPr>
+          <w:rFonts w:ascii="Calibri" w:cs="Calibri" w:eastAsia="Calibri" w:hAnsi="Calibri"/>
+        </w:rPr>
+        <w:t xml:space="preserve">Assign the care team: therapist and supervisor</w:t>
+      </w:r>
+    </w:p>
+    <w:p>
+      <w:pPr>
+        <w:pStyle w:val="ListParagraph"/>
+        <w:numPr>
+          <w:ilvl w:val="0"/>
+          <w:numId w:val="7"/>
+        </w:numPr>
+        <w:spacing w:after="60"/>
+      </w:pPr>
+      <w:r>
+        <w:rPr>
+          <w:rFonts w:ascii="Calibri" w:cs="Calibri" w:eastAsia="Calibri" w:hAnsi="Calibri"/>
+        </w:rPr>
+        <w:t xml:space="preserve">Schedule sessions in-app or by CSV import</w:t>
+      </w:r>
+    </w:p>
+    <w:p>
+      <w:pPr>
+        <w:spacing w:after="120"/>
+      </w:pPr>
+      <w:r>
+        <w:rPr>
+          <w:rFonts w:ascii="Calibri" w:cs="Calibri" w:eastAsia="Calibri" w:hAnsi="Calibri"/>
+        </w:rPr>
+        <w:t xml:space="preserve">Deactivating a user frees their seat. Archiving a client hides them from active workflows. Withdrawing consent makes later sessions manual only and blocks telehealth.</w:t>
+      </w:r>
+    </w:p>
+    <w:p>
+      <w:pPr>
+        <w:pStyle w:val="Heading2"/>
+        <w:spacing w:after="80" w:before="240"/>
+      </w:pPr>
+      <w:r>
+        <w:rPr>
+          <w:rFonts w:ascii="Calibri" w:cs="Calibri" w:eastAsia="Calibri" w:hAnsi="Calibri"/>
+        </w:rPr>
+        <w:t xml:space="preserve">7.4 BEST Back Office</w:t>
+      </w:r>
+    </w:p>
+    <w:p>
+      <w:pPr>
+        <w:pStyle w:val="Heading3"/>
+        <w:spacing w:after="60" w:before="160"/>
+      </w:pPr>
+      <w:r>
+        <w:rPr>
+          <w:rFonts w:ascii="Calibri" w:cs="Calibri" w:eastAsia="Calibri" w:hAnsi="Calibri"/>
+        </w:rPr>
+        <w:t xml:space="preserve">License lifecycle</w:t>
+      </w:r>
+    </w:p>
+    <w:p>
+      <w:pPr>
+        <w:keepNext/>
+        <w:spacing w:after="80" w:before="160" w:line="240" w:lineRule="auto"/>
+        <w:jc w:val="center"/>
+      </w:pPr>
+      <w:r>
+        <w:drawing>
+          <wp:inline distT="0" distB="0" distL="0" distR="0">
+            <wp:extent cx="4762500" cy="3429000"/>
+            <wp:effectExtent t="0" r="0" b="0" l="0"/>
+            <wp:docPr id="1" name="" descr="" title=""/>
+            <wp:cNvGraphicFramePr>
+              <a:graphicFrameLocks xmlns:a="http://schemas.openxmlformats.org/drawingml/2006/main" noChangeAspect="1"/>
+            </wp:cNvGraphicFramePr>
+            <a:graphic xmlns:a="http://schemas.openxmlformats.org/drawingml/2006/main">
+              <a:graphicData uri="http://schemas.openxmlformats.org/drawingml/2006/picture">
+                <pic:pic xmlns:pic="http://schemas.openxmlformats.org/drawingml/2006/picture">
+                  <pic:nvPicPr>
+                    <pic:cNvPr id="0" name="" descr=""/>
+                    <pic:cNvPicPr>
+                      <a:picLocks noChangeAspect="1" noChangeArrowheads="1"/>
+                    </pic:cNvPicPr>
+                  </pic:nvPicPr>
+                  <pic:blipFill>
+                    <a:blip r:embed="rId13" cstate="none"/>
+                    <a:srcRect/>
+                    <a:stretch>
+                      <a:fillRect/>
+                    </a:stretch>
+                  </pic:blipFill>
+                  <pic:spPr bwMode="auto">
+                    <a:xfrm>
+                      <a:off x="0" y="0"/>
+                      <a:ext cx="4762500" cy="3429000"/>
+                    </a:xfrm>
+                    <a:prstGeom prst="rect">
+                      <a:avLst/>
+                    </a:prstGeom>
+                  </pic:spPr>
+                </pic:pic>
+              </a:graphicData>
+            </a:graphic>
+          </wp:inline>
+        </w:drawing>
+      </w:r>
+    </w:p>
+    <w:p>
+      <w:pPr>
+        <w:spacing w:after="200"/>
+        <w:jc w:val="center"/>
+      </w:pPr>
+      <w:r>
+        <w:rPr>
+          <w:rFonts w:ascii="Calibri" w:cs="Calibri" w:eastAsia="Calibri" w:hAnsi="Calibri"/>
+          <w:i/>
+          <w:iCs/>
+          <w:color w:val="595959"/>
+          <w:sz w:val="18"/>
+          <w:szCs w:val="18"/>
+        </w:rPr>
+        <w:t xml:space="preserve">Figure 6. BEST Platform Admin: license lifecycle</w:t>
+      </w:r>
+    </w:p>
+    <w:p>
+      <w:pPr>
+        <w:pStyle w:val="ListParagraph"/>
+        <w:numPr>
+          <w:ilvl w:val="0"/>
+          <w:numId w:val="8"/>
+        </w:numPr>
+        <w:spacing w:after="60"/>
+      </w:pPr>
+      <w:r>
+        <w:rPr>
+          <w:rFonts w:ascii="Calibri" w:cs="Calibri" w:eastAsia="Calibri" w:hAnsi="Calibri"/>
+        </w:rPr>
+        <w:t xml:space="preserve">Onboard the customer organization</w:t>
+      </w:r>
+    </w:p>
+    <w:p>
+      <w:pPr>
+        <w:pStyle w:val="ListParagraph"/>
+        <w:numPr>
+          <w:ilvl w:val="0"/>
+          <w:numId w:val="8"/>
+        </w:numPr>
+        <w:spacing w:after="60"/>
+      </w:pPr>
+      <w:r>
+        <w:rPr>
+          <w:rFonts w:ascii="Calibri" w:cs="Calibri" w:eastAsia="Calibri" w:hAnsi="Calibri"/>
+        </w:rPr>
+        <w:t xml:space="preserve">Create its license: plan, seats, dates, and enabled features</w:t>
+      </w:r>
+    </w:p>
+    <w:p>
+      <w:pPr>
+        <w:pStyle w:val="ListParagraph"/>
+        <w:numPr>
+          <w:ilvl w:val="0"/>
+          <w:numId w:val="8"/>
+        </w:numPr>
+        <w:spacing w:after="60"/>
+      </w:pPr>
+      <w:r>
+        <w:rPr>
+          <w:rFonts w:ascii="Calibri" w:cs="Calibri" w:eastAsia="Calibri" w:hAnsi="Calibri"/>
+        </w:rPr>
+        <w:t xml:space="preserve">While the license is active, Organization Admins can invite users; Platform Admin can edit seats or features, or suspend the license</w:t>
+      </w:r>
+    </w:p>
+    <w:p>
+      <w:pPr>
+        <w:pStyle w:val="ListParagraph"/>
+        <w:numPr>
+          <w:ilvl w:val="0"/>
+          <w:numId w:val="8"/>
+        </w:numPr>
+        <w:spacing w:after="60"/>
+      </w:pPr>
+      <w:r>
+        <w:rPr>
+          <w:rFonts w:ascii="Calibri" w:cs="Calibri" w:eastAsia="Calibri" w:hAnsi="Calibri"/>
+        </w:rPr>
+        <w:t xml:space="preserve">Organization Admins receive a warning before the license end date (configurable; default 30 days)</w:t>
+      </w:r>
+    </w:p>
+    <w:p>
+      <w:pPr>
+        <w:pStyle w:val="ListParagraph"/>
+        <w:numPr>
+          <w:ilvl w:val="0"/>
+          <w:numId w:val="8"/>
+        </w:numPr>
+        <w:spacing w:after="60"/>
+      </w:pPr>
+      <w:r>
+        <w:rPr>
+          <w:rFonts w:ascii="Calibri" w:cs="Calibri" w:eastAsia="Calibri" w:hAnsi="Calibri"/>
+        </w:rPr>
+        <w:t xml:space="preserve">When the end date is reached, the license expires: no new sessions can start, users can still log in and view records, and no data is deleted. A suspended license has the same effect</w:t>
+      </w:r>
+    </w:p>
+    <w:p>
+      <w:pPr>
+        <w:pStyle w:val="ListParagraph"/>
+        <w:numPr>
+          <w:ilvl w:val="0"/>
+          <w:numId w:val="8"/>
+        </w:numPr>
+        <w:spacing w:after="60"/>
+      </w:pPr>
+      <w:r>
+        <w:rPr>
+          <w:rFonts w:ascii="Calibri" w:cs="Calibri" w:eastAsia="Calibri" w:hAnsi="Calibri"/>
+        </w:rPr>
+        <w:t xml:space="preserve">Platform Admin extends the license to return it to active</w:t>
+      </w:r>
+    </w:p>
+    <w:p>
+      <w:pPr>
+        <w:pStyle w:val="Heading3"/>
+        <w:spacing w:after="60" w:before="160"/>
+      </w:pPr>
+      <w:r>
+        <w:rPr>
+          <w:rFonts w:ascii="Calibri" w:cs="Calibri" w:eastAsia="Calibri" w:hAnsi="Calibri"/>
+        </w:rPr>
+        <w:t xml:space="preserve">Time-bound support access to clinical data (break-glass)</w:t>
+      </w:r>
+    </w:p>
+    <w:p>
+      <w:pPr>
+        <w:keepNext/>
+        <w:spacing w:after="80" w:before="160" w:line="240" w:lineRule="auto"/>
+        <w:jc w:val="center"/>
+      </w:pPr>
+      <w:r>
+        <w:drawing>
+          <wp:inline distT="0" distB="0" distL="0" distR="0">
+            <wp:extent cx="4762500" cy="3924300"/>
+            <wp:effectExtent t="0" r="0" b="0" l="0"/>
+            <wp:docPr id="1" name="" descr="" title=""/>
+            <wp:cNvGraphicFramePr>
+              <a:graphicFrameLocks xmlns:a="http://schemas.openxmlformats.org/drawingml/2006/main" noChangeAspect="1"/>
+            </wp:cNvGraphicFramePr>
+            <a:graphic xmlns:a="http://schemas.openxmlformats.org/drawingml/2006/main">
+              <a:graphicData uri="http://schemas.openxmlformats.org/drawingml/2006/picture">
+                <pic:pic xmlns:pic="http://schemas.openxmlformats.org/drawingml/2006/picture">
+                  <pic:nvPicPr>
+                    <pic:cNvPr id="0" name="" descr=""/>
+                    <pic:cNvPicPr>
+                      <a:picLocks noChangeAspect="1" noChangeArrowheads="1"/>
+                    </pic:cNvPicPr>
+                  </pic:nvPicPr>
+                  <pic:blipFill>
+                    <a:blip r:embed="rId14" cstate="none"/>
+                    <a:srcRect/>
+                    <a:stretch>
+                      <a:fillRect/>
+                    </a:stretch>
+                  </pic:blipFill>
+                  <pic:spPr bwMode="auto">
+                    <a:xfrm>
+                      <a:off x="0" y="0"/>
+                      <a:ext cx="4762500" cy="3924300"/>
+                    </a:xfrm>
+                    <a:prstGeom prst="rect">
+                      <a:avLst/>
+                    </a:prstGeom>
+                  </pic:spPr>
+                </pic:pic>
+              </a:graphicData>
+            </a:graphic>
+          </wp:inline>
+        </w:drawing>
+      </w:r>
+    </w:p>
+    <w:p>
+      <w:pPr>
+        <w:spacing w:after="200"/>
+        <w:jc w:val="center"/>
+      </w:pPr>
+      <w:r>
+        <w:rPr>
+          <w:rFonts w:ascii="Calibri" w:cs="Calibri" w:eastAsia="Calibri" w:hAnsi="Calibri"/>
+          <w:i/>
+          <w:iCs/>
+          <w:color w:val="595959"/>
+          <w:sz w:val="18"/>
+          <w:szCs w:val="18"/>
+        </w:rPr>
+        <w:t xml:space="preserve">Figure 7. BEST Back Office: break-glass access</w:t>
+      </w:r>
+    </w:p>
+    <w:p>
+      <w:pPr>
+        <w:pStyle w:val="ListParagraph"/>
+        <w:numPr>
+          <w:ilvl w:val="0"/>
+          <w:numId w:val="9"/>
+        </w:numPr>
+        <w:spacing w:after="60"/>
+      </w:pPr>
+      <w:r>
+        <w:rPr>
+          <w:rFonts w:ascii="Calibri" w:cs="Calibri" w:eastAsia="Calibri" w:hAnsi="Calibri"/>
+        </w:rPr>
+        <w:t xml:space="preserve">A BEST staff member requests access, stating the reason, scope, and expiry</w:t>
+      </w:r>
+    </w:p>
+    <w:p>
+      <w:pPr>
+        <w:pStyle w:val="ListParagraph"/>
+        <w:numPr>
+          <w:ilvl w:val="0"/>
+          <w:numId w:val="9"/>
+        </w:numPr>
+        <w:spacing w:after="60"/>
+      </w:pPr>
+      <w:r>
+        <w:rPr>
+          <w:rFonts w:ascii="Calibri" w:cs="Calibri" w:eastAsia="Calibri" w:hAnsi="Calibri"/>
+        </w:rPr>
+        <w:t xml:space="preserve">A designated BEST security approver approves first</w:t>
+      </w:r>
+    </w:p>
+    <w:p>
+      <w:pPr>
+        <w:pStyle w:val="ListParagraph"/>
+        <w:numPr>
+          <w:ilvl w:val="0"/>
+          <w:numId w:val="9"/>
+        </w:numPr>
+        <w:spacing w:after="60"/>
+      </w:pPr>
+      <w:r>
+        <w:rPr>
+          <w:rFonts w:ascii="Calibri" w:cs="Calibri" w:eastAsia="Calibri" w:hAnsi="Calibri"/>
+        </w:rPr>
+        <w:t xml:space="preserve">The customer’s Organization Admin approves second</w:t>
+      </w:r>
+    </w:p>
+    <w:p>
+      <w:pPr>
+        <w:pStyle w:val="ListParagraph"/>
+        <w:numPr>
+          <w:ilvl w:val="0"/>
+          <w:numId w:val="9"/>
+        </w:numPr>
+        <w:spacing w:after="60"/>
+      </w:pPr>
+      <w:r>
+        <w:rPr>
+          <w:rFonts w:ascii="Calibri" w:cs="Calibri" w:eastAsia="Calibri" w:hAnsi="Calibri"/>
+        </w:rPr>
+        <w:t xml:space="preserve">Both must approve. If either declines, or does not respond within the set time, the request is denied and logged</w:t>
+      </w:r>
+    </w:p>
+    <w:p>
+      <w:pPr>
+        <w:pStyle w:val="ListParagraph"/>
+        <w:numPr>
+          <w:ilvl w:val="0"/>
+          <w:numId w:val="9"/>
+        </w:numPr>
+        <w:spacing w:after="60"/>
+      </w:pPr>
+      <w:r>
+        <w:rPr>
+          <w:rFonts w:ascii="Calibri" w:cs="Calibri" w:eastAsia="Calibri" w:hAnsi="Calibri"/>
+        </w:rPr>
+        <w:t xml:space="preserve">Access is granted, the clinic is notified, and every action is logged</w:t>
+      </w:r>
+    </w:p>
+    <w:p>
+      <w:pPr>
+        <w:pStyle w:val="ListParagraph"/>
+        <w:numPr>
+          <w:ilvl w:val="0"/>
+          <w:numId w:val="9"/>
+        </w:numPr>
+        <w:spacing w:after="60"/>
+      </w:pPr>
+      <w:r>
+        <w:rPr>
+          <w:rFonts w:ascii="Calibri" w:cs="Calibri" w:eastAsia="Calibri" w:hAnsi="Calibri"/>
+        </w:rPr>
+        <w:t xml:space="preserve">Access expires automatically after the configured maximum duration, and the clinic is notified</w:t>
       </w:r>
     </w:p>
     <w:p>
@@ -11764,6 +12415,66 @@
       </w:pPr>
     </w:lvl>
   </w:abstractNum>
+  <w:abstractNum w:abstractNumId="5" w15:restartNumberingAfterBreak="0">
+    <w:multiLevelType w:val="hybridMultilevel"/>
+    <w:lvl w:ilvl="0" w15:tentative="1">
+      <w:start w:val="1"/>
+      <w:numFmt w:val="decimal"/>
+      <w:lvlText w:val="%1."/>
+      <w:lvlJc w:val="left"/>
+      <w:pPr>
+        <w:ind w:left="720" w:hanging="360"/>
+      </w:pPr>
+    </w:lvl>
+  </w:abstractNum>
+  <w:abstractNum w:abstractNumId="6" w15:restartNumberingAfterBreak="0">
+    <w:multiLevelType w:val="hybridMultilevel"/>
+    <w:lvl w:ilvl="0" w15:tentative="1">
+      <w:start w:val="1"/>
+      <w:numFmt w:val="decimal"/>
+      <w:lvlText w:val="%1."/>
+      <w:lvlJc w:val="left"/>
+      <w:pPr>
+        <w:ind w:left="720" w:hanging="360"/>
+      </w:pPr>
+    </w:lvl>
+  </w:abstractNum>
+  <w:abstractNum w:abstractNumId="7" w15:restartNumberingAfterBreak="0">
+    <w:multiLevelType w:val="hybridMultilevel"/>
+    <w:lvl w:ilvl="0" w15:tentative="1">
+      <w:start w:val="1"/>
+      <w:numFmt w:val="decimal"/>
+      <w:lvlText w:val="%1."/>
+      <w:lvlJc w:val="left"/>
+      <w:pPr>
+        <w:ind w:left="720" w:hanging="360"/>
+      </w:pPr>
+    </w:lvl>
+  </w:abstractNum>
+  <w:abstractNum w:abstractNumId="8" w15:restartNumberingAfterBreak="0">
+    <w:multiLevelType w:val="hybridMultilevel"/>
+    <w:lvl w:ilvl="0" w15:tentative="1">
+      <w:start w:val="1"/>
+      <w:numFmt w:val="decimal"/>
+      <w:lvlText w:val="%1."/>
+      <w:lvlJc w:val="left"/>
+      <w:pPr>
+        <w:ind w:left="720" w:hanging="360"/>
+      </w:pPr>
+    </w:lvl>
+  </w:abstractNum>
+  <w:abstractNum w:abstractNumId="9" w15:restartNumberingAfterBreak="0">
+    <w:multiLevelType w:val="hybridMultilevel"/>
+    <w:lvl w:ilvl="0" w15:tentative="1">
+      <w:start w:val="1"/>
+      <w:numFmt w:val="decimal"/>
+      <w:lvlText w:val="%1."/>
+      <w:lvlJc w:val="left"/>
+      <w:pPr>
+        <w:ind w:left="720" w:hanging="360"/>
+      </w:pPr>
+    </w:lvl>
+  </w:abstractNum>
   <w:num w:numId="1">
     <w:abstractNumId w:val="1"/>
     <w:lvlOverride w:ilvl="0">
@@ -11784,6 +12495,36 @@
   </w:num>
   <w:num w:numId="4">
     <w:abstractNumId w:val="4"/>
+    <w:lvlOverride w:ilvl="0">
+      <w:startOverride w:val="1"/>
+    </w:lvlOverride>
+  </w:num>
+  <w:num w:numId="5">
+    <w:abstractNumId w:val="5"/>
+    <w:lvlOverride w:ilvl="0">
+      <w:startOverride w:val="1"/>
+    </w:lvlOverride>
+  </w:num>
+  <w:num w:numId="6">
+    <w:abstractNumId w:val="6"/>
+    <w:lvlOverride w:ilvl="0">
+      <w:startOverride w:val="1"/>
+    </w:lvlOverride>
+  </w:num>
+  <w:num w:numId="7">
+    <w:abstractNumId w:val="7"/>
+    <w:lvlOverride w:ilvl="0">
+      <w:startOverride w:val="1"/>
+    </w:lvlOverride>
+  </w:num>
+  <w:num w:numId="8">
+    <w:abstractNumId w:val="8"/>
+    <w:lvlOverride w:ilvl="0">
+      <w:startOverride w:val="1"/>
+    </w:lvlOverride>
+  </w:num>
+  <w:num w:numId="9">
+    <w:abstractNumId w:val="9"/>
     <w:lvlOverride w:ilvl="0">
       <w:startOverride w:val="1"/>
     </w:lvlOverride>

</xml_diff>

<commit_message>
PRD v3.0 section 7: add sign-in and routing (Figures 1-2), renumber; update diagrams PDF
Co-Authored-By: Claude Opus 5.5 <noreply@anthropic.com>
Claude-Session: https://claude.ai/code/session_01AzN61zWTi2yq5SJaQMPbTS
</commit_message>
<xml_diff>
--- a/docs/BEST_PRD_v3.0.docx
+++ b/docs/BEST_PRD_v3.0.docx
@@ -1627,7 +1627,7 @@
         <w:rPr>
           <w:rFonts w:ascii="Calibri" w:cs="Calibri" w:eastAsia="Calibri" w:hAnsi="Calibri"/>
         </w:rPr>
-        <w:t xml:space="preserve">7.1 Therapist</w:t>
+        <w:t xml:space="preserve">7.1 Signing in and routing</w:t>
       </w:r>
     </w:p>
     <w:p>
@@ -1639,7 +1639,7 @@
         <w:rPr>
           <w:rFonts w:ascii="Calibri" w:cs="Calibri" w:eastAsia="Calibri" w:hAnsi="Calibri"/>
         </w:rPr>
-        <w:t xml:space="preserve">Running a session</w:t>
+        <w:t xml:space="preserve">Signing in</w:t>
       </w:r>
     </w:p>
     <w:p>
@@ -1651,7 +1651,7 @@
       <w:r>
         <w:drawing>
           <wp:inline distT="0" distB="0" distL="0" distR="0">
-            <wp:extent cx="4762500" cy="4276725"/>
+            <wp:extent cx="4762500" cy="3924300"/>
             <wp:effectExtent t="0" r="0" b="0" l="0"/>
             <wp:docPr id="1" name="" descr="" title=""/>
             <wp:cNvGraphicFramePr>
@@ -1676,7 +1676,7 @@
                   <pic:spPr bwMode="auto">
                     <a:xfrm>
                       <a:off x="0" y="0"/>
-                      <a:ext cx="4762500" cy="4276725"/>
+                      <a:ext cx="4762500" cy="3924300"/>
                     </a:xfrm>
                     <a:prstGeom prst="rect">
                       <a:avLst/>
@@ -1703,7 +1703,7 @@
           <w:sz w:val="18"/>
           <w:szCs w:val="18"/>
         </w:rPr>
-        <w:t xml:space="preserve">Figure 1. Therapist: running a session</w:t>
+        <w:t xml:space="preserve">Figure 1. All users: signing in</w:t>
       </w:r>
     </w:p>
     <w:p>
@@ -1719,7 +1719,7 @@
         <w:rPr>
           <w:rFonts w:ascii="Calibri" w:cs="Calibri" w:eastAsia="Calibri" w:hAnsi="Calibri"/>
         </w:rPr>
-        <w:t xml:space="preserve">Select a scheduled session from the dashboard</w:t>
+        <w:t xml:space="preserve">The user opens the web app and the login screen is shown</w:t>
       </w:r>
     </w:p>
     <w:p>
@@ -1735,7 +1735,7 @@
         <w:rPr>
           <w:rFonts w:ascii="Calibri" w:cs="Calibri" w:eastAsia="Calibri" w:hAnsi="Calibri"/>
         </w:rPr>
-        <w:t xml:space="preserve">The platform checks consent automatically. Without wearable consent, an in-person session runs with manual notes only and no device data; a telehealth session cannot start without telehealth consent</w:t>
+        <w:t xml:space="preserve">The user enters email and password, or chooses to reset the password. First-time users arrive through their invite link instead (Section 7.4)</w:t>
       </w:r>
     </w:p>
     <w:p>
@@ -1751,7 +1751,7 @@
         <w:rPr>
           <w:rFonts w:ascii="Calibri" w:cs="Calibri" w:eastAsia="Calibri" w:hAnsi="Calibri"/>
         </w:rPr>
-        <w:t xml:space="preserve">In person: the wearable is synced to the session. Telehealth: the video session starts; live soft alerts are not used in telehealth</w:t>
+        <w:t xml:space="preserve">If the credentials are invalid, an error is shown and the user can retry or reset. The account locks after repeated failed attempts (configurable; default 5) until the password is reset</w:t>
       </w:r>
     </w:p>
     <w:p>
@@ -1767,7 +1767,7 @@
         <w:rPr>
           <w:rFonts w:ascii="Calibri" w:cs="Calibri" w:eastAsia="Calibri" w:hAnsi="Calibri"/>
         </w:rPr>
-        <w:t xml:space="preserve">During the live session, indicators show trends and the age of their data</w:t>
+        <w:t xml:space="preserve">Organization Admin and BEST roles enter an MFA code</w:t>
       </w:r>
     </w:p>
     <w:p>
@@ -1783,7 +1783,7 @@
         <w:rPr>
           <w:rFonts w:ascii="Calibri" w:cs="Calibri" w:eastAsia="Calibri" w:hAnsi="Calibri"/>
         </w:rPr>
-        <w:t xml:space="preserve">Soft alerts (in person only) appear from the notification queue; the therapist acknowledges them</w:t>
+        <w:t xml:space="preserve">If the account has been deactivated, access is denied and the user is asked to contact their clinic admin</w:t>
       </w:r>
     </w:p>
     <w:p>
@@ -1799,23 +1799,7 @@
         <w:rPr>
           <w:rFonts w:ascii="Calibri" w:cs="Calibri" w:eastAsia="Calibri" w:hAnsi="Calibri"/>
         </w:rPr>
-        <w:t xml:space="preserve">Notes and markers can be added at any time</w:t>
-      </w:r>
-    </w:p>
-    <w:p>
-      <w:pPr>
-        <w:pStyle w:val="ListParagraph"/>
-        <w:numPr>
-          <w:ilvl w:val="0"/>
-          <w:numId w:val="3"/>
-        </w:numPr>
-        <w:spacing w:after="60"/>
-      </w:pPr>
-      <w:r>
-        <w:rPr>
-          <w:rFonts w:ascii="Calibri" w:cs="Calibri" w:eastAsia="Calibri" w:hAnsi="Calibri"/>
-        </w:rPr>
-        <w:t xml:space="preserve">The therapist ends the session, or it ends automatically when the scheduled window closes; unacknowledged alerts expire</w:t>
+        <w:t xml:space="preserve">The user is signed in. After the session timeout, the user returns to the login screen</w:t>
       </w:r>
     </w:p>
     <w:p>
@@ -1827,7 +1811,7 @@
         <w:rPr>
           <w:rFonts w:ascii="Calibri" w:cs="Calibri" w:eastAsia="Calibri" w:hAnsi="Calibri"/>
         </w:rPr>
-        <w:t xml:space="preserve">Completing the session summary</w:t>
+        <w:t xml:space="preserve">Routing to the home screen</w:t>
       </w:r>
     </w:p>
     <w:p>
@@ -1839,7 +1823,7 @@
       <w:r>
         <w:drawing>
           <wp:inline distT="0" distB="0" distL="0" distR="0">
-            <wp:extent cx="4762500" cy="3924300"/>
+            <wp:extent cx="4762500" cy="2314575"/>
             <wp:effectExtent t="0" r="0" b="0" l="0"/>
             <wp:docPr id="1" name="" descr="" title=""/>
             <wp:cNvGraphicFramePr>
@@ -1864,7 +1848,7 @@
                   <pic:spPr bwMode="auto">
                     <a:xfrm>
                       <a:off x="0" y="0"/>
-                      <a:ext cx="4762500" cy="3924300"/>
+                      <a:ext cx="4762500" cy="2314575"/>
                     </a:xfrm>
                     <a:prstGeom prst="rect">
                       <a:avLst/>
@@ -1891,7 +1875,7 @@
           <w:sz w:val="18"/>
           <w:szCs w:val="18"/>
         </w:rPr>
-        <w:t xml:space="preserve">Figure 2. Therapist: completing the session summary</w:t>
+        <w:t xml:space="preserve">Figure 2. All users: routing to the home screen</w:t>
       </w:r>
     </w:p>
     <w:p>
@@ -1907,7 +1891,7 @@
         <w:rPr>
           <w:rFonts w:ascii="Calibri" w:cs="Calibri" w:eastAsia="Calibri" w:hAnsi="Calibri"/>
         </w:rPr>
-        <w:t xml:space="preserve">When the session ends, session data is sent to the external AI summary service and the screen shows that the summary is being generated</w:t>
+        <w:t xml:space="preserve">For clinic users, the platform checks the organization’s license. If it has expired or is suspended, the user enters restricted mode and can view records only. BEST staff skip this check</w:t>
       </w:r>
     </w:p>
     <w:p>
@@ -1923,7 +1907,7 @@
         <w:rPr>
           <w:rFonts w:ascii="Calibri" w:cs="Calibri" w:eastAsia="Calibri" w:hAnsi="Calibri"/>
         </w:rPr>
-        <w:t xml:space="preserve">If a draft is returned, it is shown labeled as AI-generated for the therapist to review</w:t>
+        <w:t xml:space="preserve">Users are routed by role: Therapist to the session list, Supervisor to the caseload, Organization Admin to the clinic console, and BEST staff to the back office</w:t>
       </w:r>
     </w:p>
     <w:p>
@@ -1939,39 +1923,7 @@
         <w:rPr>
           <w:rFonts w:ascii="Calibri" w:cs="Calibri" w:eastAsia="Calibri" w:hAnsi="Calibri"/>
         </w:rPr>
-        <w:t xml:space="preserve">If generation fails or times out, the therapist can retry (no limit) or write the summary manually</w:t>
-      </w:r>
-    </w:p>
-    <w:p>
-      <w:pPr>
-        <w:pStyle w:val="ListParagraph"/>
-        <w:numPr>
-          <w:ilvl w:val="0"/>
-          <w:numId w:val="4"/>
-        </w:numPr>
-        <w:spacing w:after="60"/>
-      </w:pPr>
-      <w:r>
-        <w:rPr>
-          <w:rFonts w:ascii="Calibri" w:cs="Calibri" w:eastAsia="Calibri" w:hAnsi="Calibri"/>
-        </w:rPr>
-        <w:t xml:space="preserve">The therapist edits and confirms the summary</w:t>
-      </w:r>
-    </w:p>
-    <w:p>
-      <w:pPr>
-        <w:pStyle w:val="ListParagraph"/>
-        <w:numPr>
-          <w:ilvl w:val="0"/>
-          <w:numId w:val="4"/>
-        </w:numPr>
-        <w:spacing w:after="60"/>
-      </w:pPr>
-      <w:r>
-        <w:rPr>
-          <w:rFonts w:ascii="Calibri" w:cs="Calibri" w:eastAsia="Calibri" w:hAnsi="Calibri"/>
-        </w:rPr>
-        <w:t xml:space="preserve">The confirmed summary is saved to the session record and becomes visible to the supervisor; unconfirmed drafts are never shown to supervisors</w:t>
+        <w:t xml:space="preserve">A Supervisor who also holds Organization Admin permission lands on the caseload and can switch to the clinic console without signing in again</w:t>
       </w:r>
     </w:p>
     <w:p>
@@ -1983,7 +1935,19 @@
         <w:rPr>
           <w:rFonts w:ascii="Calibri" w:cs="Calibri" w:eastAsia="Calibri" w:hAnsi="Calibri"/>
         </w:rPr>
-        <w:t xml:space="preserve">7.2 Supervisor</w:t>
+        <w:t xml:space="preserve">7.2 Therapist</w:t>
+      </w:r>
+    </w:p>
+    <w:p>
+      <w:pPr>
+        <w:pStyle w:val="Heading3"/>
+        <w:spacing w:after="60" w:before="160"/>
+      </w:pPr>
+      <w:r>
+        <w:rPr>
+          <w:rFonts w:ascii="Calibri" w:cs="Calibri" w:eastAsia="Calibri" w:hAnsi="Calibri"/>
+        </w:rPr>
+        <w:t xml:space="preserve">Running a session</w:t>
       </w:r>
     </w:p>
     <w:p>
@@ -1995,7 +1959,7 @@
       <w:r>
         <w:drawing>
           <wp:inline distT="0" distB="0" distL="0" distR="0">
-            <wp:extent cx="4762500" cy="4057650"/>
+            <wp:extent cx="4762500" cy="4276725"/>
             <wp:effectExtent t="0" r="0" b="0" l="0"/>
             <wp:docPr id="1" name="" descr="" title=""/>
             <wp:cNvGraphicFramePr>
@@ -2020,7 +1984,7 @@
                   <pic:spPr bwMode="auto">
                     <a:xfrm>
                       <a:off x="0" y="0"/>
-                      <a:ext cx="4762500" cy="4057650"/>
+                      <a:ext cx="4762500" cy="4276725"/>
                     </a:xfrm>
                     <a:prstGeom prst="rect">
                       <a:avLst/>
@@ -2047,7 +2011,7 @@
           <w:sz w:val="18"/>
           <w:szCs w:val="18"/>
         </w:rPr>
-        <w:t xml:space="preserve">Figure 3. Supervisor: reviewing sessions</w:t>
+        <w:t xml:space="preserve">Figure 3. Therapist: running a session</w:t>
       </w:r>
     </w:p>
     <w:p>
@@ -2063,7 +2027,7 @@
         <w:rPr>
           <w:rFonts w:ascii="Calibri" w:cs="Calibri" w:eastAsia="Calibri" w:hAnsi="Calibri"/>
         </w:rPr>
-        <w:t xml:space="preserve">Open the caseload dashboard showing assigned therapists and clients</w:t>
+        <w:t xml:space="preserve">Select a scheduled session from the dashboard</w:t>
       </w:r>
     </w:p>
     <w:p>
@@ -2079,7 +2043,7 @@
         <w:rPr>
           <w:rFonts w:ascii="Calibri" w:cs="Calibri" w:eastAsia="Calibri" w:hAnsi="Calibri"/>
         </w:rPr>
-        <w:t xml:space="preserve">Work through flagged sessions: sessions with alerts, most alerts first</w:t>
+        <w:t xml:space="preserve">The platform checks consent automatically. Without wearable consent, an in-person session runs with manual notes only and no device data; a telehealth session cannot start without telehealth consent</w:t>
       </w:r>
     </w:p>
     <w:p>
@@ -2095,7 +2059,7 @@
         <w:rPr>
           <w:rFonts w:ascii="Calibri" w:cs="Calibri" w:eastAsia="Calibri" w:hAnsi="Calibri"/>
         </w:rPr>
-        <w:t xml:space="preserve">Open a session to see its summary, timeline, and trends</w:t>
+        <w:t xml:space="preserve">In person: the wearable is synced to the session. Telehealth: the video session starts; live soft alerts are not used in telehealth</w:t>
       </w:r>
     </w:p>
     <w:p>
@@ -2111,7 +2075,7 @@
         <w:rPr>
           <w:rFonts w:ascii="Calibri" w:cs="Calibri" w:eastAsia="Calibri" w:hAnsi="Calibri"/>
         </w:rPr>
-        <w:t xml:space="preserve">If the summary is not yet confirmed, the session shows as summary pending and the supervisor can send the therapist a reminder</w:t>
+        <w:t xml:space="preserve">During the live session, indicators show trends and the age of their data</w:t>
       </w:r>
     </w:p>
     <w:p>
@@ -2127,7 +2091,7 @@
         <w:rPr>
           <w:rFonts w:ascii="Calibri" w:cs="Calibri" w:eastAsia="Calibri" w:hAnsi="Calibri"/>
         </w:rPr>
-        <w:t xml:space="preserve">If the summary is confirmed, the supervisor can, in any order: compare sessions side by side; approve documentation where permitted; add a review note or follow-up task, which appears in the therapist’s pending tasks</w:t>
+        <w:t xml:space="preserve">Soft alerts (in person only) appear from the notification queue; the therapist acknowledges them</w:t>
       </w:r>
     </w:p>
     <w:p>
@@ -2143,19 +2107,23 @@
         <w:rPr>
           <w:rFonts w:ascii="Calibri" w:cs="Calibri" w:eastAsia="Calibri" w:hAnsi="Calibri"/>
         </w:rPr>
-        <w:t xml:space="preserve">Mark the session as reviewed; this is logged for audit</w:t>
-      </w:r>
-    </w:p>
-    <w:p>
-      <w:pPr>
-        <w:pStyle w:val="Heading2"/>
-        <w:spacing w:after="80" w:before="240"/>
-      </w:pPr>
-      <w:r>
-        <w:rPr>
-          <w:rFonts w:ascii="Calibri" w:cs="Calibri" w:eastAsia="Calibri" w:hAnsi="Calibri"/>
-        </w:rPr>
-        <w:t xml:space="preserve">7.3 Organization Admin / Clinic Manager</w:t>
+        <w:t xml:space="preserve">Notes and markers can be added at any time</w:t>
+      </w:r>
+    </w:p>
+    <w:p>
+      <w:pPr>
+        <w:pStyle w:val="ListParagraph"/>
+        <w:numPr>
+          <w:ilvl w:val="0"/>
+          <w:numId w:val="5"/>
+        </w:numPr>
+        <w:spacing w:after="60"/>
+      </w:pPr>
+      <w:r>
+        <w:rPr>
+          <w:rFonts w:ascii="Calibri" w:cs="Calibri" w:eastAsia="Calibri" w:hAnsi="Calibri"/>
+        </w:rPr>
+        <w:t xml:space="preserve">The therapist ends the session, or it ends automatically when the scheduled window closes; unacknowledged alerts expire</w:t>
       </w:r>
     </w:p>
     <w:p>
@@ -2167,7 +2135,7 @@
         <w:rPr>
           <w:rFonts w:ascii="Calibri" w:cs="Calibri" w:eastAsia="Calibri" w:hAnsi="Calibri"/>
         </w:rPr>
-        <w:t xml:space="preserve">Adding a user</w:t>
+        <w:t xml:space="preserve">Completing the session summary</w:t>
       </w:r>
     </w:p>
     <w:p>
@@ -2179,7 +2147,7 @@
       <w:r>
         <w:drawing>
           <wp:inline distT="0" distB="0" distL="0" distR="0">
-            <wp:extent cx="4762500" cy="2657475"/>
+            <wp:extent cx="4762500" cy="3924300"/>
             <wp:effectExtent t="0" r="0" b="0" l="0"/>
             <wp:docPr id="1" name="" descr="" title=""/>
             <wp:cNvGraphicFramePr>
@@ -2204,7 +2172,7 @@
                   <pic:spPr bwMode="auto">
                     <a:xfrm>
                       <a:off x="0" y="0"/>
-                      <a:ext cx="4762500" cy="2657475"/>
+                      <a:ext cx="4762500" cy="3924300"/>
                     </a:xfrm>
                     <a:prstGeom prst="rect">
                       <a:avLst/>
@@ -2231,7 +2199,7 @@
           <w:sz w:val="18"/>
           <w:szCs w:val="18"/>
         </w:rPr>
-        <w:t xml:space="preserve">Figure 4. Organization Admin: adding a user</w:t>
+        <w:t xml:space="preserve">Figure 4. Therapist: completing the session summary</w:t>
       </w:r>
     </w:p>
     <w:p>
@@ -2247,7 +2215,7 @@
         <w:rPr>
           <w:rFonts w:ascii="Calibri" w:cs="Calibri" w:eastAsia="Calibri" w:hAnsi="Calibri"/>
         </w:rPr>
-        <w:t xml:space="preserve">Invite the user with their email and role</w:t>
+        <w:t xml:space="preserve">When the session ends, session data is sent to the external AI summary service and the screen shows that the summary is being generated</w:t>
       </w:r>
     </w:p>
     <w:p>
@@ -2263,7 +2231,7 @@
         <w:rPr>
           <w:rFonts w:ascii="Calibri" w:cs="Calibri" w:eastAsia="Calibri" w:hAnsi="Calibri"/>
         </w:rPr>
-        <w:t xml:space="preserve">The platform checks for a free seat on the organization’s license. If none is free, the admin asks BEST to add seats</w:t>
+        <w:t xml:space="preserve">If a draft is returned, it is shown labeled as AI-generated for the therapist to review</w:t>
       </w:r>
     </w:p>
     <w:p>
@@ -2279,7 +2247,7 @@
         <w:rPr>
           <w:rFonts w:ascii="Calibri" w:cs="Calibri" w:eastAsia="Calibri" w:hAnsi="Calibri"/>
         </w:rPr>
-        <w:t xml:space="preserve">The user accepts the invite and sets a password (MFA is mandatory for Organization Admin and BEST roles)</w:t>
+        <w:t xml:space="preserve">If generation fails or times out, the therapist can retry (no limit) or write the summary manually</w:t>
       </w:r>
     </w:p>
     <w:p>
@@ -2295,19 +2263,35 @@
         <w:rPr>
           <w:rFonts w:ascii="Calibri" w:cs="Calibri" w:eastAsia="Calibri" w:hAnsi="Calibri"/>
         </w:rPr>
-        <w:t xml:space="preserve">The account becomes active and the seat is used; a pending invite does not use a seat</w:t>
-      </w:r>
-    </w:p>
-    <w:p>
-      <w:pPr>
-        <w:pStyle w:val="Heading3"/>
-        <w:spacing w:after="60" w:before="160"/>
-      </w:pPr>
-      <w:r>
-        <w:rPr>
-          <w:rFonts w:ascii="Calibri" w:cs="Calibri" w:eastAsia="Calibri" w:hAnsi="Calibri"/>
-        </w:rPr>
-        <w:t xml:space="preserve">Adding a client</w:t>
+        <w:t xml:space="preserve">The therapist edits and confirms the summary</w:t>
+      </w:r>
+    </w:p>
+    <w:p>
+      <w:pPr>
+        <w:pStyle w:val="ListParagraph"/>
+        <w:numPr>
+          <w:ilvl w:val="0"/>
+          <w:numId w:val="6"/>
+        </w:numPr>
+        <w:spacing w:after="60"/>
+      </w:pPr>
+      <w:r>
+        <w:rPr>
+          <w:rFonts w:ascii="Calibri" w:cs="Calibri" w:eastAsia="Calibri" w:hAnsi="Calibri"/>
+        </w:rPr>
+        <w:t xml:space="preserve">The confirmed summary is saved to the session record and becomes visible to the supervisor; unconfirmed drafts are never shown to supervisors</w:t>
+      </w:r>
+    </w:p>
+    <w:p>
+      <w:pPr>
+        <w:pStyle w:val="Heading2"/>
+        <w:spacing w:after="80" w:before="240"/>
+      </w:pPr>
+      <w:r>
+        <w:rPr>
+          <w:rFonts w:ascii="Calibri" w:cs="Calibri" w:eastAsia="Calibri" w:hAnsi="Calibri"/>
+        </w:rPr>
+        <w:t xml:space="preserve">7.3 Supervisor</w:t>
       </w:r>
     </w:p>
     <w:p>
@@ -2319,7 +2303,7 @@
       <w:r>
         <w:drawing>
           <wp:inline distT="0" distB="0" distL="0" distR="0">
-            <wp:extent cx="4762500" cy="3295650"/>
+            <wp:extent cx="4762500" cy="4057650"/>
             <wp:effectExtent t="0" r="0" b="0" l="0"/>
             <wp:docPr id="1" name="" descr="" title=""/>
             <wp:cNvGraphicFramePr>
@@ -2344,7 +2328,7 @@
                   <pic:spPr bwMode="auto">
                     <a:xfrm>
                       <a:off x="0" y="0"/>
-                      <a:ext cx="4762500" cy="3295650"/>
+                      <a:ext cx="4762500" cy="4057650"/>
                     </a:xfrm>
                     <a:prstGeom prst="rect">
                       <a:avLst/>
@@ -2371,7 +2355,7 @@
           <w:sz w:val="18"/>
           <w:szCs w:val="18"/>
         </w:rPr>
-        <w:t xml:space="preserve">Figure 5. Organization Admin: adding a client</w:t>
+        <w:t xml:space="preserve">Figure 5. Supervisor: reviewing sessions</w:t>
       </w:r>
     </w:p>
     <w:p>
@@ -2387,7 +2371,7 @@
         <w:rPr>
           <w:rFonts w:ascii="Calibri" w:cs="Calibri" w:eastAsia="Calibri" w:hAnsi="Calibri"/>
         </w:rPr>
-        <w:t xml:space="preserve">Add the client profile and location</w:t>
+        <w:t xml:space="preserve">Open the caseload dashboard showing assigned therapists and clients</w:t>
       </w:r>
     </w:p>
     <w:p>
@@ -2403,7 +2387,7 @@
         <w:rPr>
           <w:rFonts w:ascii="Calibri" w:cs="Calibri" w:eastAsia="Calibri" w:hAnsi="Calibri"/>
         </w:rPr>
-        <w:t xml:space="preserve">Record the consent signed with clinic staff</w:t>
+        <w:t xml:space="preserve">Work through flagged sessions: sessions with alerts, most alerts first</w:t>
       </w:r>
     </w:p>
     <w:p>
@@ -2419,7 +2403,7 @@
         <w:rPr>
           <w:rFonts w:ascii="Calibri" w:cs="Calibri" w:eastAsia="Calibri" w:hAnsi="Calibri"/>
         </w:rPr>
-        <w:t xml:space="preserve">The platform checks the recorded consent. Without wearable consent, sessions are manual only; without telehealth consent, telehealth sessions cannot start</w:t>
+        <w:t xml:space="preserve">Open a session to see its summary, timeline, and trends</w:t>
       </w:r>
     </w:p>
     <w:p>
@@ -2435,7 +2419,7 @@
         <w:rPr>
           <w:rFonts w:ascii="Calibri" w:cs="Calibri" w:eastAsia="Calibri" w:hAnsi="Calibri"/>
         </w:rPr>
-        <w:t xml:space="preserve">Assign the care team: therapist and supervisor</w:t>
+        <w:t xml:space="preserve">If the summary is not yet confirmed, the session shows as summary pending and the supervisor can send the therapist a reminder</w:t>
       </w:r>
     </w:p>
     <w:p>
@@ -2451,18 +2435,23 @@
         <w:rPr>
           <w:rFonts w:ascii="Calibri" w:cs="Calibri" w:eastAsia="Calibri" w:hAnsi="Calibri"/>
         </w:rPr>
-        <w:t xml:space="preserve">Schedule sessions in-app or by CSV import</w:t>
-      </w:r>
-    </w:p>
-    <w:p>
-      <w:pPr>
-        <w:spacing w:after="120"/>
-      </w:pPr>
-      <w:r>
-        <w:rPr>
-          <w:rFonts w:ascii="Calibri" w:cs="Calibri" w:eastAsia="Calibri" w:hAnsi="Calibri"/>
-        </w:rPr>
-        <w:t xml:space="preserve">Deactivating a user frees their seat. Archiving a client hides them from active workflows. Withdrawing consent makes later sessions manual only and blocks telehealth.</w:t>
+        <w:t xml:space="preserve">If the summary is confirmed, the supervisor can, in any order: compare sessions side by side; approve documentation where permitted; add a review note or follow-up task, which appears in the therapist’s pending tasks</w:t>
+      </w:r>
+    </w:p>
+    <w:p>
+      <w:pPr>
+        <w:pStyle w:val="ListParagraph"/>
+        <w:numPr>
+          <w:ilvl w:val="0"/>
+          <w:numId w:val="7"/>
+        </w:numPr>
+        <w:spacing w:after="60"/>
+      </w:pPr>
+      <w:r>
+        <w:rPr>
+          <w:rFonts w:ascii="Calibri" w:cs="Calibri" w:eastAsia="Calibri" w:hAnsi="Calibri"/>
+        </w:rPr>
+        <w:t xml:space="preserve">Mark the session as reviewed; this is logged for audit</w:t>
       </w:r>
     </w:p>
     <w:p>
@@ -2474,7 +2463,7 @@
         <w:rPr>
           <w:rFonts w:ascii="Calibri" w:cs="Calibri" w:eastAsia="Calibri" w:hAnsi="Calibri"/>
         </w:rPr>
-        <w:t xml:space="preserve">7.4 BEST Back Office</w:t>
+        <w:t xml:space="preserve">7.4 Organization Admin / Clinic Manager</w:t>
       </w:r>
     </w:p>
     <w:p>
@@ -2486,7 +2475,7 @@
         <w:rPr>
           <w:rFonts w:ascii="Calibri" w:cs="Calibri" w:eastAsia="Calibri" w:hAnsi="Calibri"/>
         </w:rPr>
-        <w:t xml:space="preserve">License lifecycle</w:t>
+        <w:t xml:space="preserve">Adding a user</w:t>
       </w:r>
     </w:p>
     <w:p>
@@ -2498,7 +2487,7 @@
       <w:r>
         <w:drawing>
           <wp:inline distT="0" distB="0" distL="0" distR="0">
-            <wp:extent cx="4762500" cy="3429000"/>
+            <wp:extent cx="4762500" cy="2657475"/>
             <wp:effectExtent t="0" r="0" b="0" l="0"/>
             <wp:docPr id="1" name="" descr="" title=""/>
             <wp:cNvGraphicFramePr>
@@ -2523,7 +2512,7 @@
                   <pic:spPr bwMode="auto">
                     <a:xfrm>
                       <a:off x="0" y="0"/>
-                      <a:ext cx="4762500" cy="3429000"/>
+                      <a:ext cx="4762500" cy="2657475"/>
                     </a:xfrm>
                     <a:prstGeom prst="rect">
                       <a:avLst/>
@@ -2550,7 +2539,7 @@
           <w:sz w:val="18"/>
           <w:szCs w:val="18"/>
         </w:rPr>
-        <w:t xml:space="preserve">Figure 6. BEST Platform Admin: license lifecycle</w:t>
+        <w:t xml:space="preserve">Figure 6. Organization Admin: adding a user</w:t>
       </w:r>
     </w:p>
     <w:p>
@@ -2566,7 +2555,7 @@
         <w:rPr>
           <w:rFonts w:ascii="Calibri" w:cs="Calibri" w:eastAsia="Calibri" w:hAnsi="Calibri"/>
         </w:rPr>
-        <w:t xml:space="preserve">Onboard the customer organization</w:t>
+        <w:t xml:space="preserve">Invite the user with their email and role</w:t>
       </w:r>
     </w:p>
     <w:p>
@@ -2582,7 +2571,7 @@
         <w:rPr>
           <w:rFonts w:ascii="Calibri" w:cs="Calibri" w:eastAsia="Calibri" w:hAnsi="Calibri"/>
         </w:rPr>
-        <w:t xml:space="preserve">Create its license: plan, seats, dates, and enabled features</w:t>
+        <w:t xml:space="preserve">The platform checks for a free seat on the organization’s license. If none is free, the admin asks BEST to add seats</w:t>
       </w:r>
     </w:p>
     <w:p>
@@ -2598,7 +2587,7 @@
         <w:rPr>
           <w:rFonts w:ascii="Calibri" w:cs="Calibri" w:eastAsia="Calibri" w:hAnsi="Calibri"/>
         </w:rPr>
-        <w:t xml:space="preserve">While the license is active, Organization Admins can invite users; Platform Admin can edit seats or features, or suspend the license</w:t>
+        <w:t xml:space="preserve">The user accepts the invite and sets a password (MFA is mandatory for Organization Admin and BEST roles)</w:t>
       </w:r>
     </w:p>
     <w:p>
@@ -2614,39 +2603,7 @@
         <w:rPr>
           <w:rFonts w:ascii="Calibri" w:cs="Calibri" w:eastAsia="Calibri" w:hAnsi="Calibri"/>
         </w:rPr>
-        <w:t xml:space="preserve">Organization Admins receive a warning before the license end date (configurable; default 30 days)</w:t>
-      </w:r>
-    </w:p>
-    <w:p>
-      <w:pPr>
-        <w:pStyle w:val="ListParagraph"/>
-        <w:numPr>
-          <w:ilvl w:val="0"/>
-          <w:numId w:val="8"/>
-        </w:numPr>
-        <w:spacing w:after="60"/>
-      </w:pPr>
-      <w:r>
-        <w:rPr>
-          <w:rFonts w:ascii="Calibri" w:cs="Calibri" w:eastAsia="Calibri" w:hAnsi="Calibri"/>
-        </w:rPr>
-        <w:t xml:space="preserve">When the end date is reached, the license expires: no new sessions can start, users can still log in and view records, and no data is deleted. A suspended license has the same effect</w:t>
-      </w:r>
-    </w:p>
-    <w:p>
-      <w:pPr>
-        <w:pStyle w:val="ListParagraph"/>
-        <w:numPr>
-          <w:ilvl w:val="0"/>
-          <w:numId w:val="8"/>
-        </w:numPr>
-        <w:spacing w:after="60"/>
-      </w:pPr>
-      <w:r>
-        <w:rPr>
-          <w:rFonts w:ascii="Calibri" w:cs="Calibri" w:eastAsia="Calibri" w:hAnsi="Calibri"/>
-        </w:rPr>
-        <w:t xml:space="preserve">Platform Admin extends the license to return it to active</w:t>
+        <w:t xml:space="preserve">The account becomes active and the seat is used; a pending invite does not use a seat</w:t>
       </w:r>
     </w:p>
     <w:p>
@@ -2658,7 +2615,7 @@
         <w:rPr>
           <w:rFonts w:ascii="Calibri" w:cs="Calibri" w:eastAsia="Calibri" w:hAnsi="Calibri"/>
         </w:rPr>
-        <w:t xml:space="preserve">Time-bound support access to clinical data (break-glass)</w:t>
+        <w:t xml:space="preserve">Adding a client</w:t>
       </w:r>
     </w:p>
     <w:p>
@@ -2670,7 +2627,7 @@
       <w:r>
         <w:drawing>
           <wp:inline distT="0" distB="0" distL="0" distR="0">
-            <wp:extent cx="4762500" cy="3924300"/>
+            <wp:extent cx="4762500" cy="3295650"/>
             <wp:effectExtent t="0" r="0" b="0" l="0"/>
             <wp:docPr id="1" name="" descr="" title=""/>
             <wp:cNvGraphicFramePr>
@@ -2695,6 +2652,357 @@
                   <pic:spPr bwMode="auto">
                     <a:xfrm>
                       <a:off x="0" y="0"/>
+                      <a:ext cx="4762500" cy="3295650"/>
+                    </a:xfrm>
+                    <a:prstGeom prst="rect">
+                      <a:avLst/>
+                    </a:prstGeom>
+                  </pic:spPr>
+                </pic:pic>
+              </a:graphicData>
+            </a:graphic>
+          </wp:inline>
+        </w:drawing>
+      </w:r>
+    </w:p>
+    <w:p>
+      <w:pPr>
+        <w:spacing w:after="200"/>
+        <w:jc w:val="center"/>
+      </w:pPr>
+      <w:r>
+        <w:rPr>
+          <w:rFonts w:ascii="Calibri" w:cs="Calibri" w:eastAsia="Calibri" w:hAnsi="Calibri"/>
+          <w:i/>
+          <w:iCs/>
+          <w:color w:val="595959"/>
+          <w:sz w:val="18"/>
+          <w:szCs w:val="18"/>
+        </w:rPr>
+        <w:t xml:space="preserve">Figure 7. Organization Admin: adding a client</w:t>
+      </w:r>
+    </w:p>
+    <w:p>
+      <w:pPr>
+        <w:pStyle w:val="ListParagraph"/>
+        <w:numPr>
+          <w:ilvl w:val="0"/>
+          <w:numId w:val="9"/>
+        </w:numPr>
+        <w:spacing w:after="60"/>
+      </w:pPr>
+      <w:r>
+        <w:rPr>
+          <w:rFonts w:ascii="Calibri" w:cs="Calibri" w:eastAsia="Calibri" w:hAnsi="Calibri"/>
+        </w:rPr>
+        <w:t xml:space="preserve">Add the client profile and location</w:t>
+      </w:r>
+    </w:p>
+    <w:p>
+      <w:pPr>
+        <w:pStyle w:val="ListParagraph"/>
+        <w:numPr>
+          <w:ilvl w:val="0"/>
+          <w:numId w:val="9"/>
+        </w:numPr>
+        <w:spacing w:after="60"/>
+      </w:pPr>
+      <w:r>
+        <w:rPr>
+          <w:rFonts w:ascii="Calibri" w:cs="Calibri" w:eastAsia="Calibri" w:hAnsi="Calibri"/>
+        </w:rPr>
+        <w:t xml:space="preserve">Record the consent signed with clinic staff</w:t>
+      </w:r>
+    </w:p>
+    <w:p>
+      <w:pPr>
+        <w:pStyle w:val="ListParagraph"/>
+        <w:numPr>
+          <w:ilvl w:val="0"/>
+          <w:numId w:val="9"/>
+        </w:numPr>
+        <w:spacing w:after="60"/>
+      </w:pPr>
+      <w:r>
+        <w:rPr>
+          <w:rFonts w:ascii="Calibri" w:cs="Calibri" w:eastAsia="Calibri" w:hAnsi="Calibri"/>
+        </w:rPr>
+        <w:t xml:space="preserve">The platform checks the recorded consent. Without wearable consent, sessions are manual only; without telehealth consent, telehealth sessions cannot start</w:t>
+      </w:r>
+    </w:p>
+    <w:p>
+      <w:pPr>
+        <w:pStyle w:val="ListParagraph"/>
+        <w:numPr>
+          <w:ilvl w:val="0"/>
+          <w:numId w:val="9"/>
+        </w:numPr>
+        <w:spacing w:after="60"/>
+      </w:pPr>
+      <w:r>
+        <w:rPr>
+          <w:rFonts w:ascii="Calibri" w:cs="Calibri" w:eastAsia="Calibri" w:hAnsi="Calibri"/>
+        </w:rPr>
+        <w:t xml:space="preserve">Assign the care team: therapist and supervisor</w:t>
+      </w:r>
+    </w:p>
+    <w:p>
+      <w:pPr>
+        <w:pStyle w:val="ListParagraph"/>
+        <w:numPr>
+          <w:ilvl w:val="0"/>
+          <w:numId w:val="9"/>
+        </w:numPr>
+        <w:spacing w:after="60"/>
+      </w:pPr>
+      <w:r>
+        <w:rPr>
+          <w:rFonts w:ascii="Calibri" w:cs="Calibri" w:eastAsia="Calibri" w:hAnsi="Calibri"/>
+        </w:rPr>
+        <w:t xml:space="preserve">Schedule sessions in-app or by CSV import</w:t>
+      </w:r>
+    </w:p>
+    <w:p>
+      <w:pPr>
+        <w:spacing w:after="120"/>
+      </w:pPr>
+      <w:r>
+        <w:rPr>
+          <w:rFonts w:ascii="Calibri" w:cs="Calibri" w:eastAsia="Calibri" w:hAnsi="Calibri"/>
+        </w:rPr>
+        <w:t xml:space="preserve">Deactivating a user frees their seat. Archiving a client hides them from active workflows. Withdrawing consent makes later sessions manual only and blocks telehealth.</w:t>
+      </w:r>
+    </w:p>
+    <w:p>
+      <w:pPr>
+        <w:pStyle w:val="Heading2"/>
+        <w:spacing w:after="80" w:before="240"/>
+      </w:pPr>
+      <w:r>
+        <w:rPr>
+          <w:rFonts w:ascii="Calibri" w:cs="Calibri" w:eastAsia="Calibri" w:hAnsi="Calibri"/>
+        </w:rPr>
+        <w:t xml:space="preserve">7.5 BEST Back Office</w:t>
+      </w:r>
+    </w:p>
+    <w:p>
+      <w:pPr>
+        <w:pStyle w:val="Heading3"/>
+        <w:spacing w:after="60" w:before="160"/>
+      </w:pPr>
+      <w:r>
+        <w:rPr>
+          <w:rFonts w:ascii="Calibri" w:cs="Calibri" w:eastAsia="Calibri" w:hAnsi="Calibri"/>
+        </w:rPr>
+        <w:t xml:space="preserve">License lifecycle</w:t>
+      </w:r>
+    </w:p>
+    <w:p>
+      <w:pPr>
+        <w:keepNext/>
+        <w:spacing w:after="80" w:before="160" w:line="240" w:lineRule="auto"/>
+        <w:jc w:val="center"/>
+      </w:pPr>
+      <w:r>
+        <w:drawing>
+          <wp:inline distT="0" distB="0" distL="0" distR="0">
+            <wp:extent cx="4762500" cy="3429000"/>
+            <wp:effectExtent t="0" r="0" b="0" l="0"/>
+            <wp:docPr id="1" name="" descr="" title=""/>
+            <wp:cNvGraphicFramePr>
+              <a:graphicFrameLocks xmlns:a="http://schemas.openxmlformats.org/drawingml/2006/main" noChangeAspect="1"/>
+            </wp:cNvGraphicFramePr>
+            <a:graphic xmlns:a="http://schemas.openxmlformats.org/drawingml/2006/main">
+              <a:graphicData uri="http://schemas.openxmlformats.org/drawingml/2006/picture">
+                <pic:pic xmlns:pic="http://schemas.openxmlformats.org/drawingml/2006/picture">
+                  <pic:nvPicPr>
+                    <pic:cNvPr id="0" name="" descr=""/>
+                    <pic:cNvPicPr>
+                      <a:picLocks noChangeAspect="1" noChangeArrowheads="1"/>
+                    </pic:cNvPicPr>
+                  </pic:nvPicPr>
+                  <pic:blipFill>
+                    <a:blip r:embed="rId15" cstate="none"/>
+                    <a:srcRect/>
+                    <a:stretch>
+                      <a:fillRect/>
+                    </a:stretch>
+                  </pic:blipFill>
+                  <pic:spPr bwMode="auto">
+                    <a:xfrm>
+                      <a:off x="0" y="0"/>
+                      <a:ext cx="4762500" cy="3429000"/>
+                    </a:xfrm>
+                    <a:prstGeom prst="rect">
+                      <a:avLst/>
+                    </a:prstGeom>
+                  </pic:spPr>
+                </pic:pic>
+              </a:graphicData>
+            </a:graphic>
+          </wp:inline>
+        </w:drawing>
+      </w:r>
+    </w:p>
+    <w:p>
+      <w:pPr>
+        <w:spacing w:after="200"/>
+        <w:jc w:val="center"/>
+      </w:pPr>
+      <w:r>
+        <w:rPr>
+          <w:rFonts w:ascii="Calibri" w:cs="Calibri" w:eastAsia="Calibri" w:hAnsi="Calibri"/>
+          <w:i/>
+          <w:iCs/>
+          <w:color w:val="595959"/>
+          <w:sz w:val="18"/>
+          <w:szCs w:val="18"/>
+        </w:rPr>
+        <w:t xml:space="preserve">Figure 8. BEST Platform Admin: license lifecycle</w:t>
+      </w:r>
+    </w:p>
+    <w:p>
+      <w:pPr>
+        <w:pStyle w:val="ListParagraph"/>
+        <w:numPr>
+          <w:ilvl w:val="0"/>
+          <w:numId w:val="10"/>
+        </w:numPr>
+        <w:spacing w:after="60"/>
+      </w:pPr>
+      <w:r>
+        <w:rPr>
+          <w:rFonts w:ascii="Calibri" w:cs="Calibri" w:eastAsia="Calibri" w:hAnsi="Calibri"/>
+        </w:rPr>
+        <w:t xml:space="preserve">Onboard the customer organization</w:t>
+      </w:r>
+    </w:p>
+    <w:p>
+      <w:pPr>
+        <w:pStyle w:val="ListParagraph"/>
+        <w:numPr>
+          <w:ilvl w:val="0"/>
+          <w:numId w:val="10"/>
+        </w:numPr>
+        <w:spacing w:after="60"/>
+      </w:pPr>
+      <w:r>
+        <w:rPr>
+          <w:rFonts w:ascii="Calibri" w:cs="Calibri" w:eastAsia="Calibri" w:hAnsi="Calibri"/>
+        </w:rPr>
+        <w:t xml:space="preserve">Create its license: plan, seats, dates, and enabled features</w:t>
+      </w:r>
+    </w:p>
+    <w:p>
+      <w:pPr>
+        <w:pStyle w:val="ListParagraph"/>
+        <w:numPr>
+          <w:ilvl w:val="0"/>
+          <w:numId w:val="10"/>
+        </w:numPr>
+        <w:spacing w:after="60"/>
+      </w:pPr>
+      <w:r>
+        <w:rPr>
+          <w:rFonts w:ascii="Calibri" w:cs="Calibri" w:eastAsia="Calibri" w:hAnsi="Calibri"/>
+        </w:rPr>
+        <w:t xml:space="preserve">While the license is active, Organization Admins can invite users; Platform Admin can edit seats or features, or suspend the license</w:t>
+      </w:r>
+    </w:p>
+    <w:p>
+      <w:pPr>
+        <w:pStyle w:val="ListParagraph"/>
+        <w:numPr>
+          <w:ilvl w:val="0"/>
+          <w:numId w:val="10"/>
+        </w:numPr>
+        <w:spacing w:after="60"/>
+      </w:pPr>
+      <w:r>
+        <w:rPr>
+          <w:rFonts w:ascii="Calibri" w:cs="Calibri" w:eastAsia="Calibri" w:hAnsi="Calibri"/>
+        </w:rPr>
+        <w:t xml:space="preserve">Organization Admins receive a warning before the license end date (configurable; default 30 days)</w:t>
+      </w:r>
+    </w:p>
+    <w:p>
+      <w:pPr>
+        <w:pStyle w:val="ListParagraph"/>
+        <w:numPr>
+          <w:ilvl w:val="0"/>
+          <w:numId w:val="10"/>
+        </w:numPr>
+        <w:spacing w:after="60"/>
+      </w:pPr>
+      <w:r>
+        <w:rPr>
+          <w:rFonts w:ascii="Calibri" w:cs="Calibri" w:eastAsia="Calibri" w:hAnsi="Calibri"/>
+        </w:rPr>
+        <w:t xml:space="preserve">When the end date is reached, the license expires: no new sessions can start, users can still log in and view records, and no data is deleted. A suspended license has the same effect</w:t>
+      </w:r>
+    </w:p>
+    <w:p>
+      <w:pPr>
+        <w:pStyle w:val="ListParagraph"/>
+        <w:numPr>
+          <w:ilvl w:val="0"/>
+          <w:numId w:val="10"/>
+        </w:numPr>
+        <w:spacing w:after="60"/>
+      </w:pPr>
+      <w:r>
+        <w:rPr>
+          <w:rFonts w:ascii="Calibri" w:cs="Calibri" w:eastAsia="Calibri" w:hAnsi="Calibri"/>
+        </w:rPr>
+        <w:t xml:space="preserve">Platform Admin extends the license to return it to active</w:t>
+      </w:r>
+    </w:p>
+    <w:p>
+      <w:pPr>
+        <w:pStyle w:val="Heading3"/>
+        <w:spacing w:after="60" w:before="160"/>
+      </w:pPr>
+      <w:r>
+        <w:rPr>
+          <w:rFonts w:ascii="Calibri" w:cs="Calibri" w:eastAsia="Calibri" w:hAnsi="Calibri"/>
+        </w:rPr>
+        <w:t xml:space="preserve">Time-bound support access to clinical data (break-glass)</w:t>
+      </w:r>
+    </w:p>
+    <w:p>
+      <w:pPr>
+        <w:keepNext/>
+        <w:spacing w:after="80" w:before="160" w:line="240" w:lineRule="auto"/>
+        <w:jc w:val="center"/>
+      </w:pPr>
+      <w:r>
+        <w:drawing>
+          <wp:inline distT="0" distB="0" distL="0" distR="0">
+            <wp:extent cx="4762500" cy="3924300"/>
+            <wp:effectExtent t="0" r="0" b="0" l="0"/>
+            <wp:docPr id="1" name="" descr="" title=""/>
+            <wp:cNvGraphicFramePr>
+              <a:graphicFrameLocks xmlns:a="http://schemas.openxmlformats.org/drawingml/2006/main" noChangeAspect="1"/>
+            </wp:cNvGraphicFramePr>
+            <a:graphic xmlns:a="http://schemas.openxmlformats.org/drawingml/2006/main">
+              <a:graphicData uri="http://schemas.openxmlformats.org/drawingml/2006/picture">
+                <pic:pic xmlns:pic="http://schemas.openxmlformats.org/drawingml/2006/picture">
+                  <pic:nvPicPr>
+                    <pic:cNvPr id="0" name="" descr=""/>
+                    <pic:cNvPicPr>
+                      <a:picLocks noChangeAspect="1" noChangeArrowheads="1"/>
+                    </pic:cNvPicPr>
+                  </pic:nvPicPr>
+                  <pic:blipFill>
+                    <a:blip r:embed="rId16" cstate="none"/>
+                    <a:srcRect/>
+                    <a:stretch>
+                      <a:fillRect/>
+                    </a:stretch>
+                  </pic:blipFill>
+                  <pic:spPr bwMode="auto">
+                    <a:xfrm>
+                      <a:off x="0" y="0"/>
                       <a:ext cx="4762500" cy="3924300"/>
                     </a:xfrm>
                     <a:prstGeom prst="rect">
@@ -2722,15 +3030,15 @@
           <w:sz w:val="18"/>
           <w:szCs w:val="18"/>
         </w:rPr>
-        <w:t xml:space="preserve">Figure 7. BEST Back Office: break-glass access</w:t>
-      </w:r>
-    </w:p>
-    <w:p>
-      <w:pPr>
-        <w:pStyle w:val="ListParagraph"/>
-        <w:numPr>
-          <w:ilvl w:val="0"/>
-          <w:numId w:val="9"/>
+        <w:t xml:space="preserve">Figure 9. BEST Back Office: break-glass access</w:t>
+      </w:r>
+    </w:p>
+    <w:p>
+      <w:pPr>
+        <w:pStyle w:val="ListParagraph"/>
+        <w:numPr>
+          <w:ilvl w:val="0"/>
+          <w:numId w:val="11"/>
         </w:numPr>
         <w:spacing w:after="60"/>
       </w:pPr>
@@ -2746,7 +3054,7 @@
         <w:pStyle w:val="ListParagraph"/>
         <w:numPr>
           <w:ilvl w:val="0"/>
-          <w:numId w:val="9"/>
+          <w:numId w:val="11"/>
         </w:numPr>
         <w:spacing w:after="60"/>
       </w:pPr>
@@ -2762,7 +3070,7 @@
         <w:pStyle w:val="ListParagraph"/>
         <w:numPr>
           <w:ilvl w:val="0"/>
-          <w:numId w:val="9"/>
+          <w:numId w:val="11"/>
         </w:numPr>
         <w:spacing w:after="60"/>
       </w:pPr>
@@ -2778,7 +3086,7 @@
         <w:pStyle w:val="ListParagraph"/>
         <w:numPr>
           <w:ilvl w:val="0"/>
-          <w:numId w:val="9"/>
+          <w:numId w:val="11"/>
         </w:numPr>
         <w:spacing w:after="60"/>
       </w:pPr>
@@ -2794,7 +3102,7 @@
         <w:pStyle w:val="ListParagraph"/>
         <w:numPr>
           <w:ilvl w:val="0"/>
-          <w:numId w:val="9"/>
+          <w:numId w:val="11"/>
         </w:numPr>
         <w:spacing w:after="60"/>
       </w:pPr>
@@ -2810,7 +3118,7 @@
         <w:pStyle w:val="ListParagraph"/>
         <w:numPr>
           <w:ilvl w:val="0"/>
-          <w:numId w:val="9"/>
+          <w:numId w:val="11"/>
         </w:numPr>
         <w:spacing w:after="60"/>
       </w:pPr>
@@ -12475,6 +12783,30 @@
       </w:pPr>
     </w:lvl>
   </w:abstractNum>
+  <w:abstractNum w:abstractNumId="10" w15:restartNumberingAfterBreak="0">
+    <w:multiLevelType w:val="hybridMultilevel"/>
+    <w:lvl w:ilvl="0" w15:tentative="1">
+      <w:start w:val="1"/>
+      <w:numFmt w:val="decimal"/>
+      <w:lvlText w:val="%1."/>
+      <w:lvlJc w:val="left"/>
+      <w:pPr>
+        <w:ind w:left="720" w:hanging="360"/>
+      </w:pPr>
+    </w:lvl>
+  </w:abstractNum>
+  <w:abstractNum w:abstractNumId="11" w15:restartNumberingAfterBreak="0">
+    <w:multiLevelType w:val="hybridMultilevel"/>
+    <w:lvl w:ilvl="0" w15:tentative="1">
+      <w:start w:val="1"/>
+      <w:numFmt w:val="decimal"/>
+      <w:lvlText w:val="%1."/>
+      <w:lvlJc w:val="left"/>
+      <w:pPr>
+        <w:ind w:left="720" w:hanging="360"/>
+      </w:pPr>
+    </w:lvl>
+  </w:abstractNum>
   <w:num w:numId="1">
     <w:abstractNumId w:val="1"/>
     <w:lvlOverride w:ilvl="0">
@@ -12525,6 +12857,18 @@
   </w:num>
   <w:num w:numId="9">
     <w:abstractNumId w:val="9"/>
+    <w:lvlOverride w:ilvl="0">
+      <w:startOverride w:val="1"/>
+    </w:lvlOverride>
+  </w:num>
+  <w:num w:numId="10">
+    <w:abstractNumId w:val="10"/>
+    <w:lvlOverride w:ilvl="0">
+      <w:startOverride w:val="1"/>
+    </w:lvlOverride>
+  </w:num>
+  <w:num w:numId="11">
+    <w:abstractNumId w:val="11"/>
     <w:lvlOverride w:ilvl="0">
       <w:startOverride w:val="1"/>
     </w:lvlOverride>

</xml_diff>

<commit_message>
Therapist flow revised from team feedback (D-017)
Consent by therapist, AI checklist, pause/resume, auto-recording,
transcript upload with checklist-only fallback, attachments, statuses.
PRD v3.0 §7.2, Figures 3-4 and diagrams PDF updated.

Co-Authored-By: Claude Opus 5.5 <noreply@anthropic.com>
Claude-Session: https://claude.ai/code/session_01AzN61zWTi2yq5SJaQMPbTS
</commit_message>
<xml_diff>
--- a/docs/BEST_PRD_v3.0.docx
+++ b/docs/BEST_PRD_v3.0.docx
@@ -1947,6 +1947,29 @@
         <w:rPr>
           <w:rFonts w:ascii="Calibri" w:cs="Calibri" w:eastAsia="Calibri" w:hAnsi="Calibri"/>
         </w:rPr>
+        <w:t xml:space="preserve">Dashboard</w:t>
+      </w:r>
+    </w:p>
+    <w:p>
+      <w:pPr>
+        <w:spacing w:after="120"/>
+      </w:pPr>
+      <w:r>
+        <w:rPr>
+          <w:rFonts w:ascii="Calibri" w:cs="Calibri" w:eastAsia="Calibri" w:hAnsi="Calibri"/>
+        </w:rPr>
+        <w:t xml:space="preserve">The therapist dashboard shows today’s sessions, sessions with an upload pending, summaries waiting to be confirmed, and notes or tasks from the supervisor.</w:t>
+      </w:r>
+    </w:p>
+    <w:p>
+      <w:pPr>
+        <w:pStyle w:val="Heading3"/>
+        <w:spacing w:after="60" w:before="160"/>
+      </w:pPr>
+      <w:r>
+        <w:rPr>
+          <w:rFonts w:ascii="Calibri" w:cs="Calibri" w:eastAsia="Calibri" w:hAnsi="Calibri"/>
+        </w:rPr>
         <w:t xml:space="preserve">Running a session</w:t>
       </w:r>
     </w:p>
@@ -1959,7 +1982,7 @@
       <w:r>
         <w:drawing>
           <wp:inline distT="0" distB="0" distL="0" distR="0">
-            <wp:extent cx="4762500" cy="4276725"/>
+            <wp:extent cx="4762500" cy="4057650"/>
             <wp:effectExtent t="0" r="0" b="0" l="0"/>
             <wp:docPr id="1" name="" descr="" title=""/>
             <wp:cNvGraphicFramePr>
@@ -1984,7 +2007,7 @@
                   <pic:spPr bwMode="auto">
                     <a:xfrm>
                       <a:off x="0" y="0"/>
-                      <a:ext cx="4762500" cy="4276725"/>
+                      <a:ext cx="4762500" cy="4057650"/>
                     </a:xfrm>
                     <a:prstGeom prst="rect">
                       <a:avLst/>
@@ -2027,7 +2050,7 @@
         <w:rPr>
           <w:rFonts w:ascii="Calibri" w:cs="Calibri" w:eastAsia="Calibri" w:hAnsi="Calibri"/>
         </w:rPr>
-        <w:t xml:space="preserve">Select a scheduled session from the dashboard</w:t>
+        <w:t xml:space="preserve">Select a scheduled session from the dashboard. A session can instead be marked as a no-show or cancelled, with a reason; nothing is sent to the AI service for it</w:t>
       </w:r>
     </w:p>
     <w:p>
@@ -2043,7 +2066,7 @@
         <w:rPr>
           <w:rFonts w:ascii="Calibri" w:cs="Calibri" w:eastAsia="Calibri" w:hAnsi="Calibri"/>
         </w:rPr>
-        <w:t xml:space="preserve">The platform checks consent automatically. Without wearable consent, an in-person session runs with manual notes only and no device data; a telehealth session cannot start without telehealth consent</w:t>
+        <w:t xml:space="preserve">Consent is mandatory. If the patient has no consent on file, the therapist records it once per patient, with the signed form uploaded. No session can start without consent. If consent is withdrawn, the therapist or Organization Admin records the date and no further sessions can start. Consent does not expire</w:t>
       </w:r>
     </w:p>
     <w:p>
@@ -2059,7 +2082,7 @@
         <w:rPr>
           <w:rFonts w:ascii="Calibri" w:cs="Calibri" w:eastAsia="Calibri" w:hAnsi="Calibri"/>
         </w:rPr>
-        <w:t xml:space="preserve">In person: the wearable is synced to the session. Telehealth: the video session starts; live soft alerts are not used in telehealth</w:t>
+        <w:t xml:space="preserve">The session checklist is loaded. For a patient with history, the checklist is received from the external AI service. For a new patient, or if the AI service does not respond, the default checklist for the client profile is taken from the platform library</w:t>
       </w:r>
     </w:p>
     <w:p>
@@ -2075,7 +2098,7 @@
         <w:rPr>
           <w:rFonts w:ascii="Calibri" w:cs="Calibri" w:eastAsia="Calibri" w:hAnsi="Calibri"/>
         </w:rPr>
-        <w:t xml:space="preserve">During the live session, indicators show trends and the age of their data</w:t>
+        <w:t xml:space="preserve">In person: the wearable is synced to the session. If the device is not connected, the therapist is warned and can continue</w:t>
       </w:r>
     </w:p>
     <w:p>
@@ -2091,7 +2114,7 @@
         <w:rPr>
           <w:rFonts w:ascii="Calibri" w:cs="Calibri" w:eastAsia="Calibri" w:hAnsi="Calibri"/>
         </w:rPr>
-        <w:t xml:space="preserve">Soft alerts (in person only) appear from the notification queue; the therapist acknowledges them</w:t>
+        <w:t xml:space="preserve">Online: the platform emails the parent a one-time guest link to join; no account is needed. The session is recorded automatically. Live soft alerts are not used in online sessions</w:t>
       </w:r>
     </w:p>
     <w:p>
@@ -2107,7 +2130,7 @@
         <w:rPr>
           <w:rFonts w:ascii="Calibri" w:cs="Calibri" w:eastAsia="Calibri" w:hAnsi="Calibri"/>
         </w:rPr>
-        <w:t xml:space="preserve">Notes and markers can be added at any time</w:t>
+        <w:t xml:space="preserve">During the live session, the therapist ticks checklist items as they are completed; each tick is time-stamped. Items cannot be added or removed. An optional reason can be given for items not completed</w:t>
       </w:r>
     </w:p>
     <w:p>
@@ -2123,7 +2146,71 @@
         <w:rPr>
           <w:rFonts w:ascii="Calibri" w:cs="Calibri" w:eastAsia="Calibri" w:hAnsi="Calibri"/>
         </w:rPr>
-        <w:t xml:space="preserve">The therapist ends the session, or it ends automatically when the scheduled window closes; unacknowledged alerts expire</w:t>
+        <w:t xml:space="preserve">Indicators show trends and the age of their data. If the device drops, the indicator shows no data, the gap is recorded, and the session continues</w:t>
+      </w:r>
+    </w:p>
+    <w:p>
+      <w:pPr>
+        <w:pStyle w:val="ListParagraph"/>
+        <w:numPr>
+          <w:ilvl w:val="0"/>
+          <w:numId w:val="5"/>
+        </w:numPr>
+        <w:spacing w:after="60"/>
+      </w:pPr>
+      <w:r>
+        <w:rPr>
+          <w:rFonts w:ascii="Calibri" w:cs="Calibri" w:eastAsia="Calibri" w:hAnsi="Calibri"/>
+        </w:rPr>
+        <w:t xml:space="preserve">Soft alerts (in person only) appear from the notification queue; the therapist acknowledges them. Notes and markers can be added at any time</w:t>
+      </w:r>
+    </w:p>
+    <w:p>
+      <w:pPr>
+        <w:pStyle w:val="ListParagraph"/>
+        <w:numPr>
+          <w:ilvl w:val="0"/>
+          <w:numId w:val="5"/>
+        </w:numPr>
+        <w:spacing w:after="60"/>
+      </w:pPr>
+      <w:r>
+        <w:rPr>
+          <w:rFonts w:ascii="Calibri" w:cs="Calibri" w:eastAsia="Calibri" w:hAnsi="Calibri"/>
+        </w:rPr>
+        <w:t xml:space="preserve">The therapist can pause and resume the session. While paused, device data, soft alerts and video are paused. In online sessions, the recording can also be paused and resumed on its own while the call continues</w:t>
+      </w:r>
+    </w:p>
+    <w:p>
+      <w:pPr>
+        <w:pStyle w:val="ListParagraph"/>
+        <w:numPr>
+          <w:ilvl w:val="0"/>
+          <w:numId w:val="5"/>
+        </w:numPr>
+        <w:spacing w:after="60"/>
+      </w:pPr>
+      <w:r>
+        <w:rPr>
+          <w:rFonts w:ascii="Calibri" w:cs="Calibri" w:eastAsia="Calibri" w:hAnsi="Calibri"/>
+        </w:rPr>
+        <w:t xml:space="preserve">If the browser is closed or the connection is lost, the session keeps running and resumes when reopened</w:t>
+      </w:r>
+    </w:p>
+    <w:p>
+      <w:pPr>
+        <w:pStyle w:val="ListParagraph"/>
+        <w:numPr>
+          <w:ilvl w:val="0"/>
+          <w:numId w:val="5"/>
+        </w:numPr>
+        <w:spacing w:after="60"/>
+      </w:pPr>
+      <w:r>
+        <w:rPr>
+          <w:rFonts w:ascii="Calibri" w:cs="Calibri" w:eastAsia="Calibri" w:hAnsi="Calibri"/>
+        </w:rPr>
+        <w:t xml:space="preserve">The session ends when the therapist ends it, when the scheduled window closes, or when the pause limit is reached (configurable by the BEST Platform Admin). Unacknowledged alerts expire</w:t>
       </w:r>
     </w:p>
     <w:p>
@@ -2147,7 +2234,7 @@
       <w:r>
         <w:drawing>
           <wp:inline distT="0" distB="0" distL="0" distR="0">
-            <wp:extent cx="4762500" cy="3924300"/>
+            <wp:extent cx="4762500" cy="4410075"/>
             <wp:effectExtent t="0" r="0" b="0" l="0"/>
             <wp:docPr id="1" name="" descr="" title=""/>
             <wp:cNvGraphicFramePr>
@@ -2172,7 +2259,7 @@
                   <pic:spPr bwMode="auto">
                     <a:xfrm>
                       <a:off x="0" y="0"/>
-                      <a:ext cx="4762500" cy="3924300"/>
+                      <a:ext cx="4762500" cy="4410075"/>
                     </a:xfrm>
                     <a:prstGeom prst="rect">
                       <a:avLst/>
@@ -2215,7 +2302,7 @@
         <w:rPr>
           <w:rFonts w:ascii="Calibri" w:cs="Calibri" w:eastAsia="Calibri" w:hAnsi="Calibri"/>
         </w:rPr>
-        <w:t xml:space="preserve">When the session ends, session data is sent to the external AI summary service and the screen shows that the summary is being generated</w:t>
+        <w:t xml:space="preserve">In person: the therapist uploads the session transcript produced by an external transcription tool (TXT, PDF or DOCX; formats configurable). The transcription tool itself is outside the platform</w:t>
       </w:r>
     </w:p>
     <w:p>
@@ -2231,6 +2318,70 @@
         <w:rPr>
           <w:rFonts w:ascii="Calibri" w:cs="Calibri" w:eastAsia="Calibri" w:hAnsi="Calibri"/>
         </w:rPr>
+        <w:t xml:space="preserve">If the transcript is not uploaded, the session shows Upload pending and a reminder is sent. If no transcript is uploaded within the configured time (default 24 hours), only the checklist is sent to the AI service and the summary is labeled as having no transcript</w:t>
+      </w:r>
+    </w:p>
+    <w:p>
+      <w:pPr>
+        <w:pStyle w:val="ListParagraph"/>
+        <w:numPr>
+          <w:ilvl w:val="0"/>
+          <w:numId w:val="6"/>
+        </w:numPr>
+        <w:spacing w:after="60"/>
+      </w:pPr>
+      <w:r>
+        <w:rPr>
+          <w:rFonts w:ascii="Calibri" w:cs="Calibri" w:eastAsia="Calibri" w:hAnsi="Calibri"/>
+        </w:rPr>
+        <w:t xml:space="preserve">Online: the session recording is saved automatically; no upload is needed</w:t>
+      </w:r>
+    </w:p>
+    <w:p>
+      <w:pPr>
+        <w:pStyle w:val="ListParagraph"/>
+        <w:numPr>
+          <w:ilvl w:val="0"/>
+          <w:numId w:val="6"/>
+        </w:numPr>
+        <w:spacing w:after="60"/>
+      </w:pPr>
+      <w:r>
+        <w:rPr>
+          <w:rFonts w:ascii="Calibri" w:cs="Calibri" w:eastAsia="Calibri" w:hAnsi="Calibri"/>
+        </w:rPr>
+        <w:t xml:space="preserve">The therapist can add optional attachments (PDF, TXT) after the session; attachments cannot be added during the session. File size limits are configurable</w:t>
+      </w:r>
+    </w:p>
+    <w:p>
+      <w:pPr>
+        <w:pStyle w:val="ListParagraph"/>
+        <w:numPr>
+          <w:ilvl w:val="0"/>
+          <w:numId w:val="6"/>
+        </w:numPr>
+        <w:spacing w:after="60"/>
+      </w:pPr>
+      <w:r>
+        <w:rPr>
+          <w:rFonts w:ascii="Calibri" w:cs="Calibri" w:eastAsia="Calibri" w:hAnsi="Calibri"/>
+        </w:rPr>
+        <w:t xml:space="preserve">Session data is sent to the external AI service: device data, the checklist, notes and markers, the transcript or recording, and attachments. The screen shows that the summary is being generated</w:t>
+      </w:r>
+    </w:p>
+    <w:p>
+      <w:pPr>
+        <w:pStyle w:val="ListParagraph"/>
+        <w:numPr>
+          <w:ilvl w:val="0"/>
+          <w:numId w:val="6"/>
+        </w:numPr>
+        <w:spacing w:after="60"/>
+      </w:pPr>
+      <w:r>
+        <w:rPr>
+          <w:rFonts w:ascii="Calibri" w:cs="Calibri" w:eastAsia="Calibri" w:hAnsi="Calibri"/>
+        </w:rPr>
         <w:t xml:space="preserve">If a draft is returned, it is shown labeled as AI-generated for the therapist to review</w:t>
       </w:r>
     </w:p>
@@ -2279,7 +2430,51 @@
         <w:rPr>
           <w:rFonts w:ascii="Calibri" w:cs="Calibri" w:eastAsia="Calibri" w:hAnsi="Calibri"/>
         </w:rPr>
-        <w:t xml:space="preserve">The confirmed summary is saved to the session record and becomes visible to the supervisor; unconfirmed drafts are never shown to supervisors</w:t>
+        <w:t xml:space="preserve">The confirmed summary is saved to the session record, locked, and becomes visible to the supervisor; unconfirmed drafts are never shown to supervisors. Later corrections are added as a dated addendum; the original is never overwritten</w:t>
+      </w:r>
+    </w:p>
+    <w:p>
+      <w:pPr>
+        <w:pStyle w:val="Heading3"/>
+        <w:spacing w:after="60" w:before="160"/>
+      </w:pPr>
+      <w:r>
+        <w:rPr>
+          <w:rFonts w:ascii="Calibri" w:cs="Calibri" w:eastAsia="Calibri" w:hAnsi="Calibri"/>
+        </w:rPr>
+        <w:t xml:space="preserve">Session statuses</w:t>
+      </w:r>
+    </w:p>
+    <w:p>
+      <w:pPr>
+        <w:pStyle w:val="ListParagraph"/>
+        <w:numPr>
+          <w:ilvl w:val="0"/>
+          <w:numId w:val="2"/>
+        </w:numPr>
+        <w:spacing w:after="60"/>
+      </w:pPr>
+      <w:r>
+        <w:rPr>
+          <w:rFonts w:ascii="Calibri" w:cs="Calibri" w:eastAsia="Calibri" w:hAnsi="Calibri"/>
+        </w:rPr>
+        <w:t xml:space="preserve">Scheduled, In progress, Paused, Ended, Upload pending, Summary generating, Draft ready, Generation failed, Confirmed</w:t>
+      </w:r>
+    </w:p>
+    <w:p>
+      <w:pPr>
+        <w:pStyle w:val="ListParagraph"/>
+        <w:numPr>
+          <w:ilvl w:val="0"/>
+          <w:numId w:val="2"/>
+        </w:numPr>
+        <w:spacing w:after="60"/>
+      </w:pPr>
+      <w:r>
+        <w:rPr>
+          <w:rFonts w:ascii="Calibri" w:cs="Calibri" w:eastAsia="Calibri" w:hAnsi="Calibri"/>
+        </w:rPr>
+        <w:t xml:space="preserve">No-show and Cancelled are set instead of running the session</w:t>
       </w:r>
     </w:p>
     <w:p>

</xml_diff>

<commit_message>
Clinic onboarding flow (D-018)
Sales-assisted or self-onboarding, Platform Admin approval, BAA mandatory,
Key Account Manager role. PRD v3.0 §7.5, §4, §16.2 and diagrams PDF updated;
standalone onboarding document added.

Co-Authored-By: Claude Opus 5.5 <noreply@anthropic.com>
Claude-Session: https://claude.ai/code/session_01AzN61zWTi2yq5SJaQMPbTS
</commit_message>
<xml_diff>
--- a/docs/BEST_PRD_v3.0.docx
+++ b/docs/BEST_PRD_v3.0.docx
@@ -1109,7 +1109,31 @@
         <w:rPr>
           <w:rFonts w:ascii="Calibri" w:cs="Calibri" w:eastAsia="Calibri" w:hAnsi="Calibri"/>
         </w:rPr>
-        <w:t xml:space="preserve"> – manage customer organizations, the licensing table, entitlements, and platform configuration</w:t>
+        <w:t xml:space="preserve"> – manage customer organizations, the licensing table, entitlements, and platform configuration; review clinic onboarding requests</w:t>
+      </w:r>
+    </w:p>
+    <w:p>
+      <w:pPr>
+        <w:pStyle w:val="ListParagraph"/>
+        <w:numPr>
+          <w:ilvl w:val="0"/>
+          <w:numId w:val="2"/>
+        </w:numPr>
+        <w:spacing w:after="60"/>
+      </w:pPr>
+      <w:r>
+        <w:rPr>
+          <w:rFonts w:ascii="Calibri" w:cs="Calibri" w:eastAsia="Calibri" w:hAnsi="Calibri"/>
+          <w:b/>
+          <w:bCs/>
+        </w:rPr>
+        <w:t xml:space="preserve">BEST Key Account Managers</w:t>
+      </w:r>
+      <w:r>
+        <w:rPr>
+          <w:rFonts w:ascii="Calibri" w:cs="Calibri" w:eastAsia="Calibri" w:hAnsi="Calibri"/>
+        </w:rPr>
+        <w:t xml:space="preserve"> – share onboarding links and submit onboarding requests on behalf of clinics</w:t>
       </w:r>
     </w:p>
     <w:p>
@@ -2989,7 +3013,7 @@
         <w:rPr>
           <w:rFonts w:ascii="Calibri" w:cs="Calibri" w:eastAsia="Calibri" w:hAnsi="Calibri"/>
         </w:rPr>
-        <w:t xml:space="preserve">License lifecycle</w:t>
+        <w:t xml:space="preserve">Clinic onboarding: request and approval</w:t>
       </w:r>
     </w:p>
     <w:p>
@@ -3001,7 +3025,7 @@
       <w:r>
         <w:drawing>
           <wp:inline distT="0" distB="0" distL="0" distR="0">
-            <wp:extent cx="4762500" cy="3429000"/>
+            <wp:extent cx="4762500" cy="3295650"/>
             <wp:effectExtent t="0" r="0" b="0" l="0"/>
             <wp:docPr id="1" name="" descr="" title=""/>
             <wp:cNvGraphicFramePr>
@@ -3026,7 +3050,7 @@
                   <pic:spPr bwMode="auto">
                     <a:xfrm>
                       <a:off x="0" y="0"/>
-                      <a:ext cx="4762500" cy="3429000"/>
+                      <a:ext cx="4762500" cy="3295650"/>
                     </a:xfrm>
                     <a:prstGeom prst="rect">
                       <a:avLst/>
@@ -3053,7 +3077,7 @@
           <w:sz w:val="18"/>
           <w:szCs w:val="18"/>
         </w:rPr>
-        <w:t xml:space="preserve">Figure 8. BEST Platform Admin: license lifecycle</w:t>
+        <w:t xml:space="preserve">Figure 8. Clinic onboarding: request and approval</w:t>
       </w:r>
     </w:p>
     <w:p>
@@ -3069,7 +3093,7 @@
         <w:rPr>
           <w:rFonts w:ascii="Calibri" w:cs="Calibri" w:eastAsia="Calibri" w:hAnsi="Calibri"/>
         </w:rPr>
-        <w:t xml:space="preserve">Onboard the customer organization</w:t>
+        <w:t xml:space="preserve">The BEST team shares an onboarding link with the clinic. Each link belongs to one clinic, is valid for 14 days, and can be re-sent by BEST</w:t>
       </w:r>
     </w:p>
     <w:p>
@@ -3085,7 +3109,7 @@
         <w:rPr>
           <w:rFonts w:ascii="Calibri" w:cs="Calibri" w:eastAsia="Calibri" w:hAnsi="Calibri"/>
         </w:rPr>
-        <w:t xml:space="preserve">Create its license: plan, seats, dates, and enabled features</w:t>
+        <w:t xml:space="preserve">The onboarding type is selected: Sales-assisted, where the BEST Key Account Manager fills the form on behalf of the clinic, or Self-onboarding, where the clinic fills the form itself</w:t>
       </w:r>
     </w:p>
     <w:p>
@@ -3101,7 +3125,7 @@
         <w:rPr>
           <w:rFonts w:ascii="Calibri" w:cs="Calibri" w:eastAsia="Calibri" w:hAnsi="Calibri"/>
         </w:rPr>
-        <w:t xml:space="preserve">While the license is active, Organization Admins can invite users; Platform Admin can edit seats or features, or suspend the license</w:t>
+        <w:t xml:space="preserve">The form can be saved as a draft and completed later</w:t>
       </w:r>
     </w:p>
     <w:p>
@@ -3117,7 +3141,7 @@
         <w:rPr>
           <w:rFonts w:ascii="Calibri" w:cs="Calibri" w:eastAsia="Calibri" w:hAnsi="Calibri"/>
         </w:rPr>
-        <w:t xml:space="preserve">Organization Admins receive a warning before the license end date (configurable; default 30 days)</w:t>
+        <w:t xml:space="preserve">Mandatory details: legal name, EIN, NPI, address, time zone, contact person, at least one location, and the chosen plan</w:t>
       </w:r>
     </w:p>
     <w:p>
@@ -3133,7 +3157,7 @@
         <w:rPr>
           <w:rFonts w:ascii="Calibri" w:cs="Calibri" w:eastAsia="Calibri" w:hAnsi="Calibri"/>
         </w:rPr>
-        <w:t xml:space="preserve">When the end date is reached, the license expires: no new sessions can start, users can still log in and view records, and no data is deleted. A suspended license has the same effect</w:t>
+        <w:t xml:space="preserve">Mandatory documents: signed Business Associate Agreement (BAA) and service agreement. Optional documents: W-9, state license, and proof of insurance</w:t>
       </w:r>
     </w:p>
     <w:p>
@@ -3149,7 +3173,55 @@
         <w:rPr>
           <w:rFonts w:ascii="Calibri" w:cs="Calibri" w:eastAsia="Calibri" w:hAnsi="Calibri"/>
         </w:rPr>
-        <w:t xml:space="preserve">Platform Admin extends the license to return it to active</w:t>
+        <w:t xml:space="preserve">A request is blocked if the EIN or NPI already belongs to an existing clinic</w:t>
+      </w:r>
+    </w:p>
+    <w:p>
+      <w:pPr>
+        <w:pStyle w:val="ListParagraph"/>
+        <w:numPr>
+          <w:ilvl w:val="0"/>
+          <w:numId w:val="10"/>
+        </w:numPr>
+        <w:spacing w:after="60"/>
+      </w:pPr>
+      <w:r>
+        <w:rPr>
+          <w:rFonts w:ascii="Calibri" w:cs="Calibri" w:eastAsia="Calibri" w:hAnsi="Calibri"/>
+        </w:rPr>
+        <w:t xml:space="preserve">The request is submitted for review by the BEST Platform Admin, who can approve it, reject it with a reason, or send it back for changes</w:t>
+      </w:r>
+    </w:p>
+    <w:p>
+      <w:pPr>
+        <w:pStyle w:val="ListParagraph"/>
+        <w:numPr>
+          <w:ilvl w:val="0"/>
+          <w:numId w:val="10"/>
+        </w:numPr>
+        <w:spacing w:after="60"/>
+      </w:pPr>
+      <w:r>
+        <w:rPr>
+          <w:rFonts w:ascii="Calibri" w:cs="Calibri" w:eastAsia="Calibri" w:hAnsi="Calibri"/>
+        </w:rPr>
+        <w:t xml:space="preserve">When sent back, the reviewer's comments are shown on the form; the request can be edited and resubmitted with no limit</w:t>
+      </w:r>
+    </w:p>
+    <w:p>
+      <w:pPr>
+        <w:pStyle w:val="ListParagraph"/>
+        <w:numPr>
+          <w:ilvl w:val="0"/>
+          <w:numId w:val="10"/>
+        </w:numPr>
+        <w:spacing w:after="60"/>
+      </w:pPr>
+      <w:r>
+        <w:rPr>
+          <w:rFonts w:ascii="Calibri" w:cs="Calibri" w:eastAsia="Calibri" w:hAnsi="Calibri"/>
+        </w:rPr>
+        <w:t xml:space="preserve">The applicant is emailed on each outcome</w:t>
       </w:r>
     </w:p>
     <w:p>
@@ -3161,7 +3233,7 @@
         <w:rPr>
           <w:rFonts w:ascii="Calibri" w:cs="Calibri" w:eastAsia="Calibri" w:hAnsi="Calibri"/>
         </w:rPr>
-        <w:t xml:space="preserve">Time-bound support access to clinical data (break-glass)</w:t>
+        <w:t xml:space="preserve">Clinic onboarding: setup and go-live</w:t>
       </w:r>
     </w:p>
     <w:p>
@@ -3173,7 +3245,7 @@
       <w:r>
         <w:drawing>
           <wp:inline distT="0" distB="0" distL="0" distR="0">
-            <wp:extent cx="4762500" cy="3924300"/>
+            <wp:extent cx="4762500" cy="3781425"/>
             <wp:effectExtent t="0" r="0" b="0" l="0"/>
             <wp:docPr id="1" name="" descr="" title=""/>
             <wp:cNvGraphicFramePr>
@@ -3198,6 +3270,394 @@
                   <pic:spPr bwMode="auto">
                     <a:xfrm>
                       <a:off x="0" y="0"/>
+                      <a:ext cx="4762500" cy="3781425"/>
+                    </a:xfrm>
+                    <a:prstGeom prst="rect">
+                      <a:avLst/>
+                    </a:prstGeom>
+                  </pic:spPr>
+                </pic:pic>
+              </a:graphicData>
+            </a:graphic>
+          </wp:inline>
+        </w:drawing>
+      </w:r>
+    </w:p>
+    <w:p>
+      <w:pPr>
+        <w:spacing w:after="200"/>
+        <w:jc w:val="center"/>
+      </w:pPr>
+      <w:r>
+        <w:rPr>
+          <w:rFonts w:ascii="Calibri" w:cs="Calibri" w:eastAsia="Calibri" w:hAnsi="Calibri"/>
+          <w:i/>
+          <w:iCs/>
+          <w:color w:val="595959"/>
+          <w:sz w:val="18"/>
+          <w:szCs w:val="18"/>
+        </w:rPr>
+        <w:t xml:space="preserve">Figure 9. Clinic onboarding: setup and go-live</w:t>
+      </w:r>
+    </w:p>
+    <w:p>
+      <w:pPr>
+        <w:pStyle w:val="ListParagraph"/>
+        <w:numPr>
+          <w:ilvl w:val="0"/>
+          <w:numId w:val="11"/>
+        </w:numPr>
+        <w:spacing w:after="60"/>
+      </w:pPr>
+      <w:r>
+        <w:rPr>
+          <w:rFonts w:ascii="Calibri" w:cs="Calibri" w:eastAsia="Calibri" w:hAnsi="Calibri"/>
+        </w:rPr>
+        <w:t xml:space="preserve">On approval, the organization (tenant) and its locations are created</w:t>
+      </w:r>
+    </w:p>
+    <w:p>
+      <w:pPr>
+        <w:pStyle w:val="ListParagraph"/>
+        <w:numPr>
+          <w:ilvl w:val="0"/>
+          <w:numId w:val="11"/>
+        </w:numPr>
+        <w:spacing w:after="60"/>
+      </w:pPr>
+      <w:r>
+        <w:rPr>
+          <w:rFonts w:ascii="Calibri" w:cs="Calibri" w:eastAsia="Calibri" w:hAnsi="Calibri"/>
+        </w:rPr>
+        <w:t xml:space="preserve">The license is created from the chosen plan; Platform Admin can adjust seats and dates</w:t>
+      </w:r>
+    </w:p>
+    <w:p>
+      <w:pPr>
+        <w:pStyle w:val="ListParagraph"/>
+        <w:numPr>
+          <w:ilvl w:val="0"/>
+          <w:numId w:val="11"/>
+        </w:numPr>
+        <w:spacing w:after="60"/>
+      </w:pPr>
+      <w:r>
+        <w:rPr>
+          <w:rFonts w:ascii="Calibri" w:cs="Calibri" w:eastAsia="Calibri" w:hAnsi="Calibri"/>
+        </w:rPr>
+        <w:t xml:space="preserve">BEST configures the clinic: telehealth on or off and the clinical parameter values. Wearable devices are supplied by BEST and registered to the clinic</w:t>
+      </w:r>
+    </w:p>
+    <w:p>
+      <w:pPr>
+        <w:pStyle w:val="ListParagraph"/>
+        <w:numPr>
+          <w:ilvl w:val="0"/>
+          <w:numId w:val="11"/>
+        </w:numPr>
+        <w:spacing w:after="60"/>
+      </w:pPr>
+      <w:r>
+        <w:rPr>
+          <w:rFonts w:ascii="Calibri" w:cs="Calibri" w:eastAsia="Calibri" w:hAnsi="Calibri"/>
+        </w:rPr>
+        <w:t xml:space="preserve">The contact person named on the form is invited as Organization Admin and uses one license seat. The invite expires after 7 days and can be re-sent by BEST</w:t>
+      </w:r>
+    </w:p>
+    <w:p>
+      <w:pPr>
+        <w:pStyle w:val="ListParagraph"/>
+        <w:numPr>
+          <w:ilvl w:val="0"/>
+          <w:numId w:val="11"/>
+        </w:numPr>
+        <w:spacing w:after="60"/>
+      </w:pPr>
+      <w:r>
+        <w:rPr>
+          <w:rFonts w:ascii="Calibri" w:cs="Calibri" w:eastAsia="Calibri" w:hAnsi="Calibri"/>
+        </w:rPr>
+        <w:t xml:space="preserve">The Organization Admin sets a password and MFA at first login, and the clinic becomes active. Until then the clinic stays Approved</w:t>
+      </w:r>
+    </w:p>
+    <w:p>
+      <w:pPr>
+        <w:pStyle w:val="ListParagraph"/>
+        <w:numPr>
+          <w:ilvl w:val="0"/>
+          <w:numId w:val="11"/>
+        </w:numPr>
+        <w:spacing w:after="60"/>
+      </w:pPr>
+      <w:r>
+        <w:rPr>
+          <w:rFonts w:ascii="Calibri" w:cs="Calibri" w:eastAsia="Calibri" w:hAnsi="Calibri"/>
+        </w:rPr>
+        <w:t xml:space="preserve">The Organization Admin uploads the clinic's consent form template and can import staff and clients by CSV (optional)</w:t>
+      </w:r>
+    </w:p>
+    <w:p>
+      <w:pPr>
+        <w:pStyle w:val="Heading3"/>
+        <w:spacing w:after="60" w:before="160"/>
+      </w:pPr>
+      <w:r>
+        <w:rPr>
+          <w:rFonts w:ascii="Calibri" w:cs="Calibri" w:eastAsia="Calibri" w:hAnsi="Calibri"/>
+        </w:rPr>
+        <w:t xml:space="preserve">Clinic statuses</w:t>
+      </w:r>
+    </w:p>
+    <w:p>
+      <w:pPr>
+        <w:pStyle w:val="ListParagraph"/>
+        <w:numPr>
+          <w:ilvl w:val="0"/>
+          <w:numId w:val="2"/>
+        </w:numPr>
+        <w:spacing w:after="60"/>
+      </w:pPr>
+      <w:r>
+        <w:rPr>
+          <w:rFonts w:ascii="Calibri" w:cs="Calibri" w:eastAsia="Calibri" w:hAnsi="Calibri"/>
+        </w:rPr>
+        <w:t xml:space="preserve">Draft, Submitted, Sent back, Rejected, Approved, Active</w:t>
+      </w:r>
+    </w:p>
+    <w:p>
+      <w:pPr>
+        <w:pStyle w:val="ListParagraph"/>
+        <w:numPr>
+          <w:ilvl w:val="0"/>
+          <w:numId w:val="2"/>
+        </w:numPr>
+        <w:spacing w:after="60"/>
+      </w:pPr>
+      <w:r>
+        <w:rPr>
+          <w:rFonts w:ascii="Calibri" w:cs="Calibri" w:eastAsia="Calibri" w:hAnsi="Calibri"/>
+        </w:rPr>
+        <w:t xml:space="preserve">Suspended and Expired follow the license (Figure 10)</w:t>
+      </w:r>
+    </w:p>
+    <w:p>
+      <w:pPr>
+        <w:pStyle w:val="Heading3"/>
+        <w:spacing w:after="60" w:before="160"/>
+      </w:pPr>
+      <w:r>
+        <w:rPr>
+          <w:rFonts w:ascii="Calibri" w:cs="Calibri" w:eastAsia="Calibri" w:hAnsi="Calibri"/>
+        </w:rPr>
+        <w:t xml:space="preserve">License lifecycle</w:t>
+      </w:r>
+    </w:p>
+    <w:p>
+      <w:pPr>
+        <w:keepNext/>
+        <w:spacing w:after="80" w:before="160" w:line="240" w:lineRule="auto"/>
+        <w:jc w:val="center"/>
+      </w:pPr>
+      <w:r>
+        <w:drawing>
+          <wp:inline distT="0" distB="0" distL="0" distR="0">
+            <wp:extent cx="4762500" cy="3429000"/>
+            <wp:effectExtent t="0" r="0" b="0" l="0"/>
+            <wp:docPr id="1" name="" descr="" title=""/>
+            <wp:cNvGraphicFramePr>
+              <a:graphicFrameLocks xmlns:a="http://schemas.openxmlformats.org/drawingml/2006/main" noChangeAspect="1"/>
+            </wp:cNvGraphicFramePr>
+            <a:graphic xmlns:a="http://schemas.openxmlformats.org/drawingml/2006/main">
+              <a:graphicData uri="http://schemas.openxmlformats.org/drawingml/2006/picture">
+                <pic:pic xmlns:pic="http://schemas.openxmlformats.org/drawingml/2006/picture">
+                  <pic:nvPicPr>
+                    <pic:cNvPr id="0" name="" descr=""/>
+                    <pic:cNvPicPr>
+                      <a:picLocks noChangeAspect="1" noChangeArrowheads="1"/>
+                    </pic:cNvPicPr>
+                  </pic:nvPicPr>
+                  <pic:blipFill>
+                    <a:blip r:embed="rId17" cstate="none"/>
+                    <a:srcRect/>
+                    <a:stretch>
+                      <a:fillRect/>
+                    </a:stretch>
+                  </pic:blipFill>
+                  <pic:spPr bwMode="auto">
+                    <a:xfrm>
+                      <a:off x="0" y="0"/>
+                      <a:ext cx="4762500" cy="3429000"/>
+                    </a:xfrm>
+                    <a:prstGeom prst="rect">
+                      <a:avLst/>
+                    </a:prstGeom>
+                  </pic:spPr>
+                </pic:pic>
+              </a:graphicData>
+            </a:graphic>
+          </wp:inline>
+        </w:drawing>
+      </w:r>
+    </w:p>
+    <w:p>
+      <w:pPr>
+        <w:spacing w:after="200"/>
+        <w:jc w:val="center"/>
+      </w:pPr>
+      <w:r>
+        <w:rPr>
+          <w:rFonts w:ascii="Calibri" w:cs="Calibri" w:eastAsia="Calibri" w:hAnsi="Calibri"/>
+          <w:i/>
+          <w:iCs/>
+          <w:color w:val="595959"/>
+          <w:sz w:val="18"/>
+          <w:szCs w:val="18"/>
+        </w:rPr>
+        <w:t xml:space="preserve">Figure 10. BEST Platform Admin: license lifecycle</w:t>
+      </w:r>
+    </w:p>
+    <w:p>
+      <w:pPr>
+        <w:pStyle w:val="ListParagraph"/>
+        <w:numPr>
+          <w:ilvl w:val="0"/>
+          <w:numId w:val="12"/>
+        </w:numPr>
+        <w:spacing w:after="60"/>
+      </w:pPr>
+      <w:r>
+        <w:rPr>
+          <w:rFonts w:ascii="Calibri" w:cs="Calibri" w:eastAsia="Calibri" w:hAnsi="Calibri"/>
+        </w:rPr>
+        <w:t xml:space="preserve">The customer organization is onboarded and approved (Figures 8 and 9)</w:t>
+      </w:r>
+    </w:p>
+    <w:p>
+      <w:pPr>
+        <w:pStyle w:val="ListParagraph"/>
+        <w:numPr>
+          <w:ilvl w:val="0"/>
+          <w:numId w:val="12"/>
+        </w:numPr>
+        <w:spacing w:after="60"/>
+      </w:pPr>
+      <w:r>
+        <w:rPr>
+          <w:rFonts w:ascii="Calibri" w:cs="Calibri" w:eastAsia="Calibri" w:hAnsi="Calibri"/>
+        </w:rPr>
+        <w:t xml:space="preserve">Its license is created from the chosen plan: plan, seats, dates, and enabled features. Platform Admin can adjust seats and dates</w:t>
+      </w:r>
+    </w:p>
+    <w:p>
+      <w:pPr>
+        <w:pStyle w:val="ListParagraph"/>
+        <w:numPr>
+          <w:ilvl w:val="0"/>
+          <w:numId w:val="12"/>
+        </w:numPr>
+        <w:spacing w:after="60"/>
+      </w:pPr>
+      <w:r>
+        <w:rPr>
+          <w:rFonts w:ascii="Calibri" w:cs="Calibri" w:eastAsia="Calibri" w:hAnsi="Calibri"/>
+        </w:rPr>
+        <w:t xml:space="preserve">While the license is active, Organization Admins can invite users; Platform Admin can edit seats or features, or suspend the license</w:t>
+      </w:r>
+    </w:p>
+    <w:p>
+      <w:pPr>
+        <w:pStyle w:val="ListParagraph"/>
+        <w:numPr>
+          <w:ilvl w:val="0"/>
+          <w:numId w:val="12"/>
+        </w:numPr>
+        <w:spacing w:after="60"/>
+      </w:pPr>
+      <w:r>
+        <w:rPr>
+          <w:rFonts w:ascii="Calibri" w:cs="Calibri" w:eastAsia="Calibri" w:hAnsi="Calibri"/>
+        </w:rPr>
+        <w:t xml:space="preserve">Organization Admins receive a warning before the license end date (configurable; default 30 days)</w:t>
+      </w:r>
+    </w:p>
+    <w:p>
+      <w:pPr>
+        <w:pStyle w:val="ListParagraph"/>
+        <w:numPr>
+          <w:ilvl w:val="0"/>
+          <w:numId w:val="12"/>
+        </w:numPr>
+        <w:spacing w:after="60"/>
+      </w:pPr>
+      <w:r>
+        <w:rPr>
+          <w:rFonts w:ascii="Calibri" w:cs="Calibri" w:eastAsia="Calibri" w:hAnsi="Calibri"/>
+        </w:rPr>
+        <w:t xml:space="preserve">When the end date is reached, the license expires: no new sessions can start, users can still log in and view records, and no data is deleted. A suspended license has the same effect</w:t>
+      </w:r>
+    </w:p>
+    <w:p>
+      <w:pPr>
+        <w:pStyle w:val="ListParagraph"/>
+        <w:numPr>
+          <w:ilvl w:val="0"/>
+          <w:numId w:val="12"/>
+        </w:numPr>
+        <w:spacing w:after="60"/>
+      </w:pPr>
+      <w:r>
+        <w:rPr>
+          <w:rFonts w:ascii="Calibri" w:cs="Calibri" w:eastAsia="Calibri" w:hAnsi="Calibri"/>
+        </w:rPr>
+        <w:t xml:space="preserve">Platform Admin extends the license to return it to active</w:t>
+      </w:r>
+    </w:p>
+    <w:p>
+      <w:pPr>
+        <w:pStyle w:val="Heading3"/>
+        <w:spacing w:after="60" w:before="160"/>
+      </w:pPr>
+      <w:r>
+        <w:rPr>
+          <w:rFonts w:ascii="Calibri" w:cs="Calibri" w:eastAsia="Calibri" w:hAnsi="Calibri"/>
+        </w:rPr>
+        <w:t xml:space="preserve">Time-bound support access to clinical data (break-glass)</w:t>
+      </w:r>
+    </w:p>
+    <w:p>
+      <w:pPr>
+        <w:keepNext/>
+        <w:spacing w:after="80" w:before="160" w:line="240" w:lineRule="auto"/>
+        <w:jc w:val="center"/>
+      </w:pPr>
+      <w:r>
+        <w:drawing>
+          <wp:inline distT="0" distB="0" distL="0" distR="0">
+            <wp:extent cx="4762500" cy="3924300"/>
+            <wp:effectExtent t="0" r="0" b="0" l="0"/>
+            <wp:docPr id="1" name="" descr="" title=""/>
+            <wp:cNvGraphicFramePr>
+              <a:graphicFrameLocks xmlns:a="http://schemas.openxmlformats.org/drawingml/2006/main" noChangeAspect="1"/>
+            </wp:cNvGraphicFramePr>
+            <a:graphic xmlns:a="http://schemas.openxmlformats.org/drawingml/2006/main">
+              <a:graphicData uri="http://schemas.openxmlformats.org/drawingml/2006/picture">
+                <pic:pic xmlns:pic="http://schemas.openxmlformats.org/drawingml/2006/picture">
+                  <pic:nvPicPr>
+                    <pic:cNvPr id="0" name="" descr=""/>
+                    <pic:cNvPicPr>
+                      <a:picLocks noChangeAspect="1" noChangeArrowheads="1"/>
+                    </pic:cNvPicPr>
+                  </pic:nvPicPr>
+                  <pic:blipFill>
+                    <a:blip r:embed="rId18" cstate="none"/>
+                    <a:srcRect/>
+                    <a:stretch>
+                      <a:fillRect/>
+                    </a:stretch>
+                  </pic:blipFill>
+                  <pic:spPr bwMode="auto">
+                    <a:xfrm>
+                      <a:off x="0" y="0"/>
                       <a:ext cx="4762500" cy="3924300"/>
                     </a:xfrm>
                     <a:prstGeom prst="rect">
@@ -3225,15 +3685,15 @@
           <w:sz w:val="18"/>
           <w:szCs w:val="18"/>
         </w:rPr>
-        <w:t xml:space="preserve">Figure 9. BEST Back Office: break-glass access</w:t>
-      </w:r>
-    </w:p>
-    <w:p>
-      <w:pPr>
-        <w:pStyle w:val="ListParagraph"/>
-        <w:numPr>
-          <w:ilvl w:val="0"/>
-          <w:numId w:val="11"/>
+        <w:t xml:space="preserve">Figure 11. BEST Back Office: break-glass access</w:t>
+      </w:r>
+    </w:p>
+    <w:p>
+      <w:pPr>
+        <w:pStyle w:val="ListParagraph"/>
+        <w:numPr>
+          <w:ilvl w:val="0"/>
+          <w:numId w:val="13"/>
         </w:numPr>
         <w:spacing w:after="60"/>
       </w:pPr>
@@ -3249,7 +3709,7 @@
         <w:pStyle w:val="ListParagraph"/>
         <w:numPr>
           <w:ilvl w:val="0"/>
-          <w:numId w:val="11"/>
+          <w:numId w:val="13"/>
         </w:numPr>
         <w:spacing w:after="60"/>
       </w:pPr>
@@ -3265,7 +3725,7 @@
         <w:pStyle w:val="ListParagraph"/>
         <w:numPr>
           <w:ilvl w:val="0"/>
-          <w:numId w:val="11"/>
+          <w:numId w:val="13"/>
         </w:numPr>
         <w:spacing w:after="60"/>
       </w:pPr>
@@ -3281,7 +3741,7 @@
         <w:pStyle w:val="ListParagraph"/>
         <w:numPr>
           <w:ilvl w:val="0"/>
-          <w:numId w:val="11"/>
+          <w:numId w:val="13"/>
         </w:numPr>
         <w:spacing w:after="60"/>
       </w:pPr>
@@ -3297,7 +3757,7 @@
         <w:pStyle w:val="ListParagraph"/>
         <w:numPr>
           <w:ilvl w:val="0"/>
-          <w:numId w:val="11"/>
+          <w:numId w:val="13"/>
         </w:numPr>
         <w:spacing w:after="60"/>
       </w:pPr>
@@ -3313,7 +3773,7 @@
         <w:pStyle w:val="ListParagraph"/>
         <w:numPr>
           <w:ilvl w:val="0"/>
-          <w:numId w:val="11"/>
+          <w:numId w:val="13"/>
         </w:numPr>
         <w:spacing w:after="60"/>
       </w:pPr>
@@ -9718,7 +10178,96 @@
               <w:rPr>
                 <w:rFonts w:ascii="Calibri" w:cs="Calibri" w:eastAsia="Calibri" w:hAnsi="Calibri"/>
               </w:rPr>
-              <w:t xml:space="preserve">Manage tenant lifecycle, the licensing table, entitlements, and feature configuration; co-approve break-glass requests where designated</w:t>
+              <w:t xml:space="preserve">Manage tenant lifecycle, the licensing table, entitlements, and feature configuration; approve, reject, or send back clinic onboarding requests; co-approve break-glass requests where designated</w:t>
+            </w:r>
+          </w:p>
+        </w:tc>
+      </w:tr>
+      <w:tr>
+        <w:trPr>
+          <w:cantSplit/>
+        </w:trPr>
+        <w:tc>
+          <w:tcPr>
+            <w:tcW w:type="dxa" w:w="2059"/>
+            <w:tcBorders>
+              <w:top w:val="single" w:color="BFBFBF" w:sz="4"/>
+              <w:left w:val="single" w:color="BFBFBF" w:sz="4"/>
+              <w:bottom w:val="single" w:color="BFBFBF" w:sz="4"/>
+              <w:right w:val="single" w:color="BFBFBF" w:sz="4"/>
+            </w:tcBorders>
+            <w:tcMar>
+              <w:top w:type="dxa" w:w="60"/>
+              <w:left w:type="dxa" w:w="100"/>
+              <w:bottom w:type="dxa" w:w="60"/>
+              <w:right w:type="dxa" w:w="100"/>
+            </w:tcMar>
+          </w:tcPr>
+          <w:p>
+            <w:pPr>
+              <w:spacing w:after="40"/>
+            </w:pPr>
+            <w:r>
+              <w:rPr>
+                <w:rFonts w:ascii="Calibri" w:cs="Calibri" w:eastAsia="Calibri" w:hAnsi="Calibri"/>
+              </w:rPr>
+              <w:t xml:space="preserve">BEST Key Account Manager</w:t>
+            </w:r>
+          </w:p>
+        </w:tc>
+        <w:tc>
+          <w:tcPr>
+            <w:tcW w:type="dxa" w:w="2434"/>
+            <w:tcBorders>
+              <w:top w:val="single" w:color="BFBFBF" w:sz="4"/>
+              <w:left w:val="single" w:color="BFBFBF" w:sz="4"/>
+              <w:bottom w:val="single" w:color="BFBFBF" w:sz="4"/>
+              <w:right w:val="single" w:color="BFBFBF" w:sz="4"/>
+            </w:tcBorders>
+            <w:tcMar>
+              <w:top w:type="dxa" w:w="60"/>
+              <w:left w:type="dxa" w:w="100"/>
+              <w:bottom w:type="dxa" w:w="60"/>
+              <w:right w:type="dxa" w:w="100"/>
+            </w:tcMar>
+          </w:tcPr>
+          <w:p>
+            <w:pPr>
+              <w:spacing w:after="40"/>
+            </w:pPr>
+            <w:r>
+              <w:rPr>
+                <w:rFonts w:ascii="Calibri" w:cs="Calibri" w:eastAsia="Calibri" w:hAnsi="Calibri"/>
+              </w:rPr>
+              <w:t xml:space="preserve">Onboarding requests for assigned clinics</w:t>
+            </w:r>
+          </w:p>
+        </w:tc>
+        <w:tc>
+          <w:tcPr>
+            <w:tcW w:type="dxa" w:w="4867"/>
+            <w:tcBorders>
+              <w:top w:val="single" w:color="BFBFBF" w:sz="4"/>
+              <w:left w:val="single" w:color="BFBFBF" w:sz="4"/>
+              <w:bottom w:val="single" w:color="BFBFBF" w:sz="4"/>
+              <w:right w:val="single" w:color="BFBFBF" w:sz="4"/>
+            </w:tcBorders>
+            <w:tcMar>
+              <w:top w:type="dxa" w:w="60"/>
+              <w:left w:type="dxa" w:w="100"/>
+              <w:bottom w:type="dxa" w:w="60"/>
+              <w:right w:type="dxa" w:w="100"/>
+            </w:tcMar>
+          </w:tcPr>
+          <w:p>
+            <w:pPr>
+              <w:spacing w:after="40"/>
+            </w:pPr>
+            <w:r>
+              <w:rPr>
+                <w:rFonts w:ascii="Calibri" w:cs="Calibri" w:eastAsia="Calibri" w:hAnsi="Calibri"/>
+              </w:rPr>
+              <w:t xml:space="preserve">Share onboarding links; create, save, and submit onboarding requests on behalf of a clinic; no clinical data access</w:t>
             </w:r>
           </w:p>
         </w:tc>
@@ -13002,6 +13551,30 @@
       </w:pPr>
     </w:lvl>
   </w:abstractNum>
+  <w:abstractNum w:abstractNumId="12" w15:restartNumberingAfterBreak="0">
+    <w:multiLevelType w:val="hybridMultilevel"/>
+    <w:lvl w:ilvl="0" w15:tentative="1">
+      <w:start w:val="1"/>
+      <w:numFmt w:val="decimal"/>
+      <w:lvlText w:val="%1."/>
+      <w:lvlJc w:val="left"/>
+      <w:pPr>
+        <w:ind w:left="720" w:hanging="360"/>
+      </w:pPr>
+    </w:lvl>
+  </w:abstractNum>
+  <w:abstractNum w:abstractNumId="13" w15:restartNumberingAfterBreak="0">
+    <w:multiLevelType w:val="hybridMultilevel"/>
+    <w:lvl w:ilvl="0" w15:tentative="1">
+      <w:start w:val="1"/>
+      <w:numFmt w:val="decimal"/>
+      <w:lvlText w:val="%1."/>
+      <w:lvlJc w:val="left"/>
+      <w:pPr>
+        <w:ind w:left="720" w:hanging="360"/>
+      </w:pPr>
+    </w:lvl>
+  </w:abstractNum>
   <w:num w:numId="1">
     <w:abstractNumId w:val="1"/>
     <w:lvlOverride w:ilvl="0">
@@ -13064,6 +13637,18 @@
   </w:num>
   <w:num w:numId="11">
     <w:abstractNumId w:val="11"/>
+    <w:lvlOverride w:ilvl="0">
+      <w:startOverride w:val="1"/>
+    </w:lvlOverride>
+  </w:num>
+  <w:num w:numId="12">
+    <w:abstractNumId w:val="12"/>
+    <w:lvlOverride w:ilvl="0">
+      <w:startOverride w:val="1"/>
+    </w:lvlOverride>
+  </w:num>
+  <w:num w:numId="13">
+    <w:abstractNumId w:val="13"/>
     <w:lvlOverride w:ilvl="0">
       <w:startOverride w:val="1"/>
     </w:lvlOverride>

</xml_diff>